<commit_message>
Updated Day3 / latest changes
</commit_message>
<xml_diff>
--- a/synopsis.docx
+++ b/synopsis.docx
@@ -19,7 +19,7 @@
     </w:p>
     <w:p>
       <w:pPr>
-        <w:spacing w:after="200"/>
+        <w:spacing w:after="160"/>
         <w:jc w:val="center"/>
       </w:pPr>
       <w:r>
@@ -34,16 +34,16 @@
     </w:p>
     <w:p>
       <w:pPr>
-        <w:spacing w:after="280"/>
+        <w:spacing w:after="240"/>
         <w:jc w:val="center"/>
       </w:pPr>
       <w:r>
         <w:rPr>
           <w:rFonts w:ascii="Aptos" w:hAnsi="Aptos"/>
-          <w:color w:val="646464"/>
+          <w:color w:val="5F5F5F"/>
           <w:sz w:val="19"/>
         </w:rPr>
-        <w:t>Wipro SDET Playwright Training | Generated from code in Day1 and Day2 folders</w:t>
+        <w:t>Updated with Day2 practice questions and browser login practice</w:t>
       </w:r>
     </w:p>
     <w:tbl>
@@ -61,7 +61,7 @@
         </w:tblBorders>
       </w:tblPr>
       <w:tblGrid>
-        <w:gridCol w:w="10080"/>
+        <w:gridCol w:w="10166"/>
       </w:tblGrid>
       <w:tr>
         <w:trPr>
@@ -69,13 +69,13 @@
         </w:trPr>
         <w:tc>
           <w:tcPr>
-            <w:tcW w:type="dxa" w:w="10080"/>
+            <w:tcW w:type="dxa" w:w="10166"/>
             <w:shd w:fill="EAF3FB"/>
             <w:vAlign w:val="center"/>
           </w:tcPr>
           <w:p>
             <w:pPr>
-              <w:spacing w:after="0" w:line="259" w:lineRule="auto"/>
+              <w:spacing w:after="0" w:line="254" w:lineRule="auto"/>
             </w:pPr>
             <w:r/>
             <w:r>
@@ -83,7 +83,7 @@
                 <w:rFonts w:ascii="Aptos" w:hAnsi="Aptos"/>
                 <w:b/>
                 <w:color w:val="1F4E79"/>
-                <w:sz w:val="21"/>
+                <w:sz w:val="20"/>
               </w:rPr>
               <w:t xml:space="preserve">Overall learning summary: </w:t>
             </w:r>
@@ -91,9 +91,9 @@
               <w:rPr>
                 <w:rFonts w:ascii="Aptos" w:hAnsi="Aptos"/>
                 <w:color w:val="222222"/>
-                <w:sz w:val="21"/>
+                <w:sz w:val="20"/>
               </w:rPr>
-              <w:t>Across these two days, I practiced JavaScript basics through small programs: variables, strings, operators, conditions, functions, arrays, type conversion, random numbers, and simple browser interaction with HTML input and button events.</w:t>
+              <w:t>I practiced JavaScript fundamentals, then extended them into array-based problem solving and browser interaction. The updated Day2 work includes template literals, arrow functions, filter/map/reduce, random numbers, type conversion, splice, HTML forms, CSS styling, DOM input reading, authentication logic, alerts, and page navigation.</w:t>
             </w:r>
           </w:p>
         </w:tc>
@@ -101,13 +101,8 @@
     </w:tbl>
     <w:p>
       <w:pPr>
-        <w:spacing w:after="40"/>
-      </w:pPr>
-    </w:p>
-    <w:p>
-      <w:pPr>
         <w:pStyle w:val="Heading1"/>
-        <w:spacing w:before="240" w:after="100"/>
+        <w:spacing w:before="240" w:after="80"/>
       </w:pPr>
       <w:r>
         <w:rPr>
@@ -116,7 +111,7 @@
           <w:color w:val="1F4E79"/>
           <w:sz w:val="32"/>
         </w:rPr>
-        <w:t>Topic Map</w:t>
+        <w:t>Updated Topic Map</w:t>
       </w:r>
     </w:p>
     <w:tbl>
@@ -135,10 +130,10 @@
         </w:tblBorders>
       </w:tblPr>
       <w:tblGrid>
-        <w:gridCol w:w="2520"/>
-        <w:gridCol w:w="2520"/>
-        <w:gridCol w:w="2520"/>
-        <w:gridCol w:w="2520"/>
+        <w:gridCol w:w="2541"/>
+        <w:gridCol w:w="2541"/>
+        <w:gridCol w:w="2541"/>
+        <w:gridCol w:w="2541"/>
       </w:tblGrid>
       <w:tr>
         <w:trPr>
@@ -146,13 +141,13 @@
         </w:trPr>
         <w:tc>
           <w:tcPr>
-            <w:tcW w:type="dxa" w:w="900"/>
+            <w:tcW w:type="dxa" w:w="1350"/>
             <w:shd w:fill="1F4E79"/>
             <w:vAlign w:val="center"/>
           </w:tcPr>
           <w:p>
             <w:pPr>
-              <w:spacing w:after="0" w:line="252" w:lineRule="auto"/>
+              <w:spacing w:after="0" w:line="250" w:lineRule="auto"/>
             </w:pPr>
             <w:r/>
             <w:r>
@@ -160,21 +155,21 @@
                 <w:rFonts w:ascii="Aptos" w:hAnsi="Aptos"/>
                 <w:b/>
                 <w:color w:val="FFFFFF"/>
-                <w:sz w:val="19"/>
+                <w:sz w:val="18"/>
               </w:rPr>
-              <w:t>Day</w:t>
+              <w:t>Day / Area</w:t>
             </w:r>
           </w:p>
         </w:tc>
         <w:tc>
           <w:tcPr>
-            <w:tcW w:type="dxa" w:w="1800"/>
+            <w:tcW w:type="dxa" w:w="2050"/>
             <w:shd w:fill="1F4E79"/>
             <w:vAlign w:val="center"/>
           </w:tcPr>
           <w:p>
             <w:pPr>
-              <w:spacing w:after="0" w:line="252" w:lineRule="auto"/>
+              <w:spacing w:after="0" w:line="250" w:lineRule="auto"/>
             </w:pPr>
             <w:r/>
             <w:r>
@@ -182,7 +177,7 @@
                 <w:rFonts w:ascii="Aptos" w:hAnsi="Aptos"/>
                 <w:b/>
                 <w:color w:val="FFFFFF"/>
-                <w:sz w:val="19"/>
+                <w:sz w:val="18"/>
               </w:rPr>
               <w:t>Files</w:t>
             </w:r>
@@ -190,13 +185,13 @@
         </w:tc>
         <w:tc>
           <w:tcPr>
-            <w:tcW w:type="dxa" w:w="2500"/>
+            <w:tcW w:type="dxa" w:w="3200"/>
             <w:shd w:fill="1F4E79"/>
             <w:vAlign w:val="center"/>
           </w:tcPr>
           <w:p>
             <w:pPr>
-              <w:spacing w:after="0" w:line="252" w:lineRule="auto"/>
+              <w:spacing w:after="0" w:line="250" w:lineRule="auto"/>
             </w:pPr>
             <w:r/>
             <w:r>
@@ -204,21 +199,21 @@
                 <w:rFonts w:ascii="Aptos" w:hAnsi="Aptos"/>
                 <w:b/>
                 <w:color w:val="FFFFFF"/>
-                <w:sz w:val="19"/>
+                <w:sz w:val="18"/>
               </w:rPr>
-              <w:t>Main concepts</w:t>
+              <w:t>Topics learned</w:t>
             </w:r>
           </w:p>
         </w:tc>
         <w:tc>
           <w:tcPr>
-            <w:tcW w:type="dxa" w:w="4200"/>
+            <w:tcW w:type="dxa" w:w="3000"/>
             <w:shd w:fill="1F4E79"/>
             <w:vAlign w:val="center"/>
           </w:tcPr>
           <w:p>
             <w:pPr>
-              <w:spacing w:after="0" w:line="252" w:lineRule="auto"/>
+              <w:spacing w:after="0" w:line="250" w:lineRule="auto"/>
             </w:pPr>
             <w:r/>
             <w:r>
@@ -226,9 +221,9 @@
                 <w:rFonts w:ascii="Aptos" w:hAnsi="Aptos"/>
                 <w:b/>
                 <w:color w:val="FFFFFF"/>
-                <w:sz w:val="19"/>
+                <w:sz w:val="18"/>
               </w:rPr>
-              <w:t>What I practiced</w:t>
+              <w:t>Practice outcome</w:t>
             </w:r>
           </w:p>
         </w:tc>
@@ -236,12 +231,12 @@
       <w:tr>
         <w:tc>
           <w:tcPr>
-            <w:tcW w:type="dxa" w:w="900"/>
+            <w:tcW w:type="dxa" w:w="1350"/>
             <w:vAlign w:val="center"/>
           </w:tcPr>
           <w:p>
             <w:pPr>
-              <w:spacing w:after="0" w:line="252" w:lineRule="auto"/>
+              <w:spacing w:after="0" w:line="250" w:lineRule="auto"/>
             </w:pPr>
             <w:r/>
             <w:r>
@@ -249,20 +244,20 @@
                 <w:rFonts w:ascii="Aptos" w:hAnsi="Aptos"/>
                 <w:b/>
                 <w:color w:val="222222"/>
-                <w:sz w:val="18"/>
+                <w:sz w:val="17"/>
               </w:rPr>
-              <w:t>Day 1</w:t>
+              <w:t>Day 1 basics</w:t>
             </w:r>
           </w:p>
         </w:tc>
         <w:tc>
           <w:tcPr>
-            <w:tcW w:type="dxa" w:w="1800"/>
+            <w:tcW w:type="dxa" w:w="2050"/>
             <w:vAlign w:val="center"/>
           </w:tcPr>
           <w:p>
             <w:pPr>
-              <w:spacing w:after="0" w:line="252" w:lineRule="auto"/>
+              <w:spacing w:after="0" w:line="250" w:lineRule="auto"/>
             </w:pPr>
             <w:r/>
             <w:r>
@@ -270,7 +265,7 @@
                 <w:rFonts w:ascii="Aptos" w:hAnsi="Aptos"/>
                 <w:b w:val="0"/>
                 <w:color w:val="222222"/>
-                <w:sz w:val="18"/>
+                <w:sz w:val="17"/>
               </w:rPr>
               <w:t>index.js</w:t>
               <w:br/>
@@ -286,12 +281,12 @@
         </w:tc>
         <w:tc>
           <w:tcPr>
-            <w:tcW w:type="dxa" w:w="2500"/>
+            <w:tcW w:type="dxa" w:w="3200"/>
             <w:vAlign w:val="center"/>
           </w:tcPr>
           <w:p>
             <w:pPr>
-              <w:spacing w:after="0" w:line="252" w:lineRule="auto"/>
+              <w:spacing w:after="0" w:line="250" w:lineRule="auto"/>
             </w:pPr>
             <w:r/>
             <w:r>
@@ -299,20 +294,20 @@
                 <w:rFonts w:ascii="Aptos" w:hAnsi="Aptos"/>
                 <w:b w:val="0"/>
                 <w:color w:val="222222"/>
-                <w:sz w:val="18"/>
+                <w:sz w:val="17"/>
               </w:rPr>
-              <w:t>Variables, strings, operators, conditions, type checks, value swapping, DOM input handling</w:t>
+              <w:t>Variables, strings, operators, conditions, type checking, value swapping, simple DOM input</w:t>
             </w:r>
           </w:p>
         </w:tc>
         <w:tc>
           <w:tcPr>
-            <w:tcW w:type="dxa" w:w="4200"/>
+            <w:tcW w:type="dxa" w:w="3000"/>
             <w:vAlign w:val="center"/>
           </w:tcPr>
           <w:p>
             <w:pPr>
-              <w:spacing w:after="0" w:line="252" w:lineRule="auto"/>
+              <w:spacing w:after="0" w:line="250" w:lineRule="auto"/>
             </w:pPr>
             <w:r/>
             <w:r>
@@ -320,9 +315,9 @@
                 <w:rFonts w:ascii="Aptos" w:hAnsi="Aptos"/>
                 <w:b w:val="0"/>
                 <w:color w:val="222222"/>
-                <w:sz w:val="18"/>
+                <w:sz w:val="17"/>
               </w:rPr>
-              <w:t>I learned how JavaScript stores values, performs calculations, compares values, controls program flow, checks data types, and interacts with a simple web page.</w:t>
+              <w:t>Built comfort with JavaScript syntax, console output, comparisons, branching, typeof checks, and reading an input box from HTML.</w:t>
             </w:r>
           </w:p>
         </w:tc>
@@ -330,13 +325,13 @@
       <w:tr>
         <w:tc>
           <w:tcPr>
-            <w:tcW w:type="dxa" w:w="900"/>
+            <w:tcW w:type="dxa" w:w="1350"/>
             <w:vAlign w:val="center"/>
             <w:shd w:fill="F8FAFD"/>
           </w:tcPr>
           <w:p>
             <w:pPr>
-              <w:spacing w:after="0" w:line="252" w:lineRule="auto"/>
+              <w:spacing w:after="0" w:line="250" w:lineRule="auto"/>
             </w:pPr>
             <w:r/>
             <w:r>
@@ -344,21 +339,21 @@
                 <w:rFonts w:ascii="Aptos" w:hAnsi="Aptos"/>
                 <w:b/>
                 <w:color w:val="222222"/>
-                <w:sz w:val="18"/>
+                <w:sz w:val="17"/>
               </w:rPr>
-              <w:t>Day 2</w:t>
+              <w:t>Day 2 core JS</w:t>
             </w:r>
           </w:p>
         </w:tc>
         <w:tc>
           <w:tcPr>
-            <w:tcW w:type="dxa" w:w="1800"/>
+            <w:tcW w:type="dxa" w:w="2050"/>
             <w:vAlign w:val="center"/>
             <w:shd w:fill="F8FAFD"/>
           </w:tcPr>
           <w:p>
             <w:pPr>
-              <w:spacing w:after="0" w:line="252" w:lineRule="auto"/>
+              <w:spacing w:after="0" w:line="250" w:lineRule="auto"/>
             </w:pPr>
             <w:r/>
             <w:r>
@@ -366,7 +361,7 @@
                 <w:rFonts w:ascii="Aptos" w:hAnsi="Aptos"/>
                 <w:b w:val="0"/>
                 <w:color w:val="222222"/>
-                <w:sz w:val="18"/>
+                <w:sz w:val="17"/>
               </w:rPr>
               <w:t>index.js</w:t>
             </w:r>
@@ -374,13 +369,13 @@
         </w:tc>
         <w:tc>
           <w:tcPr>
-            <w:tcW w:type="dxa" w:w="2500"/>
+            <w:tcW w:type="dxa" w:w="3200"/>
             <w:vAlign w:val="center"/>
             <w:shd w:fill="F8FAFD"/>
           </w:tcPr>
           <w:p>
             <w:pPr>
-              <w:spacing w:after="0" w:line="252" w:lineRule="auto"/>
+              <w:spacing w:after="0" w:line="250" w:lineRule="auto"/>
             </w:pPr>
             <w:r/>
             <w:r>
@@ -388,21 +383,21 @@
                 <w:rFonts w:ascii="Aptos" w:hAnsi="Aptos"/>
                 <w:b w:val="0"/>
                 <w:color w:val="222222"/>
-                <w:sz w:val="18"/>
+                <w:sz w:val="17"/>
               </w:rPr>
-              <w:t>Template literals, functions, arrow functions, array methods, random numbers, conversion, array operations</w:t>
+              <w:t>Template literals, functions, arrow functions, filter-map-forEach, Math.random, Math.floor, conversions, array methods</w:t>
             </w:r>
           </w:p>
         </w:tc>
         <w:tc>
           <w:tcPr>
-            <w:tcW w:type="dxa" w:w="4200"/>
+            <w:tcW w:type="dxa" w:w="3000"/>
             <w:vAlign w:val="center"/>
             <w:shd w:fill="F8FAFD"/>
           </w:tcPr>
           <w:p>
             <w:pPr>
-              <w:spacing w:after="0" w:line="252" w:lineRule="auto"/>
+              <w:spacing w:after="0" w:line="250" w:lineRule="auto"/>
             </w:pPr>
             <w:r/>
             <w:r>
@@ -410,9 +405,195 @@
                 <w:rFonts w:ascii="Aptos" w:hAnsi="Aptos"/>
                 <w:b w:val="0"/>
                 <w:color w:val="222222"/>
-                <w:sz w:val="18"/>
+                <w:sz w:val="17"/>
               </w:rPr>
-              <w:t>I practiced writing reusable functions, chaining filter-map-forEach, converting strings to numbers, generating random values, and adding/removing array elements.</w:t>
+              <w:t>Practiced reusable functions, array pipelines, random values, number/string conversion, and array add/remove/search operations.</w:t>
+            </w:r>
+          </w:p>
+        </w:tc>
+      </w:tr>
+      <w:tr>
+        <w:tc>
+          <w:tcPr>
+            <w:tcW w:type="dxa" w:w="1350"/>
+            <w:vAlign w:val="center"/>
+          </w:tcPr>
+          <w:p>
+            <w:pPr>
+              <w:spacing w:after="0" w:line="250" w:lineRule="auto"/>
+            </w:pPr>
+            <w:r/>
+            <w:r>
+              <w:rPr>
+                <w:rFonts w:ascii="Aptos" w:hAnsi="Aptos"/>
+                <w:b/>
+                <w:color w:val="222222"/>
+                <w:sz w:val="17"/>
+              </w:rPr>
+              <w:t>Day 2 questions</w:t>
+            </w:r>
+          </w:p>
+        </w:tc>
+        <w:tc>
+          <w:tcPr>
+            <w:tcW w:type="dxa" w:w="2050"/>
+            <w:vAlign w:val="center"/>
+          </w:tcPr>
+          <w:p>
+            <w:pPr>
+              <w:spacing w:after="0" w:line="250" w:lineRule="auto"/>
+            </w:pPr>
+            <w:r/>
+            <w:r>
+              <w:rPr>
+                <w:rFonts w:ascii="Aptos" w:hAnsi="Aptos"/>
+                <w:b w:val="0"/>
+                <w:color w:val="222222"/>
+                <w:sz w:val="17"/>
+              </w:rPr>
+              <w:t>q1.js</w:t>
+              <w:br/>
+              <w:t>q2.js</w:t>
+              <w:br/>
+              <w:t>q3.js</w:t>
+            </w:r>
+          </w:p>
+        </w:tc>
+        <w:tc>
+          <w:tcPr>
+            <w:tcW w:type="dxa" w:w="3200"/>
+            <w:vAlign w:val="center"/>
+          </w:tcPr>
+          <w:p>
+            <w:pPr>
+              <w:spacing w:after="0" w:line="250" w:lineRule="auto"/>
+            </w:pPr>
+            <w:r/>
+            <w:r>
+              <w:rPr>
+                <w:rFonts w:ascii="Aptos" w:hAnsi="Aptos"/>
+                <w:b w:val="0"/>
+                <w:color w:val="222222"/>
+                <w:sz w:val="17"/>
+              </w:rPr>
+              <w:t>slice, map, join, chained filter, random threshold, splice, Number, reduce, template literal output</w:t>
+            </w:r>
+          </w:p>
+        </w:tc>
+        <w:tc>
+          <w:tcPr>
+            <w:tcW w:type="dxa" w:w="3000"/>
+            <w:vAlign w:val="center"/>
+          </w:tcPr>
+          <w:p>
+            <w:pPr>
+              <w:spacing w:after="0" w:line="250" w:lineRule="auto"/>
+            </w:pPr>
+            <w:r/>
+            <w:r>
+              <w:rPr>
+                <w:rFonts w:ascii="Aptos" w:hAnsi="Aptos"/>
+                <w:b w:val="0"/>
+                <w:color w:val="222222"/>
+                <w:sz w:val="17"/>
+              </w:rPr>
+              <w:t>Solved small problems: guest formatting, high-number filtering, and total price calculation.</w:t>
+            </w:r>
+          </w:p>
+        </w:tc>
+      </w:tr>
+      <w:tr>
+        <w:tc>
+          <w:tcPr>
+            <w:tcW w:type="dxa" w:w="1350"/>
+            <w:vAlign w:val="center"/>
+            <w:shd w:fill="F8FAFD"/>
+          </w:tcPr>
+          <w:p>
+            <w:pPr>
+              <w:spacing w:after="0" w:line="250" w:lineRule="auto"/>
+            </w:pPr>
+            <w:r/>
+            <w:r>
+              <w:rPr>
+                <w:rFonts w:ascii="Aptos" w:hAnsi="Aptos"/>
+                <w:b/>
+                <w:color w:val="222222"/>
+                <w:sz w:val="17"/>
+              </w:rPr>
+              <w:t>Day 2 web practice</w:t>
+            </w:r>
+          </w:p>
+        </w:tc>
+        <w:tc>
+          <w:tcPr>
+            <w:tcW w:type="dxa" w:w="2050"/>
+            <w:vAlign w:val="center"/>
+            <w:shd w:fill="F8FAFD"/>
+          </w:tcPr>
+          <w:p>
+            <w:pPr>
+              <w:spacing w:after="0" w:line="250" w:lineRule="auto"/>
+            </w:pPr>
+            <w:r/>
+            <w:r>
+              <w:rPr>
+                <w:rFonts w:ascii="Aptos" w:hAnsi="Aptos"/>
+                <w:b w:val="0"/>
+                <w:color w:val="222222"/>
+                <w:sz w:val="17"/>
+              </w:rPr>
+              <w:t>login.html</w:t>
+              <w:br/>
+              <w:t>login.css</w:t>
+              <w:br/>
+              <w:t>login.js</w:t>
+              <w:br/>
+              <w:t>app.html</w:t>
+            </w:r>
+          </w:p>
+        </w:tc>
+        <w:tc>
+          <w:tcPr>
+            <w:tcW w:type="dxa" w:w="3200"/>
+            <w:vAlign w:val="center"/>
+            <w:shd w:fill="F8FAFD"/>
+          </w:tcPr>
+          <w:p>
+            <w:pPr>
+              <w:spacing w:after="0" w:line="250" w:lineRule="auto"/>
+            </w:pPr>
+            <w:r/>
+            <w:r>
+              <w:rPr>
+                <w:rFonts w:ascii="Aptos" w:hAnsi="Aptos"/>
+                <w:b w:val="0"/>
+                <w:color w:val="222222"/>
+                <w:sz w:val="17"/>
+              </w:rPr>
+              <w:t>HTML forms, external CSS/JS, DOM value reading, authentication condition, alerts, navigation links, window.location.href</w:t>
+            </w:r>
+          </w:p>
+        </w:tc>
+        <w:tc>
+          <w:tcPr>
+            <w:tcW w:type="dxa" w:w="3000"/>
+            <w:vAlign w:val="center"/>
+            <w:shd w:fill="F8FAFD"/>
+          </w:tcPr>
+          <w:p>
+            <w:pPr>
+              <w:spacing w:after="0" w:line="250" w:lineRule="auto"/>
+            </w:pPr>
+            <w:r/>
+            <w:r>
+              <w:rPr>
+                <w:rFonts w:ascii="Aptos" w:hAnsi="Aptos"/>
+                <w:b w:val="0"/>
+                <w:color w:val="222222"/>
+                <w:sz w:val="17"/>
+              </w:rPr>
+              <w:t>Created a basic login screen and connected HTML, CSS, and JavaScript for browser interaction.</w:t>
             </w:r>
           </w:p>
         </w:tc>
@@ -421,7 +602,7 @@
     <w:p>
       <w:pPr>
         <w:pStyle w:val="Heading1"/>
-        <w:spacing w:before="240" w:after="100"/>
+        <w:spacing w:before="240" w:after="80"/>
       </w:pPr>
       <w:r>
         <w:rPr>
@@ -441,29 +622,29 @@
         <w:rPr>
           <w:rFonts w:ascii="Aptos" w:hAnsi="Aptos"/>
           <w:color w:val="222222"/>
-          <w:sz w:val="21"/>
+          <w:sz w:val="20"/>
         </w:rPr>
-        <w:t>Day 1 focused on the foundation of JavaScript and a first connection between HTML and JavaScript. The code used short examples to show how values are stored, printed, compared, and changed.</w:t>
+        <w:t>Day 1 focused on the foundation of JavaScript and the first connection between HTML and JavaScript. The practice code showed how values are stored, printed, compared, checked, and changed.</w:t>
       </w:r>
     </w:p>
     <w:p>
       <w:pPr>
         <w:pStyle w:val="Heading2"/>
-        <w:spacing w:before="160" w:after="100"/>
+        <w:spacing w:before="140" w:after="80"/>
       </w:pPr>
       <w:r>
         <w:rPr>
           <w:rFonts w:ascii="Aptos" w:hAnsi="Aptos"/>
           <w:b/>
           <w:color w:val="1F4E79"/>
-          <w:sz w:val="26"/>
+          <w:sz w:val="25"/>
         </w:rPr>
-        <w:t>Key Learnings</w:t>
+        <w:t>Day 1 Topics Practiced</w:t>
       </w:r>
     </w:p>
     <w:p>
       <w:pPr>
-        <w:spacing w:after="52" w:line="254" w:lineRule="auto"/>
+        <w:spacing w:after="44" w:line="250" w:lineRule="auto"/>
         <w:ind w:left="317" w:hanging="230"/>
       </w:pPr>
       <w:r>
@@ -471,7 +652,7 @@
           <w:rFonts w:ascii="Aptos" w:hAnsi="Aptos"/>
           <w:b/>
           <w:color w:val="1F4E79"/>
-          <w:sz w:val="21"/>
+          <w:sz w:val="20"/>
         </w:rPr>
         <w:t xml:space="preserve">• </w:t>
       </w:r>
@@ -479,14 +660,14 @@
         <w:rPr>
           <w:rFonts w:ascii="Aptos" w:hAnsi="Aptos"/>
           <w:color w:val="222222"/>
-          <w:sz w:val="21"/>
+          <w:sz w:val="20"/>
         </w:rPr>
-        <w:t>Declared variables with let and stored numbers and strings such as a, b, and str.</w:t>
+        <w:t>Variables with let for storing numbers and strings.</w:t>
       </w:r>
     </w:p>
     <w:p>
       <w:pPr>
-        <w:spacing w:after="52" w:line="254" w:lineRule="auto"/>
+        <w:spacing w:after="44" w:line="250" w:lineRule="auto"/>
         <w:ind w:left="317" w:hanging="230"/>
       </w:pPr>
       <w:r>
@@ -494,7 +675,7 @@
           <w:rFonts w:ascii="Aptos" w:hAnsi="Aptos"/>
           <w:b/>
           <w:color w:val="1F4E79"/>
-          <w:sz w:val="21"/>
+          <w:sz w:val="20"/>
         </w:rPr>
         <w:t xml:space="preserve">• </w:t>
       </w:r>
@@ -502,14 +683,14 @@
         <w:rPr>
           <w:rFonts w:ascii="Aptos" w:hAnsi="Aptos"/>
           <w:color w:val="222222"/>
-          <w:sz w:val="21"/>
+          <w:sz w:val="20"/>
         </w:rPr>
-        <w:t>Used string properties and methods: length, toUpperCase(), toLowerCase(), and substring().</w:t>
+        <w:t>String methods and properties such as length, toUpperCase(), toLowerCase(), and substring().</w:t>
       </w:r>
     </w:p>
     <w:p>
       <w:pPr>
-        <w:spacing w:after="52" w:line="254" w:lineRule="auto"/>
+        <w:spacing w:after="44" w:line="250" w:lineRule="auto"/>
         <w:ind w:left="317" w:hanging="230"/>
       </w:pPr>
       <w:r>
@@ -517,7 +698,7 @@
           <w:rFonts w:ascii="Aptos" w:hAnsi="Aptos"/>
           <w:b/>
           <w:color w:val="1F4E79"/>
-          <w:sz w:val="21"/>
+          <w:sz w:val="20"/>
         </w:rPr>
         <w:t xml:space="preserve">• </w:t>
       </w:r>
@@ -525,14 +706,14 @@
         <w:rPr>
           <w:rFonts w:ascii="Aptos" w:hAnsi="Aptos"/>
           <w:color w:val="222222"/>
-          <w:sz w:val="21"/>
+          <w:sz w:val="20"/>
         </w:rPr>
-        <w:t>Practiced arithmetic operators: addition, subtraction, multiplication, division, and remainder.</w:t>
+        <w:t>Arithmetic operators: +, -, *, /, and %.</w:t>
       </w:r>
     </w:p>
     <w:p>
       <w:pPr>
-        <w:spacing w:after="52" w:line="254" w:lineRule="auto"/>
+        <w:spacing w:after="44" w:line="250" w:lineRule="auto"/>
         <w:ind w:left="317" w:hanging="230"/>
       </w:pPr>
       <w:r>
@@ -540,7 +721,7 @@
           <w:rFonts w:ascii="Aptos" w:hAnsi="Aptos"/>
           <w:b/>
           <w:color w:val="1F4E79"/>
-          <w:sz w:val="21"/>
+          <w:sz w:val="20"/>
         </w:rPr>
         <w:t xml:space="preserve">• </w:t>
       </w:r>
@@ -548,14 +729,14 @@
         <w:rPr>
           <w:rFonts w:ascii="Aptos" w:hAnsi="Aptos"/>
           <w:color w:val="222222"/>
-          <w:sz w:val="21"/>
+          <w:sz w:val="20"/>
         </w:rPr>
-        <w:t>Used comparison operators such as &gt;, &lt;, ==, !=, &gt;=, and &lt;= to produce true or false results.</w:t>
+        <w:t>Comparison operators: &gt;, &lt;, ==, !=, &gt;=, and &lt;=.</w:t>
       </w:r>
     </w:p>
     <w:p>
       <w:pPr>
-        <w:spacing w:after="52" w:line="254" w:lineRule="auto"/>
+        <w:spacing w:after="44" w:line="250" w:lineRule="auto"/>
         <w:ind w:left="317" w:hanging="230"/>
       </w:pPr>
       <w:r>
@@ -563,7 +744,7 @@
           <w:rFonts w:ascii="Aptos" w:hAnsi="Aptos"/>
           <w:b/>
           <w:color w:val="1F4E79"/>
-          <w:sz w:val="21"/>
+          <w:sz w:val="20"/>
         </w:rPr>
         <w:t xml:space="preserve">• </w:t>
       </w:r>
@@ -571,14 +752,14 @@
         <w:rPr>
           <w:rFonts w:ascii="Aptos" w:hAnsi="Aptos"/>
           <w:color w:val="222222"/>
-          <w:sz w:val="21"/>
+          <w:sz w:val="20"/>
         </w:rPr>
-        <w:t>Wrote if-else logic and switch-case logic to choose different output based on conditions.</w:t>
+        <w:t>Conditional flow using if-else and switch-case.</w:t>
       </w:r>
     </w:p>
     <w:p>
       <w:pPr>
-        <w:spacing w:after="52" w:line="254" w:lineRule="auto"/>
+        <w:spacing w:after="44" w:line="250" w:lineRule="auto"/>
         <w:ind w:left="317" w:hanging="230"/>
       </w:pPr>
       <w:r>
@@ -586,7 +767,7 @@
           <w:rFonts w:ascii="Aptos" w:hAnsi="Aptos"/>
           <w:b/>
           <w:color w:val="1F4E79"/>
-          <w:sz w:val="21"/>
+          <w:sz w:val="20"/>
         </w:rPr>
         <w:t xml:space="preserve">• </w:t>
       </w:r>
@@ -594,14 +775,14 @@
         <w:rPr>
           <w:rFonts w:ascii="Aptos" w:hAnsi="Aptos"/>
           <w:color w:val="222222"/>
-          <w:sz w:val="21"/>
+          <w:sz w:val="20"/>
         </w:rPr>
-        <w:t>Created a checkType() function using typeof to identify numbers, strings, and other values.</w:t>
+        <w:t>Type checking with typeof inside a checkType() function.</w:t>
       </w:r>
     </w:p>
     <w:p>
       <w:pPr>
-        <w:spacing w:after="52" w:line="254" w:lineRule="auto"/>
+        <w:spacing w:after="44" w:line="250" w:lineRule="auto"/>
         <w:ind w:left="317" w:hanging="230"/>
       </w:pPr>
       <w:r>
@@ -609,7 +790,7 @@
           <w:rFonts w:ascii="Aptos" w:hAnsi="Aptos"/>
           <w:b/>
           <w:color w:val="1F4E79"/>
-          <w:sz w:val="21"/>
+          <w:sz w:val="20"/>
         </w:rPr>
         <w:t xml:space="preserve">• </w:t>
       </w:r>
@@ -617,14 +798,14 @@
         <w:rPr>
           <w:rFonts w:ascii="Aptos" w:hAnsi="Aptos"/>
           <w:color w:val="222222"/>
-          <w:sz w:val="21"/>
+          <w:sz w:val="20"/>
         </w:rPr>
-        <w:t>Swapped two variable values with a temporary variable.</w:t>
+        <w:t>Swapping values using a temporary variable.</w:t>
       </w:r>
     </w:p>
     <w:p>
       <w:pPr>
-        <w:spacing w:after="52" w:line="254" w:lineRule="auto"/>
+        <w:spacing w:after="44" w:line="250" w:lineRule="auto"/>
         <w:ind w:left="317" w:hanging="230"/>
       </w:pPr>
       <w:r>
@@ -632,7 +813,7 @@
           <w:rFonts w:ascii="Aptos" w:hAnsi="Aptos"/>
           <w:b/>
           <w:color w:val="1F4E79"/>
-          <w:sz w:val="21"/>
+          <w:sz w:val="20"/>
         </w:rPr>
         <w:t xml:space="preserve">• </w:t>
       </w:r>
@@ -640,24 +821,9 @@
         <w:rPr>
           <w:rFonts w:ascii="Aptos" w:hAnsi="Aptos"/>
           <w:color w:val="222222"/>
-          <w:sz w:val="21"/>
+          <w:sz w:val="20"/>
         </w:rPr>
-        <w:t>Created a simple HTML page with an input box and a button, then used getElementById() to read and clear the input value.</w:t>
-      </w:r>
-    </w:p>
-    <w:p>
-      <w:pPr>
-        <w:pStyle w:val="Heading2"/>
-        <w:spacing w:before="160" w:after="100"/>
-      </w:pPr>
-      <w:r>
-        <w:rPr>
-          <w:rFonts w:ascii="Aptos" w:hAnsi="Aptos"/>
-          <w:b/>
-          <w:color w:val="1F4E79"/>
-          <w:sz w:val="26"/>
-        </w:rPr>
-        <w:t>Representative Code Ideas</w:t>
+        <w:t>Simple HTML input handling with getElementById(), reading .value, printing it, and clearing the input box.</w:t>
       </w:r>
     </w:p>
     <w:tbl>
@@ -675,7 +841,7 @@
         </w:tblBorders>
       </w:tblPr>
       <w:tblGrid>
-        <w:gridCol w:w="10080"/>
+        <w:gridCol w:w="10166"/>
       </w:tblGrid>
       <w:tr>
         <w:trPr>
@@ -683,7 +849,7 @@
         </w:trPr>
         <w:tc>
           <w:tcPr>
-            <w:tcW w:type="dxa" w:w="10080"/>
+            <w:tcW w:type="dxa" w:w="10166"/>
             <w:shd w:fill="F4F7FB"/>
           </w:tcPr>
           <w:p>
@@ -695,7 +861,7 @@
               <w:rPr>
                 <w:rFonts w:ascii="Consolas" w:hAnsi="Consolas"/>
                 <w:color w:val="2D2D2D"/>
-                <w:sz w:val="18"/>
+                <w:sz w:val="17"/>
               </w:rPr>
               <w:t>let temp = a;</w:t>
             </w:r>
@@ -708,7 +874,7 @@
               <w:rPr>
                 <w:rFonts w:ascii="Consolas" w:hAnsi="Consolas"/>
                 <w:color w:val="2D2D2D"/>
-                <w:sz w:val="18"/>
+                <w:sz w:val="17"/>
               </w:rPr>
               <w:t>a = b;</w:t>
             </w:r>
@@ -721,9 +887,9 @@
               <w:rPr>
                 <w:rFonts w:ascii="Consolas" w:hAnsi="Consolas"/>
                 <w:color w:val="2D2D2D"/>
-                <w:sz w:val="18"/>
+                <w:sz w:val="17"/>
               </w:rPr>
-              <w:t>b = temp;        // Swapping two values using a temporary variable</w:t>
+              <w:t>b = temp;</w:t>
             </w:r>
           </w:p>
           <w:p>
@@ -734,19 +900,7 @@
               <w:rPr>
                 <w:rFonts w:ascii="Consolas" w:hAnsi="Consolas"/>
                 <w:color w:val="2D2D2D"/>
-                <w:sz w:val="18"/>
-              </w:rPr>
-            </w:r>
-          </w:p>
-          <w:p>
-            <w:pPr>
-              <w:spacing w:after="0"/>
-            </w:pPr>
-            <w:r>
-              <w:rPr>
-                <w:rFonts w:ascii="Consolas" w:hAnsi="Consolas"/>
-                <w:color w:val="2D2D2D"/>
-                <w:sz w:val="18"/>
+                <w:sz w:val="17"/>
               </w:rPr>
               <w:t>if (typeof input === "number") { console.log("This is a number"); }</w:t>
             </w:r>
@@ -759,7 +913,7 @@
               <w:rPr>
                 <w:rFonts w:ascii="Consolas" w:hAnsi="Consolas"/>
                 <w:color w:val="2D2D2D"/>
-                <w:sz w:val="18"/>
+                <w:sz w:val="17"/>
               </w:rPr>
               <w:t>const nameinputbox = document.getElementById("namebox");</w:t>
             </w:r>
@@ -769,13 +923,13 @@
     </w:tbl>
     <w:p>
       <w:pPr>
-        <w:spacing w:after="40"/>
+        <w:spacing w:after="20"/>
       </w:pPr>
     </w:p>
     <w:p>
       <w:pPr>
         <w:pStyle w:val="Heading1"/>
-        <w:spacing w:before="240" w:after="100"/>
+        <w:spacing w:before="240" w:after="80"/>
       </w:pPr>
       <w:r>
         <w:rPr>
@@ -784,7 +938,7 @@
           <w:color w:val="1F4E79"/>
           <w:sz w:val="32"/>
         </w:rPr>
-        <w:t>Day 2 Synopsis</w:t>
+        <w:t>Day 2 Core JavaScript</w:t>
       </w:r>
     </w:p>
     <w:p>
@@ -795,29 +949,29 @@
         <w:rPr>
           <w:rFonts w:ascii="Aptos" w:hAnsi="Aptos"/>
           <w:color w:val="222222"/>
-          <w:sz w:val="21"/>
+          <w:sz w:val="20"/>
         </w:rPr>
-        <w:t>Day 2 expanded the basics into more expressive JavaScript. The code showed how to create formatted strings, write reusable functions, process arrays, use built-in Math methods, and convert data between types.</w:t>
+        <w:t>The original Day2 file expanded the basics into more expressive JavaScript. I practiced writing formatted strings, reusable functions, compact arrow functions, array method chains, random values, conversions, and array modification methods.</w:t>
       </w:r>
     </w:p>
     <w:p>
       <w:pPr>
         <w:pStyle w:val="Heading2"/>
-        <w:spacing w:before="160" w:after="100"/>
+        <w:spacing w:before="140" w:after="80"/>
       </w:pPr>
       <w:r>
         <w:rPr>
           <w:rFonts w:ascii="Aptos" w:hAnsi="Aptos"/>
           <w:b/>
           <w:color w:val="1F4E79"/>
-          <w:sz w:val="26"/>
+          <w:sz w:val="25"/>
         </w:rPr>
-        <w:t>Key Learnings</w:t>
+        <w:t>Core Day 2 Topics Practiced</w:t>
       </w:r>
     </w:p>
     <w:p>
       <w:pPr>
-        <w:spacing w:after="52" w:line="254" w:lineRule="auto"/>
+        <w:spacing w:after="44" w:line="250" w:lineRule="auto"/>
         <w:ind w:left="317" w:hanging="230"/>
       </w:pPr>
       <w:r>
@@ -825,7 +979,7 @@
           <w:rFonts w:ascii="Aptos" w:hAnsi="Aptos"/>
           <w:b/>
           <w:color w:val="1F4E79"/>
-          <w:sz w:val="21"/>
+          <w:sz w:val="20"/>
         </w:rPr>
         <w:t xml:space="preserve">• </w:t>
       </w:r>
@@ -833,14 +987,14 @@
         <w:rPr>
           <w:rFonts w:ascii="Aptos" w:hAnsi="Aptos"/>
           <w:color w:val="222222"/>
-          <w:sz w:val="21"/>
+          <w:sz w:val="20"/>
         </w:rPr>
-        <w:t>Used string concatenation and template literals to create readable messages with variable values.</w:t>
+        <w:t>String concatenation and template literals using backticks and ${} placeholders.</w:t>
       </w:r>
     </w:p>
     <w:p>
       <w:pPr>
-        <w:spacing w:after="52" w:line="254" w:lineRule="auto"/>
+        <w:spacing w:after="44" w:line="250" w:lineRule="auto"/>
         <w:ind w:left="317" w:hanging="230"/>
       </w:pPr>
       <w:r>
@@ -848,7 +1002,7 @@
           <w:rFonts w:ascii="Aptos" w:hAnsi="Aptos"/>
           <w:b/>
           <w:color w:val="1F4E79"/>
-          <w:sz w:val="21"/>
+          <w:sz w:val="20"/>
         </w:rPr>
         <w:t xml:space="preserve">• </w:t>
       </w:r>
@@ -856,14 +1010,14 @@
         <w:rPr>
           <w:rFonts w:ascii="Aptos" w:hAnsi="Aptos"/>
           <w:color w:val="222222"/>
-          <w:sz w:val="21"/>
+          <w:sz w:val="20"/>
         </w:rPr>
-        <w:t>Built a table(num) function that returns a multiplication table from 1 to 10.</w:t>
+        <w:t>A multiplication table function that builds and returns multi-line text.</w:t>
       </w:r>
     </w:p>
     <w:p>
       <w:pPr>
-        <w:spacing w:after="52" w:line="254" w:lineRule="auto"/>
+        <w:spacing w:after="44" w:line="250" w:lineRule="auto"/>
         <w:ind w:left="317" w:hanging="230"/>
       </w:pPr>
       <w:r>
@@ -871,7 +1025,7 @@
           <w:rFonts w:ascii="Aptos" w:hAnsi="Aptos"/>
           <w:b/>
           <w:color w:val="1F4E79"/>
-          <w:sz w:val="21"/>
+          <w:sz w:val="20"/>
         </w:rPr>
         <w:t xml:space="preserve">• </w:t>
       </w:r>
@@ -879,14 +1033,14 @@
         <w:rPr>
           <w:rFonts w:ascii="Aptos" w:hAnsi="Aptos"/>
           <w:color w:val="222222"/>
-          <w:sz w:val="21"/>
+          <w:sz w:val="20"/>
         </w:rPr>
-        <w:t>Used an arrow function, let sum = (x, y) =&gt; x + y, to write a compact addition function.</w:t>
+        <w:t>Arrow functions such as (x, y) =&gt; x + y.</w:t>
       </w:r>
     </w:p>
     <w:p>
       <w:pPr>
-        <w:spacing w:after="52" w:line="254" w:lineRule="auto"/>
+        <w:spacing w:after="44" w:line="250" w:lineRule="auto"/>
         <w:ind w:left="317" w:hanging="230"/>
       </w:pPr>
       <w:r>
@@ -894,7 +1048,7 @@
           <w:rFonts w:ascii="Aptos" w:hAnsi="Aptos"/>
           <w:b/>
           <w:color w:val="1F4E79"/>
-          <w:sz w:val="21"/>
+          <w:sz w:val="20"/>
         </w:rPr>
         <w:t xml:space="preserve">• </w:t>
       </w:r>
@@ -902,14 +1056,14 @@
         <w:rPr>
           <w:rFonts w:ascii="Aptos" w:hAnsi="Aptos"/>
           <w:color w:val="222222"/>
-          <w:sz w:val="21"/>
+          <w:sz w:val="20"/>
         </w:rPr>
-        <w:t>Practiced array processing with filter(), map(), and forEach() to keep numbers, double them, and print results.</w:t>
+        <w:t>Array pipelines with filter(), map(), and forEach().</w:t>
       </w:r>
     </w:p>
     <w:p>
       <w:pPr>
-        <w:spacing w:after="52" w:line="254" w:lineRule="auto"/>
+        <w:spacing w:after="44" w:line="250" w:lineRule="auto"/>
         <w:ind w:left="317" w:hanging="230"/>
       </w:pPr>
       <w:r>
@@ -917,7 +1071,7 @@
           <w:rFonts w:ascii="Aptos" w:hAnsi="Aptos"/>
           <w:b/>
           <w:color w:val="1F4E79"/>
-          <w:sz w:val="21"/>
+          <w:sz w:val="20"/>
         </w:rPr>
         <w:t xml:space="preserve">• </w:t>
       </w:r>
@@ -925,14 +1079,14 @@
         <w:rPr>
           <w:rFonts w:ascii="Aptos" w:hAnsi="Aptos"/>
           <w:color w:val="222222"/>
-          <w:sz w:val="21"/>
+          <w:sz w:val="20"/>
         </w:rPr>
-        <w:t>Generated a random number from 1 to 100 using Math.random() and Math.floor().</w:t>
+        <w:t>Random number generation using Math.random() and Math.floor().</w:t>
       </w:r>
     </w:p>
     <w:p>
       <w:pPr>
-        <w:spacing w:after="52" w:line="254" w:lineRule="auto"/>
+        <w:spacing w:after="44" w:line="250" w:lineRule="auto"/>
         <w:ind w:left="317" w:hanging="230"/>
       </w:pPr>
       <w:r>
@@ -940,7 +1094,7 @@
           <w:rFonts w:ascii="Aptos" w:hAnsi="Aptos"/>
           <w:b/>
           <w:color w:val="1F4E79"/>
-          <w:sz w:val="21"/>
+          <w:sz w:val="20"/>
         </w:rPr>
         <w:t xml:space="preserve">• </w:t>
       </w:r>
@@ -948,14 +1102,14 @@
         <w:rPr>
           <w:rFonts w:ascii="Aptos" w:hAnsi="Aptos"/>
           <w:color w:val="222222"/>
-          <w:sz w:val="21"/>
+          <w:sz w:val="20"/>
         </w:rPr>
-        <w:t>Compared conversion helpers: Number(), String(), parseInt(), and parseFloat().</w:t>
+        <w:t>Strict equality practice with == and === examples.</w:t>
       </w:r>
     </w:p>
     <w:p>
       <w:pPr>
-        <w:spacing w:after="52" w:line="254" w:lineRule="auto"/>
+        <w:spacing w:after="44" w:line="250" w:lineRule="auto"/>
         <w:ind w:left="317" w:hanging="230"/>
       </w:pPr>
       <w:r>
@@ -963,7 +1117,7 @@
           <w:rFonts w:ascii="Aptos" w:hAnsi="Aptos"/>
           <w:b/>
           <w:color w:val="1F4E79"/>
-          <w:sz w:val="21"/>
+          <w:sz w:val="20"/>
         </w:rPr>
         <w:t xml:space="preserve">• </w:t>
       </w:r>
@@ -971,14 +1125,14 @@
         <w:rPr>
           <w:rFonts w:ascii="Aptos" w:hAnsi="Aptos"/>
           <w:color w:val="222222"/>
-          <w:sz w:val="21"/>
+          <w:sz w:val="20"/>
         </w:rPr>
-        <w:t>Explored array lookup and properties with indexOf(), includes(), length, direct indexing, and last-element access.</w:t>
+        <w:t>Type conversion using Number(), String(), parseInt(), and parseFloat().</w:t>
       </w:r>
     </w:p>
     <w:p>
       <w:pPr>
-        <w:spacing w:after="52" w:line="254" w:lineRule="auto"/>
+        <w:spacing w:after="44" w:line="250" w:lineRule="auto"/>
         <w:ind w:left="317" w:hanging="230"/>
       </w:pPr>
       <w:r>
@@ -986,7 +1140,7 @@
           <w:rFonts w:ascii="Aptos" w:hAnsi="Aptos"/>
           <w:b/>
           <w:color w:val="1F4E79"/>
-          <w:sz w:val="21"/>
+          <w:sz w:val="20"/>
         </w:rPr>
         <w:t xml:space="preserve">• </w:t>
       </w:r>
@@ -994,24 +1148,32 @@
         <w:rPr>
           <w:rFonts w:ascii="Aptos" w:hAnsi="Aptos"/>
           <w:color w:val="222222"/>
-          <w:sz w:val="21"/>
+          <w:sz w:val="20"/>
         </w:rPr>
-        <w:t>Practiced array modification using push(), pop(), unshift(), shift(), and splice().</w:t>
+        <w:t>Array searching and reading with indexOf(), includes(), length, direct index access, and last-element access.</w:t>
       </w:r>
     </w:p>
     <w:p>
       <w:pPr>
-        <w:pStyle w:val="Heading2"/>
-        <w:spacing w:before="160" w:after="100"/>
+        <w:spacing w:after="44" w:line="250" w:lineRule="auto"/>
+        <w:ind w:left="317" w:hanging="230"/>
       </w:pPr>
       <w:r>
         <w:rPr>
           <w:rFonts w:ascii="Aptos" w:hAnsi="Aptos"/>
           <w:b/>
           <w:color w:val="1F4E79"/>
-          <w:sz w:val="26"/>
+          <w:sz w:val="20"/>
         </w:rPr>
-        <w:t>Representative Code Ideas</w:t>
+        <w:t xml:space="preserve">• </w:t>
+      </w:r>
+      <w:r>
+        <w:rPr>
+          <w:rFonts w:ascii="Aptos" w:hAnsi="Aptos"/>
+          <w:color w:val="222222"/>
+          <w:sz w:val="20"/>
+        </w:rPr>
+        <w:t>Array mutation using push(), pop(), unshift(), shift(), and splice().</w:t>
       </w:r>
     </w:p>
     <w:tbl>
@@ -1029,7 +1191,7 @@
         </w:tblBorders>
       </w:tblPr>
       <w:tblGrid>
-        <w:gridCol w:w="10080"/>
+        <w:gridCol w:w="10166"/>
       </w:tblGrid>
       <w:tr>
         <w:trPr>
@@ -1037,7 +1199,7 @@
         </w:trPr>
         <w:tc>
           <w:tcPr>
-            <w:tcW w:type="dxa" w:w="10080"/>
+            <w:tcW w:type="dxa" w:w="10166"/>
             <w:shd w:fill="F4F7FB"/>
           </w:tcPr>
           <w:p>
@@ -1049,33 +1211,7 @@
               <w:rPr>
                 <w:rFonts w:ascii="Consolas" w:hAnsi="Consolas"/>
                 <w:color w:val="2D2D2D"/>
-                <w:sz w:val="18"/>
-              </w:rPr>
-              <w:t>let e = `Hello ${a}, ${b} and ${c}!`;</w:t>
-            </w:r>
-          </w:p>
-          <w:p>
-            <w:pPr>
-              <w:spacing w:after="0"/>
-            </w:pPr>
-            <w:r>
-              <w:rPr>
-                <w:rFonts w:ascii="Consolas" w:hAnsi="Consolas"/>
-                <w:color w:val="2D2D2D"/>
-                <w:sz w:val="18"/>
-              </w:rPr>
-              <w:t>let sum = (x, y) =&gt; x + y;</w:t>
-            </w:r>
-          </w:p>
-          <w:p>
-            <w:pPr>
-              <w:spacing w:after="0"/>
-            </w:pPr>
-            <w:r>
-              <w:rPr>
-                <w:rFonts w:ascii="Consolas" w:hAnsi="Consolas"/>
-                <w:color w:val="2D2D2D"/>
-                <w:sz w:val="18"/>
+                <w:sz w:val="17"/>
               </w:rPr>
               <w:t>arr.filter(x =&gt; typeof x === "number")</w:t>
             </w:r>
@@ -1088,7 +1224,7 @@
               <w:rPr>
                 <w:rFonts w:ascii="Consolas" w:hAnsi="Consolas"/>
                 <w:color w:val="2D2D2D"/>
-                <w:sz w:val="18"/>
+                <w:sz w:val="17"/>
               </w:rPr>
               <w:t xml:space="preserve">   .map(y =&gt; y * 2)</w:t>
             </w:r>
@@ -1101,7 +1237,7 @@
               <w:rPr>
                 <w:rFonts w:ascii="Consolas" w:hAnsi="Consolas"/>
                 <w:color w:val="2D2D2D"/>
-                <w:sz w:val="18"/>
+                <w:sz w:val="17"/>
               </w:rPr>
               <w:t xml:space="preserve">   .forEach(abc =&gt; console.log("Element after * 2:", abc * 2));</w:t>
             </w:r>
@@ -1114,9 +1250,35 @@
               <w:rPr>
                 <w:rFonts w:ascii="Consolas" w:hAnsi="Consolas"/>
                 <w:color w:val="2D2D2D"/>
-                <w:sz w:val="18"/>
+                <w:sz w:val="17"/>
               </w:rPr>
               <w:t>console.log(Math.floor(Math.random() * 100) + 1);</w:t>
+            </w:r>
+          </w:p>
+          <w:p>
+            <w:pPr>
+              <w:spacing w:after="0"/>
+            </w:pPr>
+            <w:r>
+              <w:rPr>
+                <w:rFonts w:ascii="Consolas" w:hAnsi="Consolas"/>
+                <w:color w:val="2D2D2D"/>
+                <w:sz w:val="17"/>
+              </w:rPr>
+              <w:t>console.log(Number(strnum));</w:t>
+            </w:r>
+          </w:p>
+          <w:p>
+            <w:pPr>
+              <w:spacing w:after="0"/>
+            </w:pPr>
+            <w:r>
+              <w:rPr>
+                <w:rFonts w:ascii="Consolas" w:hAnsi="Consolas"/>
+                <w:color w:val="2D2D2D"/>
+                <w:sz w:val="17"/>
+              </w:rPr>
+              <w:t>console.log(colors.splice(0, 1));</w:t>
             </w:r>
           </w:p>
         </w:tc>
@@ -1124,13 +1286,1070 @@
     </w:tbl>
     <w:p>
       <w:pPr>
-        <w:spacing w:after="40"/>
+        <w:spacing w:after="20"/>
       </w:pPr>
     </w:p>
     <w:p>
       <w:pPr>
         <w:pStyle w:val="Heading1"/>
-        <w:spacing w:before="240" w:after="100"/>
+        <w:spacing w:before="240" w:after="80"/>
+      </w:pPr>
+      <w:r>
+        <w:rPr>
+          <w:rFonts w:ascii="Aptos" w:hAnsi="Aptos"/>
+          <w:b/>
+          <w:color w:val="1F4E79"/>
+          <w:sz w:val="32"/>
+        </w:rPr>
+        <w:t>Day 2 Practice Questions</w:t>
+      </w:r>
+    </w:p>
+    <w:p>
+      <w:pPr>
+        <w:spacing w:after="100" w:line="259" w:lineRule="auto"/>
+      </w:pPr>
+      <w:r>
+        <w:rPr>
+          <w:rFonts w:ascii="Aptos" w:hAnsi="Aptos"/>
+          <w:color w:val="222222"/>
+          <w:sz w:val="20"/>
+        </w:rPr>
+        <w:t>The new Day2 question files turned the concepts into small problem-solving scripts. Each file focused on a different combination of array methods, functions, Math methods, and conversions.</w:t>
+      </w:r>
+    </w:p>
+    <w:p>
+      <w:pPr>
+        <w:pStyle w:val="Heading2"/>
+        <w:spacing w:before="140" w:after="80"/>
+      </w:pPr>
+      <w:r>
+        <w:rPr>
+          <w:rFonts w:ascii="Aptos" w:hAnsi="Aptos"/>
+          <w:b/>
+          <w:color w:val="1F4E79"/>
+          <w:sz w:val="25"/>
+        </w:rPr>
+        <w:t>Question 1: Guest List Formatter</w:t>
+      </w:r>
+    </w:p>
+    <w:p>
+      <w:pPr>
+        <w:spacing w:after="44" w:line="250" w:lineRule="auto"/>
+        <w:ind w:left="317" w:hanging="230"/>
+      </w:pPr>
+      <w:r>
+        <w:rPr>
+          <w:rFonts w:ascii="Aptos" w:hAnsi="Aptos"/>
+          <w:b/>
+          <w:color w:val="1F4E79"/>
+          <w:sz w:val="19"/>
+        </w:rPr>
+        <w:t xml:space="preserve">• </w:t>
+      </w:r>
+      <w:r>
+        <w:rPr>
+          <w:rFonts w:ascii="Aptos" w:hAnsi="Aptos"/>
+          <w:color w:val="222222"/>
+          <w:sz w:val="19"/>
+        </w:rPr>
+        <w:t>Created formatGuests(names) to format an array of names.</w:t>
+      </w:r>
+    </w:p>
+    <w:p>
+      <w:pPr>
+        <w:spacing w:after="44" w:line="250" w:lineRule="auto"/>
+        <w:ind w:left="317" w:hanging="230"/>
+      </w:pPr>
+      <w:r>
+        <w:rPr>
+          <w:rFonts w:ascii="Aptos" w:hAnsi="Aptos"/>
+          <w:b/>
+          <w:color w:val="1F4E79"/>
+          <w:sz w:val="19"/>
+        </w:rPr>
+        <w:t xml:space="preserve">• </w:t>
+      </w:r>
+      <w:r>
+        <w:rPr>
+          <w:rFonts w:ascii="Aptos" w:hAnsi="Aptos"/>
+          <w:color w:val="222222"/>
+          <w:sz w:val="19"/>
+        </w:rPr>
+        <w:t>Used slice(1) to remove the first name because it represents the host.</w:t>
+      </w:r>
+    </w:p>
+    <w:p>
+      <w:pPr>
+        <w:spacing w:after="44" w:line="250" w:lineRule="auto"/>
+        <w:ind w:left="317" w:hanging="230"/>
+      </w:pPr>
+      <w:r>
+        <w:rPr>
+          <w:rFonts w:ascii="Aptos" w:hAnsi="Aptos"/>
+          <w:b/>
+          <w:color w:val="1F4E79"/>
+          <w:sz w:val="19"/>
+        </w:rPr>
+        <w:t xml:space="preserve">• </w:t>
+      </w:r>
+      <w:r>
+        <w:rPr>
+          <w:rFonts w:ascii="Aptos" w:hAnsi="Aptos"/>
+          <w:color w:val="222222"/>
+          <w:sz w:val="19"/>
+        </w:rPr>
+        <w:t>Used map() with a template literal to add "Guest: " before each remaining name.</w:t>
+      </w:r>
+    </w:p>
+    <w:p>
+      <w:pPr>
+        <w:spacing w:after="44" w:line="250" w:lineRule="auto"/>
+        <w:ind w:left="317" w:hanging="230"/>
+      </w:pPr>
+      <w:r>
+        <w:rPr>
+          <w:rFonts w:ascii="Aptos" w:hAnsi="Aptos"/>
+          <w:b/>
+          <w:color w:val="1F4E79"/>
+          <w:sz w:val="19"/>
+        </w:rPr>
+        <w:t xml:space="preserve">• </w:t>
+      </w:r>
+      <w:r>
+        <w:rPr>
+          <w:rFonts w:ascii="Aptos" w:hAnsi="Aptos"/>
+          <w:color w:val="222222"/>
+          <w:sz w:val="19"/>
+        </w:rPr>
+        <w:t>Used join("\n") to return one string with each guest on a new line.</w:t>
+      </w:r>
+    </w:p>
+    <w:tbl>
+      <w:tblPr>
+        <w:tblW w:type="auto" w:w="0"/>
+        <w:jc w:val="center"/>
+        <w:tblLook w:firstColumn="1" w:firstRow="1" w:lastColumn="0" w:lastRow="0" w:noHBand="0" w:noVBand="1" w:val="04A0"/>
+        <w:tblBorders>
+          <w:top w:val="single" w:sz="4" w:space="0" w:color="C9D5E3"/>
+          <w:left w:val="single" w:sz="4" w:space="0" w:color="C9D5E3"/>
+          <w:bottom w:val="single" w:sz="4" w:space="0" w:color="C9D5E3"/>
+          <w:right w:val="single" w:sz="4" w:space="0" w:color="C9D5E3"/>
+          <w:insideH w:val="single" w:sz="4" w:space="0" w:color="C9D5E3"/>
+          <w:insideV w:val="single" w:sz="4" w:space="0" w:color="C9D5E3"/>
+        </w:tblBorders>
+      </w:tblPr>
+      <w:tblGrid>
+        <w:gridCol w:w="10166"/>
+      </w:tblGrid>
+      <w:tr>
+        <w:trPr>
+          <w:tblHeader w:val="true"/>
+        </w:trPr>
+        <w:tc>
+          <w:tcPr>
+            <w:tcW w:type="dxa" w:w="10166"/>
+            <w:shd w:fill="F4F7FB"/>
+          </w:tcPr>
+          <w:p>
+            <w:pPr>
+              <w:spacing w:after="0"/>
+            </w:pPr>
+            <w:r/>
+            <w:r>
+              <w:rPr>
+                <w:rFonts w:ascii="Consolas" w:hAnsi="Consolas"/>
+                <w:color w:val="2D2D2D"/>
+                <w:sz w:val="17"/>
+              </w:rPr>
+              <w:t>const guests = names.slice(1).map(name =&gt; `Guest: ${name}`);</w:t>
+            </w:r>
+          </w:p>
+          <w:p>
+            <w:pPr>
+              <w:spacing w:after="0"/>
+            </w:pPr>
+            <w:r>
+              <w:rPr>
+                <w:rFonts w:ascii="Consolas" w:hAnsi="Consolas"/>
+                <w:color w:val="2D2D2D"/>
+                <w:sz w:val="17"/>
+              </w:rPr>
+              <w:t>return guests.join("\n");</w:t>
+            </w:r>
+          </w:p>
+        </w:tc>
+      </w:tr>
+    </w:tbl>
+    <w:p>
+      <w:pPr>
+        <w:spacing w:after="20"/>
+      </w:pPr>
+    </w:p>
+    <w:p>
+      <w:pPr>
+        <w:pStyle w:val="Heading2"/>
+        <w:spacing w:before="140" w:after="80"/>
+      </w:pPr>
+      <w:r>
+        <w:rPr>
+          <w:rFonts w:ascii="Aptos" w:hAnsi="Aptos"/>
+          <w:b/>
+          <w:color w:val="1F4E79"/>
+          <w:sz w:val="25"/>
+        </w:rPr>
+        <w:t>Question 2: Logic Gate</w:t>
+      </w:r>
+    </w:p>
+    <w:p>
+      <w:pPr>
+        <w:spacing w:after="44" w:line="250" w:lineRule="auto"/>
+        <w:ind w:left="317" w:hanging="230"/>
+      </w:pPr>
+      <w:r>
+        <w:rPr>
+          <w:rFonts w:ascii="Aptos" w:hAnsi="Aptos"/>
+          <w:b/>
+          <w:color w:val="1F4E79"/>
+          <w:sz w:val="19"/>
+        </w:rPr>
+        <w:t xml:space="preserve">• </w:t>
+      </w:r>
+      <w:r>
+        <w:rPr>
+          <w:rFonts w:ascii="Aptos" w:hAnsi="Aptos"/>
+          <w:color w:val="222222"/>
+          <w:sz w:val="19"/>
+        </w:rPr>
+        <w:t>Created getHighNumbers as an arrow function.</w:t>
+      </w:r>
+    </w:p>
+    <w:p>
+      <w:pPr>
+        <w:spacing w:after="44" w:line="250" w:lineRule="auto"/>
+        <w:ind w:left="317" w:hanging="230"/>
+      </w:pPr>
+      <w:r>
+        <w:rPr>
+          <w:rFonts w:ascii="Aptos" w:hAnsi="Aptos"/>
+          <w:b/>
+          <w:color w:val="1F4E79"/>
+          <w:sz w:val="19"/>
+        </w:rPr>
+        <w:t xml:space="preserve">• </w:t>
+      </w:r>
+      <w:r>
+        <w:rPr>
+          <w:rFonts w:ascii="Aptos" w:hAnsi="Aptos"/>
+          <w:color w:val="222222"/>
+          <w:sz w:val="19"/>
+        </w:rPr>
+        <w:t>Filtered mixed values to keep only numbers using typeof value === "number".</w:t>
+      </w:r>
+    </w:p>
+    <w:p>
+      <w:pPr>
+        <w:spacing w:after="44" w:line="250" w:lineRule="auto"/>
+        <w:ind w:left="317" w:hanging="230"/>
+      </w:pPr>
+      <w:r>
+        <w:rPr>
+          <w:rFonts w:ascii="Aptos" w:hAnsi="Aptos"/>
+          <w:b/>
+          <w:color w:val="1F4E79"/>
+          <w:sz w:val="19"/>
+        </w:rPr>
+        <w:t xml:space="preserve">• </w:t>
+      </w:r>
+      <w:r>
+        <w:rPr>
+          <w:rFonts w:ascii="Aptos" w:hAnsi="Aptos"/>
+          <w:color w:val="222222"/>
+          <w:sz w:val="19"/>
+        </w:rPr>
+        <w:t>Generated a random threshold between 1 and 50 using Math.floor(Math.random() * 50) + 1.</w:t>
+      </w:r>
+    </w:p>
+    <w:p>
+      <w:pPr>
+        <w:spacing w:after="44" w:line="250" w:lineRule="auto"/>
+        <w:ind w:left="317" w:hanging="230"/>
+      </w:pPr>
+      <w:r>
+        <w:rPr>
+          <w:rFonts w:ascii="Aptos" w:hAnsi="Aptos"/>
+          <w:b/>
+          <w:color w:val="1F4E79"/>
+          <w:sz w:val="19"/>
+        </w:rPr>
+        <w:t xml:space="preserve">• </w:t>
+      </w:r>
+      <w:r>
+        <w:rPr>
+          <w:rFonts w:ascii="Aptos" w:hAnsi="Aptos"/>
+          <w:color w:val="222222"/>
+          <w:sz w:val="19"/>
+        </w:rPr>
+        <w:t>Filtered the numeric values again to keep only numbers greater than the threshold.</w:t>
+      </w:r>
+    </w:p>
+    <w:tbl>
+      <w:tblPr>
+        <w:tblW w:type="auto" w:w="0"/>
+        <w:jc w:val="center"/>
+        <w:tblLook w:firstColumn="1" w:firstRow="1" w:lastColumn="0" w:lastRow="0" w:noHBand="0" w:noVBand="1" w:val="04A0"/>
+        <w:tblBorders>
+          <w:top w:val="single" w:sz="4" w:space="0" w:color="C9D5E3"/>
+          <w:left w:val="single" w:sz="4" w:space="0" w:color="C9D5E3"/>
+          <w:bottom w:val="single" w:sz="4" w:space="0" w:color="C9D5E3"/>
+          <w:right w:val="single" w:sz="4" w:space="0" w:color="C9D5E3"/>
+          <w:insideH w:val="single" w:sz="4" w:space="0" w:color="C9D5E3"/>
+          <w:insideV w:val="single" w:sz="4" w:space="0" w:color="C9D5E3"/>
+        </w:tblBorders>
+      </w:tblPr>
+      <w:tblGrid>
+        <w:gridCol w:w="10166"/>
+      </w:tblGrid>
+      <w:tr>
+        <w:trPr>
+          <w:tblHeader w:val="true"/>
+        </w:trPr>
+        <w:tc>
+          <w:tcPr>
+            <w:tcW w:type="dxa" w:w="10166"/>
+            <w:shd w:fill="F4F7FB"/>
+          </w:tcPr>
+          <w:p>
+            <w:pPr>
+              <w:spacing w:after="0"/>
+            </w:pPr>
+            <w:r/>
+            <w:r>
+              <w:rPr>
+                <w:rFonts w:ascii="Consolas" w:hAnsi="Consolas"/>
+                <w:color w:val="2D2D2D"/>
+                <w:sz w:val="17"/>
+              </w:rPr>
+              <w:t>const threshold = Math.floor(Math.random() * 50) + 1;</w:t>
+            </w:r>
+          </w:p>
+          <w:p>
+            <w:pPr>
+              <w:spacing w:after="0"/>
+            </w:pPr>
+            <w:r>
+              <w:rPr>
+                <w:rFonts w:ascii="Consolas" w:hAnsi="Consolas"/>
+                <w:color w:val="2D2D2D"/>
+                <w:sz w:val="17"/>
+              </w:rPr>
+              <w:t>return values</w:t>
+            </w:r>
+          </w:p>
+          <w:p>
+            <w:pPr>
+              <w:spacing w:after="0"/>
+            </w:pPr>
+            <w:r>
+              <w:rPr>
+                <w:rFonts w:ascii="Consolas" w:hAnsi="Consolas"/>
+                <w:color w:val="2D2D2D"/>
+                <w:sz w:val="17"/>
+              </w:rPr>
+              <w:t xml:space="preserve">    .filter(value =&gt; typeof value === "number")</w:t>
+            </w:r>
+          </w:p>
+          <w:p>
+            <w:pPr>
+              <w:spacing w:after="0"/>
+            </w:pPr>
+            <w:r>
+              <w:rPr>
+                <w:rFonts w:ascii="Consolas" w:hAnsi="Consolas"/>
+                <w:color w:val="2D2D2D"/>
+                <w:sz w:val="17"/>
+              </w:rPr>
+              <w:t xml:space="preserve">    .filter(number =&gt; number &gt; threshold);</w:t>
+            </w:r>
+          </w:p>
+        </w:tc>
+      </w:tr>
+    </w:tbl>
+    <w:p>
+      <w:pPr>
+        <w:spacing w:after="20"/>
+      </w:pPr>
+    </w:p>
+    <w:p>
+      <w:pPr>
+        <w:pStyle w:val="Heading2"/>
+        <w:spacing w:before="140" w:after="80"/>
+      </w:pPr>
+      <w:r>
+        <w:rPr>
+          <w:rFonts w:ascii="Aptos" w:hAnsi="Aptos"/>
+          <w:b/>
+          <w:color w:val="1F4E79"/>
+          <w:sz w:val="25"/>
+        </w:rPr>
+        <w:t>Question 3: Price Calculator</w:t>
+      </w:r>
+    </w:p>
+    <w:p>
+      <w:pPr>
+        <w:spacing w:after="44" w:line="250" w:lineRule="auto"/>
+        <w:ind w:left="317" w:hanging="230"/>
+      </w:pPr>
+      <w:r>
+        <w:rPr>
+          <w:rFonts w:ascii="Aptos" w:hAnsi="Aptos"/>
+          <w:b/>
+          <w:color w:val="1F4E79"/>
+          <w:sz w:val="19"/>
+        </w:rPr>
+        <w:t xml:space="preserve">• </w:t>
+      </w:r>
+      <w:r>
+        <w:rPr>
+          <w:rFonts w:ascii="Aptos" w:hAnsi="Aptos"/>
+          <w:color w:val="222222"/>
+          <w:sz w:val="19"/>
+        </w:rPr>
+        <w:t>Used splice(prices.length - 1, 1) to remove the last item as the handling fee.</w:t>
+      </w:r>
+    </w:p>
+    <w:p>
+      <w:pPr>
+        <w:spacing w:after="44" w:line="250" w:lineRule="auto"/>
+        <w:ind w:left="317" w:hanging="230"/>
+      </w:pPr>
+      <w:r>
+        <w:rPr>
+          <w:rFonts w:ascii="Aptos" w:hAnsi="Aptos"/>
+          <w:b/>
+          <w:color w:val="1F4E79"/>
+          <w:sz w:val="19"/>
+        </w:rPr>
+        <w:t xml:space="preserve">• </w:t>
+      </w:r>
+      <w:r>
+        <w:rPr>
+          <w:rFonts w:ascii="Aptos" w:hAnsi="Aptos"/>
+          <w:color w:val="222222"/>
+          <w:sz w:val="19"/>
+        </w:rPr>
+        <w:t>Converted string prices to numbers with map(price =&gt; Number(price)).</w:t>
+      </w:r>
+    </w:p>
+    <w:p>
+      <w:pPr>
+        <w:spacing w:after="44" w:line="250" w:lineRule="auto"/>
+        <w:ind w:left="317" w:hanging="230"/>
+      </w:pPr>
+      <w:r>
+        <w:rPr>
+          <w:rFonts w:ascii="Aptos" w:hAnsi="Aptos"/>
+          <w:b/>
+          <w:color w:val="1F4E79"/>
+          <w:sz w:val="19"/>
+        </w:rPr>
+        <w:t xml:space="preserve">• </w:t>
+      </w:r>
+      <w:r>
+        <w:rPr>
+          <w:rFonts w:ascii="Aptos" w:hAnsi="Aptos"/>
+          <w:color w:val="222222"/>
+          <w:sz w:val="19"/>
+        </w:rPr>
+        <w:t>Used an arrow function inside reduce() to calculate the total.</w:t>
+      </w:r>
+    </w:p>
+    <w:p>
+      <w:pPr>
+        <w:spacing w:after="44" w:line="250" w:lineRule="auto"/>
+        <w:ind w:left="317" w:hanging="230"/>
+      </w:pPr>
+      <w:r>
+        <w:rPr>
+          <w:rFonts w:ascii="Aptos" w:hAnsi="Aptos"/>
+          <w:b/>
+          <w:color w:val="1F4E79"/>
+          <w:sz w:val="19"/>
+        </w:rPr>
+        <w:t xml:space="preserve">• </w:t>
+      </w:r>
+      <w:r>
+        <w:rPr>
+          <w:rFonts w:ascii="Aptos" w:hAnsi="Aptos"/>
+          <w:color w:val="222222"/>
+          <w:sz w:val="19"/>
+        </w:rPr>
+        <w:t>Printed the final output using a template literal: Total Price: $[sum].</w:t>
+      </w:r>
+    </w:p>
+    <w:tbl>
+      <w:tblPr>
+        <w:tblW w:type="auto" w:w="0"/>
+        <w:jc w:val="center"/>
+        <w:tblLook w:firstColumn="1" w:firstRow="1" w:lastColumn="0" w:lastRow="0" w:noHBand="0" w:noVBand="1" w:val="04A0"/>
+        <w:tblBorders>
+          <w:top w:val="single" w:sz="4" w:space="0" w:color="C9D5E3"/>
+          <w:left w:val="single" w:sz="4" w:space="0" w:color="C9D5E3"/>
+          <w:bottom w:val="single" w:sz="4" w:space="0" w:color="C9D5E3"/>
+          <w:right w:val="single" w:sz="4" w:space="0" w:color="C9D5E3"/>
+          <w:insideH w:val="single" w:sz="4" w:space="0" w:color="C9D5E3"/>
+          <w:insideV w:val="single" w:sz="4" w:space="0" w:color="C9D5E3"/>
+        </w:tblBorders>
+      </w:tblPr>
+      <w:tblGrid>
+        <w:gridCol w:w="10166"/>
+      </w:tblGrid>
+      <w:tr>
+        <w:trPr>
+          <w:tblHeader w:val="true"/>
+        </w:trPr>
+        <w:tc>
+          <w:tcPr>
+            <w:tcW w:type="dxa" w:w="10166"/>
+            <w:shd w:fill="F4F7FB"/>
+          </w:tcPr>
+          <w:p>
+            <w:pPr>
+              <w:spacing w:after="0"/>
+            </w:pPr>
+            <w:r/>
+            <w:r>
+              <w:rPr>
+                <w:rFonts w:ascii="Consolas" w:hAnsi="Consolas"/>
+                <w:color w:val="2D2D2D"/>
+                <w:sz w:val="17"/>
+              </w:rPr>
+              <w:t>prices.splice(prices.length - 1, 1);</w:t>
+            </w:r>
+          </w:p>
+          <w:p>
+            <w:pPr>
+              <w:spacing w:after="0"/>
+            </w:pPr>
+            <w:r>
+              <w:rPr>
+                <w:rFonts w:ascii="Consolas" w:hAnsi="Consolas"/>
+                <w:color w:val="2D2D2D"/>
+                <w:sz w:val="17"/>
+              </w:rPr>
+              <w:t>const numberPrices = prices.map(price =&gt; Number(price));</w:t>
+            </w:r>
+          </w:p>
+          <w:p>
+            <w:pPr>
+              <w:spacing w:after="0"/>
+            </w:pPr>
+            <w:r>
+              <w:rPr>
+                <w:rFonts w:ascii="Consolas" w:hAnsi="Consolas"/>
+                <w:color w:val="2D2D2D"/>
+                <w:sz w:val="17"/>
+              </w:rPr>
+              <w:t>const sumPrices = (total, price) =&gt; total + price;</w:t>
+            </w:r>
+          </w:p>
+          <w:p>
+            <w:pPr>
+              <w:spacing w:after="0"/>
+            </w:pPr>
+            <w:r>
+              <w:rPr>
+                <w:rFonts w:ascii="Consolas" w:hAnsi="Consolas"/>
+                <w:color w:val="2D2D2D"/>
+                <w:sz w:val="17"/>
+              </w:rPr>
+              <w:t>console.log(`Total Price: $${totalPrice}`);</w:t>
+            </w:r>
+          </w:p>
+        </w:tc>
+      </w:tr>
+    </w:tbl>
+    <w:p>
+      <w:pPr>
+        <w:spacing w:after="20"/>
+      </w:pPr>
+    </w:p>
+    <w:p>
+      <w:pPr>
+        <w:pStyle w:val="Heading1"/>
+        <w:spacing w:before="240" w:after="80"/>
+      </w:pPr>
+      <w:r>
+        <w:rPr>
+          <w:rFonts w:ascii="Aptos" w:hAnsi="Aptos"/>
+          <w:b/>
+          <w:color w:val="1F4E79"/>
+          <w:sz w:val="32"/>
+        </w:rPr>
+        <w:t>Day 2 Browser Practice</w:t>
+      </w:r>
+    </w:p>
+    <w:p>
+      <w:pPr>
+        <w:spacing w:after="100" w:line="259" w:lineRule="auto"/>
+      </w:pPr>
+      <w:r>
+        <w:rPr>
+          <w:rFonts w:ascii="Aptos" w:hAnsi="Aptos"/>
+          <w:color w:val="222222"/>
+          <w:sz w:val="20"/>
+        </w:rPr>
+        <w:t>The newer Day2 browser files introduced a simple login page and home page. This practice connected HTML structure, CSS styling, and JavaScript behavior in the browser.</w:t>
+      </w:r>
+    </w:p>
+    <w:p>
+      <w:pPr>
+        <w:pStyle w:val="Heading2"/>
+        <w:spacing w:before="140" w:after="80"/>
+      </w:pPr>
+      <w:r>
+        <w:rPr>
+          <w:rFonts w:ascii="Aptos" w:hAnsi="Aptos"/>
+          <w:b/>
+          <w:color w:val="1F4E79"/>
+          <w:sz w:val="25"/>
+        </w:rPr>
+        <w:t>HTML and CSS Topics Practiced</w:t>
+      </w:r>
+    </w:p>
+    <w:p>
+      <w:pPr>
+        <w:spacing w:after="44" w:line="250" w:lineRule="auto"/>
+        <w:ind w:left="317" w:hanging="230"/>
+      </w:pPr>
+      <w:r>
+        <w:rPr>
+          <w:rFonts w:ascii="Aptos" w:hAnsi="Aptos"/>
+          <w:b/>
+          <w:color w:val="1F4E79"/>
+          <w:sz w:val="20"/>
+        </w:rPr>
+        <w:t xml:space="preserve">• </w:t>
+      </w:r>
+      <w:r>
+        <w:rPr>
+          <w:rFonts w:ascii="Aptos" w:hAnsi="Aptos"/>
+          <w:color w:val="222222"/>
+          <w:sz w:val="20"/>
+        </w:rPr>
+        <w:t>Created a login page with input fields for username and password.</w:t>
+      </w:r>
+    </w:p>
+    <w:p>
+      <w:pPr>
+        <w:spacing w:after="44" w:line="250" w:lineRule="auto"/>
+        <w:ind w:left="317" w:hanging="230"/>
+      </w:pPr>
+      <w:r>
+        <w:rPr>
+          <w:rFonts w:ascii="Aptos" w:hAnsi="Aptos"/>
+          <w:b/>
+          <w:color w:val="1F4E79"/>
+          <w:sz w:val="20"/>
+        </w:rPr>
+        <w:t xml:space="preserve">• </w:t>
+      </w:r>
+      <w:r>
+        <w:rPr>
+          <w:rFonts w:ascii="Aptos" w:hAnsi="Aptos"/>
+          <w:color w:val="222222"/>
+          <w:sz w:val="20"/>
+        </w:rPr>
+        <w:t>Used input types text and password to control how data is entered.</w:t>
+      </w:r>
+    </w:p>
+    <w:p>
+      <w:pPr>
+        <w:spacing w:after="44" w:line="250" w:lineRule="auto"/>
+        <w:ind w:left="317" w:hanging="230"/>
+      </w:pPr>
+      <w:r>
+        <w:rPr>
+          <w:rFonts w:ascii="Aptos" w:hAnsi="Aptos"/>
+          <w:b/>
+          <w:color w:val="1F4E79"/>
+          <w:sz w:val="20"/>
+        </w:rPr>
+        <w:t xml:space="preserve">• </w:t>
+      </w:r>
+      <w:r>
+        <w:rPr>
+          <w:rFonts w:ascii="Aptos" w:hAnsi="Aptos"/>
+          <w:color w:val="222222"/>
+          <w:sz w:val="20"/>
+        </w:rPr>
+        <w:t>Connected external JavaScript with &lt;script src="login.js"&gt;&lt;/script&gt;.</w:t>
+      </w:r>
+    </w:p>
+    <w:p>
+      <w:pPr>
+        <w:spacing w:after="44" w:line="250" w:lineRule="auto"/>
+        <w:ind w:left="317" w:hanging="230"/>
+      </w:pPr>
+      <w:r>
+        <w:rPr>
+          <w:rFonts w:ascii="Aptos" w:hAnsi="Aptos"/>
+          <w:b/>
+          <w:color w:val="1F4E79"/>
+          <w:sz w:val="20"/>
+        </w:rPr>
+        <w:t xml:space="preserve">• </w:t>
+      </w:r>
+      <w:r>
+        <w:rPr>
+          <w:rFonts w:ascii="Aptos" w:hAnsi="Aptos"/>
+          <w:color w:val="222222"/>
+          <w:sz w:val="20"/>
+        </w:rPr>
+        <w:t>Connected external CSS with &lt;link rel="stylesheet" href="login.css"&gt;.</w:t>
+      </w:r>
+    </w:p>
+    <w:p>
+      <w:pPr>
+        <w:spacing w:after="44" w:line="250" w:lineRule="auto"/>
+        <w:ind w:left="317" w:hanging="230"/>
+      </w:pPr>
+      <w:r>
+        <w:rPr>
+          <w:rFonts w:ascii="Aptos" w:hAnsi="Aptos"/>
+          <w:b/>
+          <w:color w:val="1F4E79"/>
+          <w:sz w:val="20"/>
+        </w:rPr>
+        <w:t xml:space="preserve">• </w:t>
+      </w:r>
+      <w:r>
+        <w:rPr>
+          <w:rFonts w:ascii="Aptos" w:hAnsi="Aptos"/>
+          <w:color w:val="222222"/>
+          <w:sz w:val="20"/>
+        </w:rPr>
+        <w:t>Styled h1, p, and button elements with CSS properties such as color, margin-top, and background-color.</w:t>
+      </w:r>
+    </w:p>
+    <w:p>
+      <w:pPr>
+        <w:spacing w:after="44" w:line="250" w:lineRule="auto"/>
+        <w:ind w:left="317" w:hanging="230"/>
+      </w:pPr>
+      <w:r>
+        <w:rPr>
+          <w:rFonts w:ascii="Aptos" w:hAnsi="Aptos"/>
+          <w:b/>
+          <w:color w:val="1F4E79"/>
+          <w:sz w:val="20"/>
+        </w:rPr>
+        <w:t xml:space="preserve">• </w:t>
+      </w:r>
+      <w:r>
+        <w:rPr>
+          <w:rFonts w:ascii="Aptos" w:hAnsi="Aptos"/>
+          <w:color w:val="222222"/>
+          <w:sz w:val="20"/>
+        </w:rPr>
+        <w:t>Created app.html as a simple home page with navigation links in an unordered list.</w:t>
+      </w:r>
+    </w:p>
+    <w:p>
+      <w:pPr>
+        <w:pStyle w:val="Heading2"/>
+        <w:spacing w:before="140" w:after="80"/>
+      </w:pPr>
+      <w:r>
+        <w:rPr>
+          <w:rFonts w:ascii="Aptos" w:hAnsi="Aptos"/>
+          <w:b/>
+          <w:color w:val="1F4E79"/>
+          <w:sz w:val="25"/>
+        </w:rPr>
+        <w:t>Login JavaScript Topics Practiced</w:t>
+      </w:r>
+    </w:p>
+    <w:p>
+      <w:pPr>
+        <w:spacing w:after="44" w:line="250" w:lineRule="auto"/>
+        <w:ind w:left="317" w:hanging="230"/>
+      </w:pPr>
+      <w:r>
+        <w:rPr>
+          <w:rFonts w:ascii="Aptos" w:hAnsi="Aptos"/>
+          <w:b/>
+          <w:color w:val="1F4E79"/>
+          <w:sz w:val="20"/>
+        </w:rPr>
+        <w:t xml:space="preserve">• </w:t>
+      </w:r>
+      <w:r>
+        <w:rPr>
+          <w:rFonts w:ascii="Aptos" w:hAnsi="Aptos"/>
+          <w:color w:val="222222"/>
+          <w:sz w:val="20"/>
+        </w:rPr>
+        <w:t>Created auth as an arrow function that runs when the Submit button is clicked.</w:t>
+      </w:r>
+    </w:p>
+    <w:p>
+      <w:pPr>
+        <w:spacing w:after="44" w:line="250" w:lineRule="auto"/>
+        <w:ind w:left="317" w:hanging="230"/>
+      </w:pPr>
+      <w:r>
+        <w:rPr>
+          <w:rFonts w:ascii="Aptos" w:hAnsi="Aptos"/>
+          <w:b/>
+          <w:color w:val="1F4E79"/>
+          <w:sz w:val="20"/>
+        </w:rPr>
+        <w:t xml:space="preserve">• </w:t>
+      </w:r>
+      <w:r>
+        <w:rPr>
+          <w:rFonts w:ascii="Aptos" w:hAnsi="Aptos"/>
+          <w:color w:val="222222"/>
+          <w:sz w:val="20"/>
+        </w:rPr>
+        <w:t>Read browser input values using document.getElementById("username").value and document.getElementById("password").value.</w:t>
+      </w:r>
+    </w:p>
+    <w:p>
+      <w:pPr>
+        <w:spacing w:after="44" w:line="250" w:lineRule="auto"/>
+        <w:ind w:left="317" w:hanging="230"/>
+      </w:pPr>
+      <w:r>
+        <w:rPr>
+          <w:rFonts w:ascii="Aptos" w:hAnsi="Aptos"/>
+          <w:b/>
+          <w:color w:val="1F4E79"/>
+          <w:sz w:val="20"/>
+        </w:rPr>
+        <w:t xml:space="preserve">• </w:t>
+      </w:r>
+      <w:r>
+        <w:rPr>
+          <w:rFonts w:ascii="Aptos" w:hAnsi="Aptos"/>
+          <w:color w:val="222222"/>
+          <w:sz w:val="20"/>
+        </w:rPr>
+        <w:t>Used strict equality checks with === for username and password comparison.</w:t>
+      </w:r>
+    </w:p>
+    <w:p>
+      <w:pPr>
+        <w:spacing w:after="44" w:line="250" w:lineRule="auto"/>
+        <w:ind w:left="317" w:hanging="230"/>
+      </w:pPr>
+      <w:r>
+        <w:rPr>
+          <w:rFonts w:ascii="Aptos" w:hAnsi="Aptos"/>
+          <w:b/>
+          <w:color w:val="1F4E79"/>
+          <w:sz w:val="20"/>
+        </w:rPr>
+        <w:t xml:space="preserve">• </w:t>
+      </w:r>
+      <w:r>
+        <w:rPr>
+          <w:rFonts w:ascii="Aptos" w:hAnsi="Aptos"/>
+          <w:color w:val="222222"/>
+          <w:sz w:val="20"/>
+        </w:rPr>
+        <w:t>Used the logical AND operator &amp;&amp; to require both conditions to be true.</w:t>
+      </w:r>
+    </w:p>
+    <w:p>
+      <w:pPr>
+        <w:spacing w:after="44" w:line="250" w:lineRule="auto"/>
+        <w:ind w:left="317" w:hanging="230"/>
+      </w:pPr>
+      <w:r>
+        <w:rPr>
+          <w:rFonts w:ascii="Aptos" w:hAnsi="Aptos"/>
+          <w:b/>
+          <w:color w:val="1F4E79"/>
+          <w:sz w:val="20"/>
+        </w:rPr>
+        <w:t xml:space="preserve">• </w:t>
+      </w:r>
+      <w:r>
+        <w:rPr>
+          <w:rFonts w:ascii="Aptos" w:hAnsi="Aptos"/>
+          <w:color w:val="222222"/>
+          <w:sz w:val="20"/>
+        </w:rPr>
+        <w:t>Displayed feedback to the user with alert().</w:t>
+      </w:r>
+    </w:p>
+    <w:p>
+      <w:pPr>
+        <w:spacing w:after="44" w:line="250" w:lineRule="auto"/>
+        <w:ind w:left="317" w:hanging="230"/>
+      </w:pPr>
+      <w:r>
+        <w:rPr>
+          <w:rFonts w:ascii="Aptos" w:hAnsi="Aptos"/>
+          <w:b/>
+          <w:color w:val="1F4E79"/>
+          <w:sz w:val="20"/>
+        </w:rPr>
+        <w:t xml:space="preserve">• </w:t>
+      </w:r>
+      <w:r>
+        <w:rPr>
+          <w:rFonts w:ascii="Aptos" w:hAnsi="Aptos"/>
+          <w:color w:val="222222"/>
+          <w:sz w:val="20"/>
+        </w:rPr>
+        <w:t>Practiced page navigation using window.location.href.</w:t>
+      </w:r>
+    </w:p>
+    <w:tbl>
+      <w:tblPr>
+        <w:tblW w:type="auto" w:w="0"/>
+        <w:jc w:val="center"/>
+        <w:tblLook w:firstColumn="1" w:firstRow="1" w:lastColumn="0" w:lastRow="0" w:noHBand="0" w:noVBand="1" w:val="04A0"/>
+        <w:tblBorders>
+          <w:top w:val="single" w:sz="4" w:space="0" w:color="C9D5E3"/>
+          <w:left w:val="single" w:sz="4" w:space="0" w:color="C9D5E3"/>
+          <w:bottom w:val="single" w:sz="4" w:space="0" w:color="C9D5E3"/>
+          <w:right w:val="single" w:sz="4" w:space="0" w:color="C9D5E3"/>
+          <w:insideH w:val="single" w:sz="4" w:space="0" w:color="C9D5E3"/>
+          <w:insideV w:val="single" w:sz="4" w:space="0" w:color="C9D5E3"/>
+        </w:tblBorders>
+      </w:tblPr>
+      <w:tblGrid>
+        <w:gridCol w:w="10166"/>
+      </w:tblGrid>
+      <w:tr>
+        <w:trPr>
+          <w:tblHeader w:val="true"/>
+        </w:trPr>
+        <w:tc>
+          <w:tcPr>
+            <w:tcW w:type="dxa" w:w="10166"/>
+            <w:shd w:fill="F4F7FB"/>
+          </w:tcPr>
+          <w:p>
+            <w:pPr>
+              <w:spacing w:after="0"/>
+            </w:pPr>
+            <w:r/>
+            <w:r>
+              <w:rPr>
+                <w:rFonts w:ascii="Consolas" w:hAnsi="Consolas"/>
+                <w:color w:val="2D2D2D"/>
+                <w:sz w:val="17"/>
+              </w:rPr>
+              <w:t>const auth = () =&gt; {</w:t>
+            </w:r>
+          </w:p>
+          <w:p>
+            <w:pPr>
+              <w:spacing w:after="0"/>
+            </w:pPr>
+            <w:r>
+              <w:rPr>
+                <w:rFonts w:ascii="Consolas" w:hAnsi="Consolas"/>
+                <w:color w:val="2D2D2D"/>
+                <w:sz w:val="17"/>
+              </w:rPr>
+              <w:t xml:space="preserve">    const username = document.getElementById("username").value;</w:t>
+            </w:r>
+          </w:p>
+          <w:p>
+            <w:pPr>
+              <w:spacing w:after="0"/>
+            </w:pPr>
+            <w:r>
+              <w:rPr>
+                <w:rFonts w:ascii="Consolas" w:hAnsi="Consolas"/>
+                <w:color w:val="2D2D2D"/>
+                <w:sz w:val="17"/>
+              </w:rPr>
+              <w:t xml:space="preserve">    const password = document.getElementById("password").value;</w:t>
+            </w:r>
+          </w:p>
+          <w:p>
+            <w:pPr>
+              <w:spacing w:after="0"/>
+            </w:pPr>
+            <w:r>
+              <w:rPr>
+                <w:rFonts w:ascii="Consolas" w:hAnsi="Consolas"/>
+                <w:color w:val="2D2D2D"/>
+                <w:sz w:val="17"/>
+              </w:rPr>
+              <w:t xml:space="preserve">    if (username === "admin" &amp;&amp; password === "password") {</w:t>
+            </w:r>
+          </w:p>
+          <w:p>
+            <w:pPr>
+              <w:spacing w:after="0"/>
+            </w:pPr>
+            <w:r>
+              <w:rPr>
+                <w:rFonts w:ascii="Consolas" w:hAnsi="Consolas"/>
+                <w:color w:val="2D2D2D"/>
+                <w:sz w:val="17"/>
+              </w:rPr>
+              <w:t xml:space="preserve">        alert("Authentication Successfull!");</w:t>
+            </w:r>
+          </w:p>
+          <w:p>
+            <w:pPr>
+              <w:spacing w:after="0"/>
+            </w:pPr>
+            <w:r>
+              <w:rPr>
+                <w:rFonts w:ascii="Consolas" w:hAnsi="Consolas"/>
+                <w:color w:val="2D2D2D"/>
+                <w:sz w:val="17"/>
+              </w:rPr>
+              <w:t xml:space="preserve">        window.location.href = "login.html";</w:t>
+            </w:r>
+          </w:p>
+          <w:p>
+            <w:pPr>
+              <w:spacing w:after="0"/>
+            </w:pPr>
+            <w:r>
+              <w:rPr>
+                <w:rFonts w:ascii="Consolas" w:hAnsi="Consolas"/>
+                <w:color w:val="2D2D2D"/>
+                <w:sz w:val="17"/>
+              </w:rPr>
+              <w:t xml:space="preserve">    }</w:t>
+            </w:r>
+          </w:p>
+          <w:p>
+            <w:pPr>
+              <w:spacing w:after="0"/>
+            </w:pPr>
+            <w:r>
+              <w:rPr>
+                <w:rFonts w:ascii="Consolas" w:hAnsi="Consolas"/>
+                <w:color w:val="2D2D2D"/>
+                <w:sz w:val="17"/>
+              </w:rPr>
+              <w:t>};</w:t>
+            </w:r>
+          </w:p>
+        </w:tc>
+      </w:tr>
+    </w:tbl>
+    <w:p>
+      <w:pPr>
+        <w:spacing w:after="20"/>
+      </w:pPr>
+    </w:p>
+    <w:p>
+      <w:pPr>
+        <w:pStyle w:val="Heading1"/>
+        <w:spacing w:before="240" w:after="80"/>
       </w:pPr>
       <w:r>
         <w:rPr>
@@ -1150,15 +2369,15 @@
         <w:rPr>
           <w:rFonts w:ascii="Aptos" w:hAnsi="Aptos"/>
           <w:color w:val="222222"/>
-          <w:sz w:val="21"/>
+          <w:sz w:val="20"/>
         </w:rPr>
-        <w:t>By the end of Day 2, I had moved from basic syntax to writing small reusable logic blocks. The practice programs helped me understand how JavaScript handles data, decisions, browser input, functions, arrays, and common built-in methods. These concepts form a useful base for upcoming automation and Playwright training.</w:t>
+        <w:t>The updated training work shows progress from basic JavaScript syntax to practical browser-based interaction. Day 1 introduced variables, operators, conditions, functions, and simple DOM reading. Day 2 added modern string formatting, arrow functions, array methods, Math methods, type conversion, array mutation, problem-solving scripts, and a basic login flow using HTML, CSS, and JavaScript. These topics are a strong base for upcoming automation and Playwright practice.</w:t>
       </w:r>
     </w:p>
     <w:sectPr>
       <w:footerReference w:type="default" r:id="rId9"/>
       <w:pgSz w:w="12240" w:h="15840"/>
-      <w:pgMar w:top="936" w:right="1080" w:bottom="936" w:left="1080" w:header="720" w:footer="720" w:gutter="0"/>
+      <w:pgMar w:top="893" w:right="1037" w:bottom="893" w:left="1037" w:header="720" w:footer="720" w:gutter="0"/>
       <w:cols w:space="720"/>
       <w:docGrid w:linePitch="360"/>
     </w:sectPr>
@@ -1180,7 +2399,7 @@
         <w:color w:val="787878"/>
         <w:sz w:val="17"/>
       </w:rPr>
-      <w:t>Synopsis | Day 1 and Day 2 JavaScript Training</w:t>
+      <w:t>Synopsis | Updated Day 1 and Day 2 JavaScript Training</w:t>
     </w:r>
   </w:p>
 </w:ftr>
@@ -1551,7 +2770,7 @@
     <w:rsid w:val="00FC693F"/>
     <w:rPr>
       <w:rFonts w:ascii="Aptos" w:hAnsi="Aptos"/>
-      <w:sz w:val="21"/>
+      <w:sz w:val="20"/>
     </w:rPr>
   </w:style>
   <w:style w:type="paragraph" w:styleId="Header">

</xml_diff>

<commit_message>
Updated Day2 / latest changes
</commit_message>
<xml_diff>
--- a/synopsis.docx
+++ b/synopsis.docx
@@ -29,7 +29,7 @@
           <w:color w:val="595959"/>
           <w:sz w:val="26"/>
         </w:rPr>
-        <w:t>Day 1 and Day 2 JavaScript Training Code</w:t>
+        <w:t>Day 1 to Day 4 JavaScript Training Code</w:t>
       </w:r>
     </w:p>
     <w:p>
@@ -41,9 +41,9 @@
         <w:rPr>
           <w:rFonts w:ascii="Aptos" w:hAnsi="Aptos"/>
           <w:color w:val="5F5F5F"/>
-          <w:sz w:val="19"/>
+          <w:sz w:val="18"/>
         </w:rPr>
-        <w:t>Updated with Day2 practice questions and browser login practice</w:t>
+        <w:t>Updated with latest Day4 Promise, fetch, and API practice files</w:t>
       </w:r>
     </w:p>
     <w:tbl>
@@ -61,7 +61,7 @@
         </w:tblBorders>
       </w:tblPr>
       <w:tblGrid>
-        <w:gridCol w:w="10166"/>
+        <w:gridCol w:w="10224"/>
       </w:tblGrid>
       <w:tr>
         <w:trPr>
@@ -69,13 +69,13 @@
         </w:trPr>
         <w:tc>
           <w:tcPr>
-            <w:tcW w:type="dxa" w:w="10166"/>
+            <w:tcW w:type="dxa" w:w="10224"/>
             <w:shd w:fill="EAF3FB"/>
             <w:vAlign w:val="center"/>
           </w:tcPr>
           <w:p>
             <w:pPr>
-              <w:spacing w:after="0" w:line="254" w:lineRule="auto"/>
+              <w:spacing w:after="0" w:line="252" w:lineRule="auto"/>
             </w:pPr>
             <w:r/>
             <w:r>
@@ -83,7 +83,7 @@
                 <w:rFonts w:ascii="Aptos" w:hAnsi="Aptos"/>
                 <w:b/>
                 <w:color w:val="1F4E79"/>
-                <w:sz w:val="20"/>
+                <w:sz w:val="19"/>
               </w:rPr>
               <w:t xml:space="preserve">Overall learning summary: </w:t>
             </w:r>
@@ -91,9 +91,9 @@
               <w:rPr>
                 <w:rFonts w:ascii="Aptos" w:hAnsi="Aptos"/>
                 <w:color w:val="222222"/>
-                <w:sz w:val="20"/>
+                <w:sz w:val="19"/>
               </w:rPr>
-              <w:t>I practiced JavaScript fundamentals, then extended them into array-based problem solving and browser interaction. The updated Day2 work includes template literals, arrow functions, filter/map/reduce, random numbers, type conversion, splice, HTML forms, CSS styling, DOM input reading, authentication logic, alerts, and page navigation.</w:t>
+              <w:t>The training now covers JavaScript fundamentals, browser interaction, array problem solving, asynchronous JavaScript, and API consumption. The newest Day4 files add fetch(), JSON response conversion, chained then() processing, API result filtering and mapping, Weatherstack-style API requests, nested response extraction, Fahrenheit conversion, ternary logic, and structured result objects.</w:t>
             </w:r>
           </w:p>
         </w:tc>
@@ -102,7 +102,7 @@
     <w:p>
       <w:pPr>
         <w:pStyle w:val="Heading1"/>
-        <w:spacing w:before="240" w:after="80"/>
+        <w:spacing w:before="220" w:after="80"/>
       </w:pPr>
       <w:r>
         <w:rPr>
@@ -130,10 +130,10 @@
         </w:tblBorders>
       </w:tblPr>
       <w:tblGrid>
-        <w:gridCol w:w="2541"/>
-        <w:gridCol w:w="2541"/>
-        <w:gridCol w:w="2541"/>
-        <w:gridCol w:w="2541"/>
+        <w:gridCol w:w="2556"/>
+        <w:gridCol w:w="2556"/>
+        <w:gridCol w:w="2556"/>
+        <w:gridCol w:w="2556"/>
       </w:tblGrid>
       <w:tr>
         <w:trPr>
@@ -141,13 +141,13 @@
         </w:trPr>
         <w:tc>
           <w:tcPr>
-            <w:tcW w:type="dxa" w:w="1350"/>
+            <w:tcW w:type="dxa" w:w="1250"/>
             <w:shd w:fill="1F4E79"/>
             <w:vAlign w:val="center"/>
           </w:tcPr>
           <w:p>
             <w:pPr>
-              <w:spacing w:after="0" w:line="250" w:lineRule="auto"/>
+              <w:spacing w:after="0" w:line="245" w:lineRule="auto"/>
             </w:pPr>
             <w:r/>
             <w:r>
@@ -155,7 +155,7 @@
                 <w:rFonts w:ascii="Aptos" w:hAnsi="Aptos"/>
                 <w:b/>
                 <w:color w:val="FFFFFF"/>
-                <w:sz w:val="18"/>
+                <w:sz w:val="17"/>
               </w:rPr>
               <w:t>Day / Area</w:t>
             </w:r>
@@ -169,7 +169,7 @@
           </w:tcPr>
           <w:p>
             <w:pPr>
-              <w:spacing w:after="0" w:line="250" w:lineRule="auto"/>
+              <w:spacing w:after="0" w:line="245" w:lineRule="auto"/>
             </w:pPr>
             <w:r/>
             <w:r>
@@ -177,7 +177,7 @@
                 <w:rFonts w:ascii="Aptos" w:hAnsi="Aptos"/>
                 <w:b/>
                 <w:color w:val="FFFFFF"/>
-                <w:sz w:val="18"/>
+                <w:sz w:val="17"/>
               </w:rPr>
               <w:t>Files</w:t>
             </w:r>
@@ -185,13 +185,13 @@
         </w:tc>
         <w:tc>
           <w:tcPr>
-            <w:tcW w:type="dxa" w:w="3200"/>
+            <w:tcW w:type="dxa" w:w="3300"/>
             <w:shd w:fill="1F4E79"/>
             <w:vAlign w:val="center"/>
           </w:tcPr>
           <w:p>
             <w:pPr>
-              <w:spacing w:after="0" w:line="250" w:lineRule="auto"/>
+              <w:spacing w:after="0" w:line="245" w:lineRule="auto"/>
             </w:pPr>
             <w:r/>
             <w:r>
@@ -199,7 +199,7 @@
                 <w:rFonts w:ascii="Aptos" w:hAnsi="Aptos"/>
                 <w:b/>
                 <w:color w:val="FFFFFF"/>
-                <w:sz w:val="18"/>
+                <w:sz w:val="17"/>
               </w:rPr>
               <w:t>Topics learned</w:t>
             </w:r>
@@ -213,7 +213,7 @@
           </w:tcPr>
           <w:p>
             <w:pPr>
-              <w:spacing w:after="0" w:line="250" w:lineRule="auto"/>
+              <w:spacing w:after="0" w:line="245" w:lineRule="auto"/>
             </w:pPr>
             <w:r/>
             <w:r>
@@ -221,7 +221,7 @@
                 <w:rFonts w:ascii="Aptos" w:hAnsi="Aptos"/>
                 <w:b/>
                 <w:color w:val="FFFFFF"/>
-                <w:sz w:val="18"/>
+                <w:sz w:val="17"/>
               </w:rPr>
               <w:t>Practice outcome</w:t>
             </w:r>
@@ -231,12 +231,12 @@
       <w:tr>
         <w:tc>
           <w:tcPr>
-            <w:tcW w:type="dxa" w:w="1350"/>
+            <w:tcW w:type="dxa" w:w="1250"/>
             <w:vAlign w:val="center"/>
           </w:tcPr>
           <w:p>
             <w:pPr>
-              <w:spacing w:after="0" w:line="250" w:lineRule="auto"/>
+              <w:spacing w:after="0" w:line="245" w:lineRule="auto"/>
             </w:pPr>
             <w:r/>
             <w:r>
@@ -244,7 +244,7 @@
                 <w:rFonts w:ascii="Aptos" w:hAnsi="Aptos"/>
                 <w:b/>
                 <w:color w:val="222222"/>
-                <w:sz w:val="17"/>
+                <w:sz w:val="16"/>
               </w:rPr>
               <w:t>Day 1 basics</w:t>
             </w:r>
@@ -257,7 +257,7 @@
           </w:tcPr>
           <w:p>
             <w:pPr>
-              <w:spacing w:after="0" w:line="250" w:lineRule="auto"/>
+              <w:spacing w:after="0" w:line="245" w:lineRule="auto"/>
             </w:pPr>
             <w:r/>
             <w:r>
@@ -265,7 +265,7 @@
                 <w:rFonts w:ascii="Aptos" w:hAnsi="Aptos"/>
                 <w:b w:val="0"/>
                 <w:color w:val="222222"/>
-                <w:sz w:val="17"/>
+                <w:sz w:val="16"/>
               </w:rPr>
               <w:t>index.js</w:t>
               <w:br/>
@@ -281,12 +281,12 @@
         </w:tc>
         <w:tc>
           <w:tcPr>
-            <w:tcW w:type="dxa" w:w="3200"/>
+            <w:tcW w:type="dxa" w:w="3300"/>
             <w:vAlign w:val="center"/>
           </w:tcPr>
           <w:p>
             <w:pPr>
-              <w:spacing w:after="0" w:line="250" w:lineRule="auto"/>
+              <w:spacing w:after="0" w:line="245" w:lineRule="auto"/>
             </w:pPr>
             <w:r/>
             <w:r>
@@ -294,7 +294,7 @@
                 <w:rFonts w:ascii="Aptos" w:hAnsi="Aptos"/>
                 <w:b w:val="0"/>
                 <w:color w:val="222222"/>
-                <w:sz w:val="17"/>
+                <w:sz w:val="16"/>
               </w:rPr>
               <w:t>Variables, strings, operators, conditions, type checking, value swapping, simple DOM input</w:t>
             </w:r>
@@ -307,7 +307,7 @@
           </w:tcPr>
           <w:p>
             <w:pPr>
-              <w:spacing w:after="0" w:line="250" w:lineRule="auto"/>
+              <w:spacing w:after="0" w:line="245" w:lineRule="auto"/>
             </w:pPr>
             <w:r/>
             <w:r>
@@ -315,9 +315,9 @@
                 <w:rFonts w:ascii="Aptos" w:hAnsi="Aptos"/>
                 <w:b w:val="0"/>
                 <w:color w:val="222222"/>
-                <w:sz w:val="17"/>
+                <w:sz w:val="16"/>
               </w:rPr>
-              <w:t>Built comfort with JavaScript syntax, console output, comparisons, branching, typeof checks, and reading an input box from HTML.</w:t>
+              <w:t>Built comfort with syntax, console output, comparisons, branching, typeof checks, and reading input from HTML.</w:t>
             </w:r>
           </w:p>
         </w:tc>
@@ -325,13 +325,13 @@
       <w:tr>
         <w:tc>
           <w:tcPr>
-            <w:tcW w:type="dxa" w:w="1350"/>
+            <w:tcW w:type="dxa" w:w="1250"/>
             <w:vAlign w:val="center"/>
             <w:shd w:fill="F8FAFD"/>
           </w:tcPr>
           <w:p>
             <w:pPr>
-              <w:spacing w:after="0" w:line="250" w:lineRule="auto"/>
+              <w:spacing w:after="0" w:line="245" w:lineRule="auto"/>
             </w:pPr>
             <w:r/>
             <w:r>
@@ -339,7 +339,7 @@
                 <w:rFonts w:ascii="Aptos" w:hAnsi="Aptos"/>
                 <w:b/>
                 <w:color w:val="222222"/>
-                <w:sz w:val="17"/>
+                <w:sz w:val="16"/>
               </w:rPr>
               <w:t>Day 2 core JS</w:t>
             </w:r>
@@ -353,7 +353,7 @@
           </w:tcPr>
           <w:p>
             <w:pPr>
-              <w:spacing w:after="0" w:line="250" w:lineRule="auto"/>
+              <w:spacing w:after="0" w:line="245" w:lineRule="auto"/>
             </w:pPr>
             <w:r/>
             <w:r>
@@ -361,7 +361,7 @@
                 <w:rFonts w:ascii="Aptos" w:hAnsi="Aptos"/>
                 <w:b w:val="0"/>
                 <w:color w:val="222222"/>
-                <w:sz w:val="17"/>
+                <w:sz w:val="16"/>
               </w:rPr>
               <w:t>index.js</w:t>
             </w:r>
@@ -369,13 +369,13 @@
         </w:tc>
         <w:tc>
           <w:tcPr>
-            <w:tcW w:type="dxa" w:w="3200"/>
+            <w:tcW w:type="dxa" w:w="3300"/>
             <w:vAlign w:val="center"/>
             <w:shd w:fill="F8FAFD"/>
           </w:tcPr>
           <w:p>
             <w:pPr>
-              <w:spacing w:after="0" w:line="250" w:lineRule="auto"/>
+              <w:spacing w:after="0" w:line="245" w:lineRule="auto"/>
             </w:pPr>
             <w:r/>
             <w:r>
@@ -383,7 +383,7 @@
                 <w:rFonts w:ascii="Aptos" w:hAnsi="Aptos"/>
                 <w:b w:val="0"/>
                 <w:color w:val="222222"/>
-                <w:sz w:val="17"/>
+                <w:sz w:val="16"/>
               </w:rPr>
               <w:t>Template literals, functions, arrow functions, filter-map-forEach, Math.random, Math.floor, conversions, array methods</w:t>
             </w:r>
@@ -397,7 +397,7 @@
           </w:tcPr>
           <w:p>
             <w:pPr>
-              <w:spacing w:after="0" w:line="250" w:lineRule="auto"/>
+              <w:spacing w:after="0" w:line="245" w:lineRule="auto"/>
             </w:pPr>
             <w:r/>
             <w:r>
@@ -405,9 +405,9 @@
                 <w:rFonts w:ascii="Aptos" w:hAnsi="Aptos"/>
                 <w:b w:val="0"/>
                 <w:color w:val="222222"/>
-                <w:sz w:val="17"/>
+                <w:sz w:val="16"/>
               </w:rPr>
-              <w:t>Practiced reusable functions, array pipelines, random values, number/string conversion, and array add/remove/search operations.</w:t>
+              <w:t>Practiced functions, array pipelines, random values, number/string conversion, and array add/remove/search operations.</w:t>
             </w:r>
           </w:p>
         </w:tc>
@@ -415,12 +415,12 @@
       <w:tr>
         <w:tc>
           <w:tcPr>
-            <w:tcW w:type="dxa" w:w="1350"/>
+            <w:tcW w:type="dxa" w:w="1250"/>
             <w:vAlign w:val="center"/>
           </w:tcPr>
           <w:p>
             <w:pPr>
-              <w:spacing w:after="0" w:line="250" w:lineRule="auto"/>
+              <w:spacing w:after="0" w:line="245" w:lineRule="auto"/>
             </w:pPr>
             <w:r/>
             <w:r>
@@ -428,7 +428,7 @@
                 <w:rFonts w:ascii="Aptos" w:hAnsi="Aptos"/>
                 <w:b/>
                 <w:color w:val="222222"/>
-                <w:sz w:val="17"/>
+                <w:sz w:val="16"/>
               </w:rPr>
               <w:t>Day 2 questions</w:t>
             </w:r>
@@ -441,7 +441,7 @@
           </w:tcPr>
           <w:p>
             <w:pPr>
-              <w:spacing w:after="0" w:line="250" w:lineRule="auto"/>
+              <w:spacing w:after="0" w:line="245" w:lineRule="auto"/>
             </w:pPr>
             <w:r/>
             <w:r>
@@ -449,7 +449,7 @@
                 <w:rFonts w:ascii="Aptos" w:hAnsi="Aptos"/>
                 <w:b w:val="0"/>
                 <w:color w:val="222222"/>
-                <w:sz w:val="17"/>
+                <w:sz w:val="16"/>
               </w:rPr>
               <w:t>q1.js</w:t>
               <w:br/>
@@ -461,12 +461,12 @@
         </w:tc>
         <w:tc>
           <w:tcPr>
-            <w:tcW w:type="dxa" w:w="3200"/>
+            <w:tcW w:type="dxa" w:w="3300"/>
             <w:vAlign w:val="center"/>
           </w:tcPr>
           <w:p>
             <w:pPr>
-              <w:spacing w:after="0" w:line="250" w:lineRule="auto"/>
+              <w:spacing w:after="0" w:line="245" w:lineRule="auto"/>
             </w:pPr>
             <w:r/>
             <w:r>
@@ -474,7 +474,7 @@
                 <w:rFonts w:ascii="Aptos" w:hAnsi="Aptos"/>
                 <w:b w:val="0"/>
                 <w:color w:val="222222"/>
-                <w:sz w:val="17"/>
+                <w:sz w:val="16"/>
               </w:rPr>
               <w:t>slice, map, join, chained filter, random threshold, splice, Number, reduce, template literal output</w:t>
             </w:r>
@@ -487,7 +487,7 @@
           </w:tcPr>
           <w:p>
             <w:pPr>
-              <w:spacing w:after="0" w:line="250" w:lineRule="auto"/>
+              <w:spacing w:after="0" w:line="245" w:lineRule="auto"/>
             </w:pPr>
             <w:r/>
             <w:r>
@@ -495,9 +495,9 @@
                 <w:rFonts w:ascii="Aptos" w:hAnsi="Aptos"/>
                 <w:b w:val="0"/>
                 <w:color w:val="222222"/>
-                <w:sz w:val="17"/>
+                <w:sz w:val="16"/>
               </w:rPr>
-              <w:t>Solved small problems: guest formatting, high-number filtering, and total price calculation.</w:t>
+              <w:t>Solved guest formatting, high-number filtering, and total price calculation problems.</w:t>
             </w:r>
           </w:p>
         </w:tc>
@@ -505,13 +505,13 @@
       <w:tr>
         <w:tc>
           <w:tcPr>
-            <w:tcW w:type="dxa" w:w="1350"/>
+            <w:tcW w:type="dxa" w:w="1250"/>
             <w:vAlign w:val="center"/>
             <w:shd w:fill="F8FAFD"/>
           </w:tcPr>
           <w:p>
             <w:pPr>
-              <w:spacing w:after="0" w:line="250" w:lineRule="auto"/>
+              <w:spacing w:after="0" w:line="245" w:lineRule="auto"/>
             </w:pPr>
             <w:r/>
             <w:r>
@@ -519,7 +519,7 @@
                 <w:rFonts w:ascii="Aptos" w:hAnsi="Aptos"/>
                 <w:b/>
                 <w:color w:val="222222"/>
-                <w:sz w:val="17"/>
+                <w:sz w:val="16"/>
               </w:rPr>
               <w:t>Day 2 web practice</w:t>
             </w:r>
@@ -533,7 +533,7 @@
           </w:tcPr>
           <w:p>
             <w:pPr>
-              <w:spacing w:after="0" w:line="250" w:lineRule="auto"/>
+              <w:spacing w:after="0" w:line="245" w:lineRule="auto"/>
             </w:pPr>
             <w:r/>
             <w:r>
@@ -541,7 +541,7 @@
                 <w:rFonts w:ascii="Aptos" w:hAnsi="Aptos"/>
                 <w:b w:val="0"/>
                 <w:color w:val="222222"/>
-                <w:sz w:val="17"/>
+                <w:sz w:val="16"/>
               </w:rPr>
               <w:t>login.html</w:t>
               <w:br/>
@@ -555,13 +555,13 @@
         </w:tc>
         <w:tc>
           <w:tcPr>
-            <w:tcW w:type="dxa" w:w="3200"/>
+            <w:tcW w:type="dxa" w:w="3300"/>
             <w:vAlign w:val="center"/>
             <w:shd w:fill="F8FAFD"/>
           </w:tcPr>
           <w:p>
             <w:pPr>
-              <w:spacing w:after="0" w:line="250" w:lineRule="auto"/>
+              <w:spacing w:after="0" w:line="245" w:lineRule="auto"/>
             </w:pPr>
             <w:r/>
             <w:r>
@@ -569,9 +569,9 @@
                 <w:rFonts w:ascii="Aptos" w:hAnsi="Aptos"/>
                 <w:b w:val="0"/>
                 <w:color w:val="222222"/>
-                <w:sz w:val="17"/>
+                <w:sz w:val="16"/>
               </w:rPr>
-              <w:t>HTML forms, external CSS/JS, DOM value reading, authentication condition, alerts, navigation links, window.location.href</w:t>
+              <w:t>HTML forms, external CSS/JS, DOM value reading, authentication condition, alerts, links, window.location.href</w:t>
             </w:r>
           </w:p>
         </w:tc>
@@ -583,7 +583,7 @@
           </w:tcPr>
           <w:p>
             <w:pPr>
-              <w:spacing w:after="0" w:line="250" w:lineRule="auto"/>
+              <w:spacing w:after="0" w:line="245" w:lineRule="auto"/>
             </w:pPr>
             <w:r/>
             <w:r>
@@ -591,9 +591,273 @@
                 <w:rFonts w:ascii="Aptos" w:hAnsi="Aptos"/>
                 <w:b w:val="0"/>
                 <w:color w:val="222222"/>
-                <w:sz w:val="17"/>
+                <w:sz w:val="16"/>
               </w:rPr>
               <w:t>Created a basic login screen and connected HTML, CSS, and JavaScript for browser interaction.</w:t>
+            </w:r>
+          </w:p>
+        </w:tc>
+      </w:tr>
+      <w:tr>
+        <w:tc>
+          <w:tcPr>
+            <w:tcW w:type="dxa" w:w="1250"/>
+            <w:vAlign w:val="center"/>
+          </w:tcPr>
+          <w:p>
+            <w:pPr>
+              <w:spacing w:after="0" w:line="245" w:lineRule="auto"/>
+            </w:pPr>
+            <w:r/>
+            <w:r>
+              <w:rPr>
+                <w:rFonts w:ascii="Aptos" w:hAnsi="Aptos"/>
+                <w:b/>
+                <w:color w:val="222222"/>
+                <w:sz w:val="16"/>
+              </w:rPr>
+              <w:t>Day 3 arrays</w:t>
+            </w:r>
+          </w:p>
+        </w:tc>
+        <w:tc>
+          <w:tcPr>
+            <w:tcW w:type="dxa" w:w="2050"/>
+            <w:vAlign w:val="center"/>
+          </w:tcPr>
+          <w:p>
+            <w:pPr>
+              <w:spacing w:after="0" w:line="245" w:lineRule="auto"/>
+            </w:pPr>
+            <w:r/>
+            <w:r>
+              <w:rPr>
+                <w:rFonts w:ascii="Aptos" w:hAnsi="Aptos"/>
+                <w:b w:val="0"/>
+                <w:color w:val="222222"/>
+                <w:sz w:val="16"/>
+              </w:rPr>
+              <w:t>questions.js</w:t>
+            </w:r>
+          </w:p>
+        </w:tc>
+        <w:tc>
+          <w:tcPr>
+            <w:tcW w:type="dxa" w:w="3300"/>
+            <w:vAlign w:val="center"/>
+          </w:tcPr>
+          <w:p>
+            <w:pPr>
+              <w:spacing w:after="0" w:line="245" w:lineRule="auto"/>
+            </w:pPr>
+            <w:r/>
+            <w:r>
+              <w:rPr>
+                <w:rFonts w:ascii="Aptos" w:hAnsi="Aptos"/>
+                <w:b w:val="0"/>
+                <w:color w:val="222222"/>
+                <w:sz w:val="16"/>
+              </w:rPr>
+              <w:t>forEach, map, filter, reduce, object arrays, chaining, concat, average calculation, flattening without flat()</w:t>
+            </w:r>
+          </w:p>
+        </w:tc>
+        <w:tc>
+          <w:tcPr>
+            <w:tcW w:type="dxa" w:w="3000"/>
+            <w:vAlign w:val="center"/>
+          </w:tcPr>
+          <w:p>
+            <w:pPr>
+              <w:spacing w:after="0" w:line="245" w:lineRule="auto"/>
+            </w:pPr>
+            <w:r/>
+            <w:r>
+              <w:rPr>
+                <w:rFonts w:ascii="Aptos" w:hAnsi="Aptos"/>
+                <w:b w:val="0"/>
+                <w:color w:val="222222"/>
+                <w:sz w:val="16"/>
+              </w:rPr>
+              <w:t>Solved 10 practice questions across warm-up, filtering, reduce, transformation, extraction, and logic challenges.</w:t>
+            </w:r>
+          </w:p>
+        </w:tc>
+      </w:tr>
+      <w:tr>
+        <w:tc>
+          <w:tcPr>
+            <w:tcW w:type="dxa" w:w="1250"/>
+            <w:vAlign w:val="center"/>
+            <w:shd w:fill="F8FAFD"/>
+          </w:tcPr>
+          <w:p>
+            <w:pPr>
+              <w:spacing w:after="0" w:line="245" w:lineRule="auto"/>
+            </w:pPr>
+            <w:r/>
+            <w:r>
+              <w:rPr>
+                <w:rFonts w:ascii="Aptos" w:hAnsi="Aptos"/>
+                <w:b/>
+                <w:color w:val="222222"/>
+                <w:sz w:val="16"/>
+              </w:rPr>
+              <w:t>Day 4 async</w:t>
+            </w:r>
+          </w:p>
+        </w:tc>
+        <w:tc>
+          <w:tcPr>
+            <w:tcW w:type="dxa" w:w="2050"/>
+            <w:vAlign w:val="center"/>
+            <w:shd w:fill="F8FAFD"/>
+          </w:tcPr>
+          <w:p>
+            <w:pPr>
+              <w:spacing w:after="0" w:line="245" w:lineRule="auto"/>
+            </w:pPr>
+            <w:r/>
+            <w:r>
+              <w:rPr>
+                <w:rFonts w:ascii="Aptos" w:hAnsi="Aptos"/>
+                <w:b w:val="0"/>
+                <w:color w:val="222222"/>
+                <w:sz w:val="16"/>
+              </w:rPr>
+              <w:t>index.js</w:t>
+              <w:br/>
+              <w:t>promise.js</w:t>
+            </w:r>
+          </w:p>
+        </w:tc>
+        <w:tc>
+          <w:tcPr>
+            <w:tcW w:type="dxa" w:w="3300"/>
+            <w:vAlign w:val="center"/>
+            <w:shd w:fill="F8FAFD"/>
+          </w:tcPr>
+          <w:p>
+            <w:pPr>
+              <w:spacing w:after="0" w:line="245" w:lineRule="auto"/>
+            </w:pPr>
+            <w:r/>
+            <w:r>
+              <w:rPr>
+                <w:rFonts w:ascii="Aptos" w:hAnsi="Aptos"/>
+                <w:b w:val="0"/>
+                <w:color w:val="222222"/>
+                <w:sz w:val="16"/>
+              </w:rPr>
+              <w:t>Promise, resolve, reject, then, catch, conditional rejection, asynchronous delay, setTimeout, setInterval, fetch, JSON parsing</w:t>
+            </w:r>
+          </w:p>
+        </w:tc>
+        <w:tc>
+          <w:tcPr>
+            <w:tcW w:type="dxa" w:w="3000"/>
+            <w:vAlign w:val="center"/>
+            <w:shd w:fill="F8FAFD"/>
+          </w:tcPr>
+          <w:p>
+            <w:pPr>
+              <w:spacing w:after="0" w:line="245" w:lineRule="auto"/>
+            </w:pPr>
+            <w:r/>
+            <w:r>
+              <w:rPr>
+                <w:rFonts w:ascii="Aptos" w:hAnsi="Aptos"/>
+                <w:b w:val="0"/>
+                <w:color w:val="222222"/>
+                <w:sz w:val="16"/>
+              </w:rPr>
+              <w:t>Practiced async flow, rejection handling, chained API calls, filtering API data, mapping API titles, delayed output, and repeated checking.</w:t>
+            </w:r>
+          </w:p>
+        </w:tc>
+      </w:tr>
+      <w:tr>
+        <w:tc>
+          <w:tcPr>
+            <w:tcW w:type="dxa" w:w="1250"/>
+            <w:vAlign w:val="center"/>
+          </w:tcPr>
+          <w:p>
+            <w:pPr>
+              <w:spacing w:after="0" w:line="245" w:lineRule="auto"/>
+            </w:pPr>
+            <w:r/>
+            <w:r>
+              <w:rPr>
+                <w:rFonts w:ascii="Aptos" w:hAnsi="Aptos"/>
+                <w:b/>
+                <w:color w:val="222222"/>
+                <w:sz w:val="16"/>
+              </w:rPr>
+              <w:t>Day 4 API</w:t>
+            </w:r>
+          </w:p>
+        </w:tc>
+        <w:tc>
+          <w:tcPr>
+            <w:tcW w:type="dxa" w:w="2050"/>
+            <w:vAlign w:val="center"/>
+          </w:tcPr>
+          <w:p>
+            <w:pPr>
+              <w:spacing w:after="0" w:line="245" w:lineRule="auto"/>
+            </w:pPr>
+            <w:r/>
+            <w:r>
+              <w:rPr>
+                <w:rFonts w:ascii="Aptos" w:hAnsi="Aptos"/>
+                <w:b w:val="0"/>
+                <w:color w:val="222222"/>
+                <w:sz w:val="16"/>
+              </w:rPr>
+              <w:t>api.js</w:t>
+            </w:r>
+          </w:p>
+        </w:tc>
+        <w:tc>
+          <w:tcPr>
+            <w:tcW w:type="dxa" w:w="3300"/>
+            <w:vAlign w:val="center"/>
+          </w:tcPr>
+          <w:p>
+            <w:pPr>
+              <w:spacing w:after="0" w:line="245" w:lineRule="auto"/>
+            </w:pPr>
+            <w:r/>
+            <w:r>
+              <w:rPr>
+                <w:rFonts w:ascii="Aptos" w:hAnsi="Aptos"/>
+                <w:b w:val="0"/>
+                <w:color w:val="222222"/>
+                <w:sz w:val="16"/>
+              </w:rPr>
+              <w:t>API key placeholder, template literal URL, Weatherstack request, response object access, Fahrenheit conversion, ternary operator, structured result object</w:t>
+            </w:r>
+          </w:p>
+        </w:tc>
+        <w:tc>
+          <w:tcPr>
+            <w:tcW w:type="dxa" w:w="3000"/>
+            <w:vAlign w:val="center"/>
+          </w:tcPr>
+          <w:p>
+            <w:pPr>
+              <w:spacing w:after="0" w:line="245" w:lineRule="auto"/>
+            </w:pPr>
+            <w:r/>
+            <w:r>
+              <w:rPr>
+                <w:rFonts w:ascii="Aptos" w:hAnsi="Aptos"/>
+                <w:b w:val="0"/>
+                <w:color w:val="222222"/>
+                <w:sz w:val="16"/>
+              </w:rPr>
+              <w:t>Practiced calling a weather API, reading nested response fields, transforming weather data, and handling API errors.</w:t>
             </w:r>
           </w:p>
         </w:tc>
@@ -602,7 +866,7 @@
     <w:p>
       <w:pPr>
         <w:pStyle w:val="Heading1"/>
-        <w:spacing w:before="240" w:after="80"/>
+        <w:spacing w:before="220" w:after="80"/>
       </w:pPr>
       <w:r>
         <w:rPr>
@@ -616,7 +880,7 @@
     </w:p>
     <w:p>
       <w:pPr>
-        <w:spacing w:after="100" w:line="259" w:lineRule="auto"/>
+        <w:spacing w:after="100" w:line="254" w:lineRule="auto"/>
       </w:pPr>
       <w:r>
         <w:rPr>
@@ -624,27 +888,27 @@
           <w:color w:val="222222"/>
           <w:sz w:val="20"/>
         </w:rPr>
-        <w:t>Day 1 focused on the foundation of JavaScript and the first connection between HTML and JavaScript. The practice code showed how values are stored, printed, compared, checked, and changed.</w:t>
+        <w:t>Day 1 focused on JavaScript foundations and the first connection between HTML and JavaScript. The code showed how values are stored, printed, compared, checked, and changed.</w:t>
       </w:r>
     </w:p>
     <w:p>
       <w:pPr>
         <w:pStyle w:val="Heading2"/>
-        <w:spacing w:before="140" w:after="80"/>
+        <w:spacing w:before="120" w:after="80"/>
       </w:pPr>
       <w:r>
         <w:rPr>
           <w:rFonts w:ascii="Aptos" w:hAnsi="Aptos"/>
           <w:b/>
           <w:color w:val="1F4E79"/>
-          <w:sz w:val="25"/>
+          <w:sz w:val="24"/>
         </w:rPr>
         <w:t>Day 1 Topics Practiced</w:t>
       </w:r>
     </w:p>
     <w:p>
       <w:pPr>
-        <w:spacing w:after="44" w:line="250" w:lineRule="auto"/>
+        <w:spacing w:after="32" w:line="245" w:lineRule="auto"/>
         <w:ind w:left="317" w:hanging="230"/>
       </w:pPr>
       <w:r>
@@ -652,22 +916,22 @@
           <w:rFonts w:ascii="Aptos" w:hAnsi="Aptos"/>
           <w:b/>
           <w:color w:val="1F4E79"/>
-          <w:sz w:val="20"/>
+          <w:sz w:val="19"/>
         </w:rPr>
-        <w:t xml:space="preserve">• </w:t>
+        <w:t xml:space="preserve">- </w:t>
       </w:r>
       <w:r>
         <w:rPr>
           <w:rFonts w:ascii="Aptos" w:hAnsi="Aptos"/>
           <w:color w:val="222222"/>
-          <w:sz w:val="20"/>
+          <w:sz w:val="19"/>
         </w:rPr>
         <w:t>Variables with let for storing numbers and strings.</w:t>
       </w:r>
     </w:p>
     <w:p>
       <w:pPr>
-        <w:spacing w:after="44" w:line="250" w:lineRule="auto"/>
+        <w:spacing w:after="32" w:line="245" w:lineRule="auto"/>
         <w:ind w:left="317" w:hanging="230"/>
       </w:pPr>
       <w:r>
@@ -675,22 +939,22 @@
           <w:rFonts w:ascii="Aptos" w:hAnsi="Aptos"/>
           <w:b/>
           <w:color w:val="1F4E79"/>
-          <w:sz w:val="20"/>
+          <w:sz w:val="19"/>
         </w:rPr>
-        <w:t xml:space="preserve">• </w:t>
+        <w:t xml:space="preserve">- </w:t>
       </w:r>
       <w:r>
         <w:rPr>
           <w:rFonts w:ascii="Aptos" w:hAnsi="Aptos"/>
           <w:color w:val="222222"/>
-          <w:sz w:val="20"/>
+          <w:sz w:val="19"/>
         </w:rPr>
         <w:t>String methods and properties such as length, toUpperCase(), toLowerCase(), and substring().</w:t>
       </w:r>
     </w:p>
     <w:p>
       <w:pPr>
-        <w:spacing w:after="44" w:line="250" w:lineRule="auto"/>
+        <w:spacing w:after="32" w:line="245" w:lineRule="auto"/>
         <w:ind w:left="317" w:hanging="230"/>
       </w:pPr>
       <w:r>
@@ -698,22 +962,22 @@
           <w:rFonts w:ascii="Aptos" w:hAnsi="Aptos"/>
           <w:b/>
           <w:color w:val="1F4E79"/>
-          <w:sz w:val="20"/>
+          <w:sz w:val="19"/>
         </w:rPr>
-        <w:t xml:space="preserve">• </w:t>
+        <w:t xml:space="preserve">- </w:t>
       </w:r>
       <w:r>
         <w:rPr>
           <w:rFonts w:ascii="Aptos" w:hAnsi="Aptos"/>
           <w:color w:val="222222"/>
-          <w:sz w:val="20"/>
+          <w:sz w:val="19"/>
         </w:rPr>
-        <w:t>Arithmetic operators: +, -, *, /, and %.</w:t>
+        <w:t>Arithmetic and comparison operators for calculations and boolean results.</w:t>
       </w:r>
     </w:p>
     <w:p>
       <w:pPr>
-        <w:spacing w:after="44" w:line="250" w:lineRule="auto"/>
+        <w:spacing w:after="32" w:line="245" w:lineRule="auto"/>
         <w:ind w:left="317" w:hanging="230"/>
       </w:pPr>
       <w:r>
@@ -721,22 +985,22 @@
           <w:rFonts w:ascii="Aptos" w:hAnsi="Aptos"/>
           <w:b/>
           <w:color w:val="1F4E79"/>
-          <w:sz w:val="20"/>
+          <w:sz w:val="19"/>
         </w:rPr>
-        <w:t xml:space="preserve">• </w:t>
+        <w:t xml:space="preserve">- </w:t>
       </w:r>
       <w:r>
         <w:rPr>
           <w:rFonts w:ascii="Aptos" w:hAnsi="Aptos"/>
           <w:color w:val="222222"/>
-          <w:sz w:val="20"/>
+          <w:sz w:val="19"/>
         </w:rPr>
-        <w:t>Comparison operators: &gt;, &lt;, ==, !=, &gt;=, and &lt;=.</w:t>
+        <w:t>Conditional flow using if-else and switch-case.</w:t>
       </w:r>
     </w:p>
     <w:p>
       <w:pPr>
-        <w:spacing w:after="44" w:line="250" w:lineRule="auto"/>
+        <w:spacing w:after="32" w:line="245" w:lineRule="auto"/>
         <w:ind w:left="317" w:hanging="230"/>
       </w:pPr>
       <w:r>
@@ -744,22 +1008,22 @@
           <w:rFonts w:ascii="Aptos" w:hAnsi="Aptos"/>
           <w:b/>
           <w:color w:val="1F4E79"/>
-          <w:sz w:val="20"/>
+          <w:sz w:val="19"/>
         </w:rPr>
-        <w:t xml:space="preserve">• </w:t>
+        <w:t xml:space="preserve">- </w:t>
       </w:r>
       <w:r>
         <w:rPr>
           <w:rFonts w:ascii="Aptos" w:hAnsi="Aptos"/>
           <w:color w:val="222222"/>
-          <w:sz w:val="20"/>
+          <w:sz w:val="19"/>
         </w:rPr>
-        <w:t>Conditional flow using if-else and switch-case.</w:t>
+        <w:t>Type checking with typeof inside a checkType() function.</w:t>
       </w:r>
     </w:p>
     <w:p>
       <w:pPr>
-        <w:spacing w:after="44" w:line="250" w:lineRule="auto"/>
+        <w:spacing w:after="32" w:line="245" w:lineRule="auto"/>
         <w:ind w:left="317" w:hanging="230"/>
       </w:pPr>
       <w:r>
@@ -767,22 +1031,22 @@
           <w:rFonts w:ascii="Aptos" w:hAnsi="Aptos"/>
           <w:b/>
           <w:color w:val="1F4E79"/>
-          <w:sz w:val="20"/>
+          <w:sz w:val="19"/>
         </w:rPr>
-        <w:t xml:space="preserve">• </w:t>
+        <w:t xml:space="preserve">- </w:t>
       </w:r>
       <w:r>
         <w:rPr>
           <w:rFonts w:ascii="Aptos" w:hAnsi="Aptos"/>
           <w:color w:val="222222"/>
-          <w:sz w:val="20"/>
+          <w:sz w:val="19"/>
         </w:rPr>
-        <w:t>Type checking with typeof inside a checkType() function.</w:t>
+        <w:t>Swapping values using a temporary variable.</w:t>
       </w:r>
     </w:p>
     <w:p>
       <w:pPr>
-        <w:spacing w:after="44" w:line="250" w:lineRule="auto"/>
+        <w:spacing w:after="32" w:line="245" w:lineRule="auto"/>
         <w:ind w:left="317" w:hanging="230"/>
       </w:pPr>
       <w:r>
@@ -790,22 +1054,65 @@
           <w:rFonts w:ascii="Aptos" w:hAnsi="Aptos"/>
           <w:b/>
           <w:color w:val="1F4E79"/>
-          <w:sz w:val="20"/>
+          <w:sz w:val="19"/>
         </w:rPr>
-        <w:t xml:space="preserve">• </w:t>
+        <w:t xml:space="preserve">- </w:t>
       </w:r>
+      <w:r>
+        <w:rPr>
+          <w:rFonts w:ascii="Aptos" w:hAnsi="Aptos"/>
+          <w:color w:val="222222"/>
+          <w:sz w:val="19"/>
+        </w:rPr>
+        <w:t>Simple HTML input handling with getElementById(), reading .value, printing it, and clearing the input box.</w:t>
+      </w:r>
+    </w:p>
+    <w:p>
+      <w:pPr>
+        <w:pStyle w:val="Heading1"/>
+        <w:spacing w:before="220" w:after="80"/>
+      </w:pPr>
+      <w:r>
+        <w:rPr>
+          <w:rFonts w:ascii="Aptos" w:hAnsi="Aptos"/>
+          <w:b/>
+          <w:color w:val="1F4E79"/>
+          <w:sz w:val="32"/>
+        </w:rPr>
+        <w:t>Day 2 Synopsis</w:t>
+      </w:r>
+    </w:p>
+    <w:p>
+      <w:pPr>
+        <w:spacing w:after="100" w:line="254" w:lineRule="auto"/>
+      </w:pPr>
       <w:r>
         <w:rPr>
           <w:rFonts w:ascii="Aptos" w:hAnsi="Aptos"/>
           <w:color w:val="222222"/>
           <w:sz w:val="20"/>
         </w:rPr>
-        <w:t>Swapping values using a temporary variable.</w:t>
+        <w:t>Day 2 expanded the basics into modern syntax, array operations, and browser practice. It included template literals, arrow functions, array pipelines, Math methods, type conversion, array mutation, and a basic login flow.</w:t>
       </w:r>
     </w:p>
     <w:p>
       <w:pPr>
-        <w:spacing w:after="44" w:line="250" w:lineRule="auto"/>
+        <w:pStyle w:val="Heading2"/>
+        <w:spacing w:before="120" w:after="80"/>
+      </w:pPr>
+      <w:r>
+        <w:rPr>
+          <w:rFonts w:ascii="Aptos" w:hAnsi="Aptos"/>
+          <w:b/>
+          <w:color w:val="1F4E79"/>
+          <w:sz w:val="24"/>
+        </w:rPr>
+        <w:t>Day 2 Topics Practiced</w:t>
+      </w:r>
+    </w:p>
+    <w:p>
+      <w:pPr>
+        <w:spacing w:after="32" w:line="245" w:lineRule="auto"/>
         <w:ind w:left="317" w:hanging="230"/>
       </w:pPr>
       <w:r>
@@ -813,17 +1120,178 @@
           <w:rFonts w:ascii="Aptos" w:hAnsi="Aptos"/>
           <w:b/>
           <w:color w:val="1F4E79"/>
-          <w:sz w:val="20"/>
+          <w:sz w:val="19"/>
         </w:rPr>
-        <w:t xml:space="preserve">• </w:t>
+        <w:t xml:space="preserve">- </w:t>
       </w:r>
       <w:r>
         <w:rPr>
           <w:rFonts w:ascii="Aptos" w:hAnsi="Aptos"/>
           <w:color w:val="222222"/>
-          <w:sz w:val="20"/>
+          <w:sz w:val="19"/>
         </w:rPr>
-        <w:t>Simple HTML input handling with getElementById(), reading .value, printing it, and clearing the input box.</w:t>
+        <w:t>Template literals using backticks and ${} placeholders.</w:t>
+      </w:r>
+    </w:p>
+    <w:p>
+      <w:pPr>
+        <w:spacing w:after="32" w:line="245" w:lineRule="auto"/>
+        <w:ind w:left="317" w:hanging="230"/>
+      </w:pPr>
+      <w:r>
+        <w:rPr>
+          <w:rFonts w:ascii="Aptos" w:hAnsi="Aptos"/>
+          <w:b/>
+          <w:color w:val="1F4E79"/>
+          <w:sz w:val="19"/>
+        </w:rPr>
+        <w:t xml:space="preserve">- </w:t>
+      </w:r>
+      <w:r>
+        <w:rPr>
+          <w:rFonts w:ascii="Aptos" w:hAnsi="Aptos"/>
+          <w:color w:val="222222"/>
+          <w:sz w:val="19"/>
+        </w:rPr>
+        <w:t>A multiplication table function that returns multi-line text.</w:t>
+      </w:r>
+    </w:p>
+    <w:p>
+      <w:pPr>
+        <w:spacing w:after="32" w:line="245" w:lineRule="auto"/>
+        <w:ind w:left="317" w:hanging="230"/>
+      </w:pPr>
+      <w:r>
+        <w:rPr>
+          <w:rFonts w:ascii="Aptos" w:hAnsi="Aptos"/>
+          <w:b/>
+          <w:color w:val="1F4E79"/>
+          <w:sz w:val="19"/>
+        </w:rPr>
+        <w:t xml:space="preserve">- </w:t>
+      </w:r>
+      <w:r>
+        <w:rPr>
+          <w:rFonts w:ascii="Aptos" w:hAnsi="Aptos"/>
+          <w:color w:val="222222"/>
+          <w:sz w:val="19"/>
+        </w:rPr>
+        <w:t>Arrow functions and array pipelines with filter(), map(), and forEach().</w:t>
+      </w:r>
+    </w:p>
+    <w:p>
+      <w:pPr>
+        <w:spacing w:after="32" w:line="245" w:lineRule="auto"/>
+        <w:ind w:left="317" w:hanging="230"/>
+      </w:pPr>
+      <w:r>
+        <w:rPr>
+          <w:rFonts w:ascii="Aptos" w:hAnsi="Aptos"/>
+          <w:b/>
+          <w:color w:val="1F4E79"/>
+          <w:sz w:val="19"/>
+        </w:rPr>
+        <w:t xml:space="preserve">- </w:t>
+      </w:r>
+      <w:r>
+        <w:rPr>
+          <w:rFonts w:ascii="Aptos" w:hAnsi="Aptos"/>
+          <w:color w:val="222222"/>
+          <w:sz w:val="19"/>
+        </w:rPr>
+        <w:t>Random number generation with Math.random() and Math.floor().</w:t>
+      </w:r>
+    </w:p>
+    <w:p>
+      <w:pPr>
+        <w:spacing w:after="32" w:line="245" w:lineRule="auto"/>
+        <w:ind w:left="317" w:hanging="230"/>
+      </w:pPr>
+      <w:r>
+        <w:rPr>
+          <w:rFonts w:ascii="Aptos" w:hAnsi="Aptos"/>
+          <w:b/>
+          <w:color w:val="1F4E79"/>
+          <w:sz w:val="19"/>
+        </w:rPr>
+        <w:t xml:space="preserve">- </w:t>
+      </w:r>
+      <w:r>
+        <w:rPr>
+          <w:rFonts w:ascii="Aptos" w:hAnsi="Aptos"/>
+          <w:color w:val="222222"/>
+          <w:sz w:val="19"/>
+        </w:rPr>
+        <w:t>Type conversion with Number(), String(), parseInt(), and parseFloat().</w:t>
+      </w:r>
+    </w:p>
+    <w:p>
+      <w:pPr>
+        <w:spacing w:after="32" w:line="245" w:lineRule="auto"/>
+        <w:ind w:left="317" w:hanging="230"/>
+      </w:pPr>
+      <w:r>
+        <w:rPr>
+          <w:rFonts w:ascii="Aptos" w:hAnsi="Aptos"/>
+          <w:b/>
+          <w:color w:val="1F4E79"/>
+          <w:sz w:val="19"/>
+        </w:rPr>
+        <w:t xml:space="preserve">- </w:t>
+      </w:r>
+      <w:r>
+        <w:rPr>
+          <w:rFonts w:ascii="Aptos" w:hAnsi="Aptos"/>
+          <w:color w:val="222222"/>
+          <w:sz w:val="19"/>
+        </w:rPr>
+        <w:t>Array methods including indexOf(), includes(), push(), pop(), unshift(), shift(), and splice().</w:t>
+      </w:r>
+    </w:p>
+    <w:p>
+      <w:pPr>
+        <w:spacing w:after="32" w:line="245" w:lineRule="auto"/>
+        <w:ind w:left="317" w:hanging="230"/>
+      </w:pPr>
+      <w:r>
+        <w:rPr>
+          <w:rFonts w:ascii="Aptos" w:hAnsi="Aptos"/>
+          <w:b/>
+          <w:color w:val="1F4E79"/>
+          <w:sz w:val="19"/>
+        </w:rPr>
+        <w:t xml:space="preserve">- </w:t>
+      </w:r>
+      <w:r>
+        <w:rPr>
+          <w:rFonts w:ascii="Aptos" w:hAnsi="Aptos"/>
+          <w:color w:val="222222"/>
+          <w:sz w:val="19"/>
+        </w:rPr>
+        <w:t>Practice questions using slice(), join(), chained filter(), random thresholds, Number(), reduce(), and template literal output.</w:t>
+      </w:r>
+    </w:p>
+    <w:p>
+      <w:pPr>
+        <w:spacing w:after="32" w:line="245" w:lineRule="auto"/>
+        <w:ind w:left="317" w:hanging="230"/>
+      </w:pPr>
+      <w:r>
+        <w:rPr>
+          <w:rFonts w:ascii="Aptos" w:hAnsi="Aptos"/>
+          <w:b/>
+          <w:color w:val="1F4E79"/>
+          <w:sz w:val="19"/>
+        </w:rPr>
+        <w:t xml:space="preserve">- </w:t>
+      </w:r>
+      <w:r>
+        <w:rPr>
+          <w:rFonts w:ascii="Aptos" w:hAnsi="Aptos"/>
+          <w:color w:val="222222"/>
+          <w:sz w:val="19"/>
+        </w:rPr>
+        <w:t>Login practice with HTML inputs, external CSS/JS, document.getElementById().value, strict equality, &amp;&amp;, alert(), links, and window.location.href.</w:t>
       </w:r>
     </w:p>
     <w:tbl>
@@ -841,7 +1309,7 @@
         </w:tblBorders>
       </w:tblPr>
       <w:tblGrid>
-        <w:gridCol w:w="10166"/>
+        <w:gridCol w:w="10224"/>
       </w:tblGrid>
       <w:tr>
         <w:trPr>
@@ -849,7 +1317,7 @@
         </w:trPr>
         <w:tc>
           <w:tcPr>
-            <w:tcW w:type="dxa" w:w="10166"/>
+            <w:tcW w:type="dxa" w:w="10224"/>
             <w:shd w:fill="F4F7FB"/>
           </w:tcPr>
           <w:p>
@@ -861,9 +1329,9 @@
               <w:rPr>
                 <w:rFonts w:ascii="Consolas" w:hAnsi="Consolas"/>
                 <w:color w:val="2D2D2D"/>
-                <w:sz w:val="17"/>
+                <w:sz w:val="16"/>
               </w:rPr>
-              <w:t>let temp = a;</w:t>
+              <w:t>arr.filter(x =&gt; typeof x === "number").map(y =&gt; y * 2);</w:t>
             </w:r>
           </w:p>
           <w:p>
@@ -874,9 +1342,9 @@
               <w:rPr>
                 <w:rFonts w:ascii="Consolas" w:hAnsi="Consolas"/>
                 <w:color w:val="2D2D2D"/>
-                <w:sz w:val="17"/>
+                <w:sz w:val="16"/>
               </w:rPr>
-              <w:t>a = b;</w:t>
+              <w:t>const guests = names.slice(1).map(name =&gt; `Guest: ${name}`);</w:t>
             </w:r>
           </w:p>
           <w:p>
@@ -887,9 +1355,9 @@
               <w:rPr>
                 <w:rFonts w:ascii="Consolas" w:hAnsi="Consolas"/>
                 <w:color w:val="2D2D2D"/>
-                <w:sz w:val="17"/>
+                <w:sz w:val="16"/>
               </w:rPr>
-              <w:t>b = temp;</w:t>
+              <w:t>prices.splice(prices.length - 1, 1);</w:t>
             </w:r>
           </w:p>
           <w:p>
@@ -900,22 +1368,9 @@
               <w:rPr>
                 <w:rFonts w:ascii="Consolas" w:hAnsi="Consolas"/>
                 <w:color w:val="2D2D2D"/>
-                <w:sz w:val="17"/>
+                <w:sz w:val="16"/>
               </w:rPr>
-              <w:t>if (typeof input === "number") { console.log("This is a number"); }</w:t>
-            </w:r>
-          </w:p>
-          <w:p>
-            <w:pPr>
-              <w:spacing w:after="0"/>
-            </w:pPr>
-            <w:r>
-              <w:rPr>
-                <w:rFonts w:ascii="Consolas" w:hAnsi="Consolas"/>
-                <w:color w:val="2D2D2D"/>
-                <w:sz w:val="17"/>
-              </w:rPr>
-              <w:t>const nameinputbox = document.getElementById("namebox");</w:t>
+              <w:t>if (username === "admin" &amp;&amp; password === "password") { alert("Authentication Successfull!"); }</w:t>
             </w:r>
           </w:p>
         </w:tc>
@@ -929,7 +1384,7 @@
     <w:p>
       <w:pPr>
         <w:pStyle w:val="Heading1"/>
-        <w:spacing w:before="240" w:after="80"/>
+        <w:spacing w:before="220" w:after="80"/>
       </w:pPr>
       <w:r>
         <w:rPr>
@@ -938,12 +1393,12 @@
           <w:color w:val="1F4E79"/>
           <w:sz w:val="32"/>
         </w:rPr>
-        <w:t>Day 2 Core JavaScript</w:t>
+        <w:t>Day 3 Array Method Practice</w:t>
       </w:r>
     </w:p>
     <w:p>
       <w:pPr>
-        <w:spacing w:after="100" w:line="259" w:lineRule="auto"/>
+        <w:spacing w:after="100" w:line="254" w:lineRule="auto"/>
       </w:pPr>
       <w:r>
         <w:rPr>
@@ -951,27 +1406,27 @@
           <w:color w:val="222222"/>
           <w:sz w:val="20"/>
         </w:rPr>
-        <w:t>The original Day2 file expanded the basics into more expressive JavaScript. I practiced writing formatted strings, reusable functions, compact arrow functions, array method chains, random values, conversions, and array modification methods.</w:t>
+        <w:t>Day 3 was a focused practice day for JavaScript array methods. The questions.js file solved 10 questions arranged by level, moving from basic iteration to reduce-based logic and array transformation.</w:t>
       </w:r>
     </w:p>
     <w:p>
       <w:pPr>
         <w:pStyle w:val="Heading2"/>
-        <w:spacing w:before="140" w:after="80"/>
+        <w:spacing w:before="120" w:after="80"/>
       </w:pPr>
       <w:r>
         <w:rPr>
           <w:rFonts w:ascii="Aptos" w:hAnsi="Aptos"/>
           <w:b/>
           <w:color w:val="1F4E79"/>
-          <w:sz w:val="25"/>
+          <w:sz w:val="24"/>
         </w:rPr>
-        <w:t>Core Day 2 Topics Practiced</w:t>
+        <w:t>Day 3 Topics Practiced</w:t>
       </w:r>
     </w:p>
     <w:p>
       <w:pPr>
-        <w:spacing w:after="44" w:line="250" w:lineRule="auto"/>
+        <w:spacing w:after="32" w:line="245" w:lineRule="auto"/>
         <w:ind w:left="317" w:hanging="230"/>
       </w:pPr>
       <w:r>
@@ -979,22 +1434,22 @@
           <w:rFonts w:ascii="Aptos" w:hAnsi="Aptos"/>
           <w:b/>
           <w:color w:val="1F4E79"/>
-          <w:sz w:val="20"/>
+          <w:sz w:val="19"/>
         </w:rPr>
-        <w:t xml:space="preserve">• </w:t>
+        <w:t xml:space="preserve">- </w:t>
       </w:r>
       <w:r>
         <w:rPr>
           <w:rFonts w:ascii="Aptos" w:hAnsi="Aptos"/>
           <w:color w:val="222222"/>
-          <w:sz w:val="20"/>
+          <w:sz w:val="19"/>
         </w:rPr>
-        <w:t>String concatenation and template literals using backticks and ${} placeholders.</w:t>
+        <w:t>Used forEach() to loop through names and print each one with a greeting prefix.</w:t>
       </w:r>
     </w:p>
     <w:p>
       <w:pPr>
-        <w:spacing w:after="44" w:line="250" w:lineRule="auto"/>
+        <w:spacing w:after="32" w:line="245" w:lineRule="auto"/>
         <w:ind w:left="317" w:hanging="230"/>
       </w:pPr>
       <w:r>
@@ -1002,22 +1457,22 @@
           <w:rFonts w:ascii="Aptos" w:hAnsi="Aptos"/>
           <w:b/>
           <w:color w:val="1F4E79"/>
-          <w:sz w:val="20"/>
+          <w:sz w:val="19"/>
         </w:rPr>
-        <w:t xml:space="preserve">• </w:t>
+        <w:t xml:space="preserve">- </w:t>
       </w:r>
       <w:r>
         <w:rPr>
           <w:rFonts w:ascii="Aptos" w:hAnsi="Aptos"/>
           <w:color w:val="222222"/>
-          <w:sz w:val="20"/>
+          <w:sz w:val="19"/>
         </w:rPr>
-        <w:t>A multiplication table function that builds and returns multi-line text.</w:t>
+        <w:t>Used map() to convert Celsius values to Fahrenheit with F = C * 1.8 + 32.</w:t>
       </w:r>
     </w:p>
     <w:p>
       <w:pPr>
-        <w:spacing w:after="44" w:line="250" w:lineRule="auto"/>
+        <w:spacing w:after="32" w:line="245" w:lineRule="auto"/>
         <w:ind w:left="317" w:hanging="230"/>
       </w:pPr>
       <w:r>
@@ -1025,22 +1480,22 @@
           <w:rFonts w:ascii="Aptos" w:hAnsi="Aptos"/>
           <w:b/>
           <w:color w:val="1F4E79"/>
-          <w:sz w:val="20"/>
+          <w:sz w:val="19"/>
         </w:rPr>
-        <w:t xml:space="preserve">• </w:t>
+        <w:t xml:space="preserve">- </w:t>
       </w:r>
       <w:r>
         <w:rPr>
           <w:rFonts w:ascii="Aptos" w:hAnsi="Aptos"/>
           <w:color w:val="222222"/>
-          <w:sz w:val="20"/>
+          <w:sz w:val="19"/>
         </w:rPr>
-        <w:t>Arrow functions such as (x, y) =&gt; x + y.</w:t>
+        <w:t>Filtered an array of user objects to keep only adults with age &gt;= 18.</w:t>
       </w:r>
     </w:p>
     <w:p>
       <w:pPr>
-        <w:spacing w:after="44" w:line="250" w:lineRule="auto"/>
+        <w:spacing w:after="32" w:line="245" w:lineRule="auto"/>
         <w:ind w:left="317" w:hanging="230"/>
       </w:pPr>
       <w:r>
@@ -1048,22 +1503,22 @@
           <w:rFonts w:ascii="Aptos" w:hAnsi="Aptos"/>
           <w:b/>
           <w:color w:val="1F4E79"/>
-          <w:sz w:val="20"/>
+          <w:sz w:val="19"/>
         </w:rPr>
-        <w:t xml:space="preserve">• </w:t>
+        <w:t xml:space="preserve">- </w:t>
       </w:r>
       <w:r>
         <w:rPr>
           <w:rFonts w:ascii="Aptos" w:hAnsi="Aptos"/>
           <w:color w:val="222222"/>
-          <w:sz w:val="20"/>
+          <w:sz w:val="19"/>
         </w:rPr>
-        <w:t>Array pipelines with filter(), map(), and forEach().</w:t>
+        <w:t>Created an arrow function that filters strings longer than 5 characters.</w:t>
       </w:r>
     </w:p>
     <w:p>
       <w:pPr>
-        <w:spacing w:after="44" w:line="250" w:lineRule="auto"/>
+        <w:spacing w:after="32" w:line="245" w:lineRule="auto"/>
         <w:ind w:left="317" w:hanging="230"/>
       </w:pPr>
       <w:r>
@@ -1071,22 +1526,22 @@
           <w:rFonts w:ascii="Aptos" w:hAnsi="Aptos"/>
           <w:b/>
           <w:color w:val="1F4E79"/>
-          <w:sz w:val="20"/>
+          <w:sz w:val="19"/>
         </w:rPr>
-        <w:t xml:space="preserve">• </w:t>
+        <w:t xml:space="preserve">- </w:t>
       </w:r>
       <w:r>
         <w:rPr>
           <w:rFonts w:ascii="Aptos" w:hAnsi="Aptos"/>
           <w:color w:val="222222"/>
-          <w:sz w:val="20"/>
+          <w:sz w:val="19"/>
         </w:rPr>
-        <w:t>Random number generation using Math.random() and Math.floor().</w:t>
+        <w:t>Used reduce() with an initial value of 0 to calculate total cost.</w:t>
       </w:r>
     </w:p>
     <w:p>
       <w:pPr>
-        <w:spacing w:after="44" w:line="250" w:lineRule="auto"/>
+        <w:spacing w:after="32" w:line="245" w:lineRule="auto"/>
         <w:ind w:left="317" w:hanging="230"/>
       </w:pPr>
       <w:r>
@@ -1094,22 +1549,22 @@
           <w:rFonts w:ascii="Aptos" w:hAnsi="Aptos"/>
           <w:b/>
           <w:color w:val="1F4E79"/>
-          <w:sz w:val="20"/>
+          <w:sz w:val="19"/>
         </w:rPr>
-        <w:t xml:space="preserve">• </w:t>
+        <w:t xml:space="preserve">- </w:t>
       </w:r>
       <w:r>
         <w:rPr>
           <w:rFonts w:ascii="Aptos" w:hAnsi="Aptos"/>
           <w:color w:val="222222"/>
-          <w:sz w:val="20"/>
+          <w:sz w:val="19"/>
         </w:rPr>
-        <w:t>Strict equality practice with == and === examples.</w:t>
+        <w:t>Formatted cost output with toFixed(2).</w:t>
       </w:r>
     </w:p>
     <w:p>
       <w:pPr>
-        <w:spacing w:after="44" w:line="250" w:lineRule="auto"/>
+        <w:spacing w:after="32" w:line="245" w:lineRule="auto"/>
         <w:ind w:left="317" w:hanging="230"/>
       </w:pPr>
       <w:r>
@@ -1117,22 +1572,22 @@
           <w:rFonts w:ascii="Aptos" w:hAnsi="Aptos"/>
           <w:b/>
           <w:color w:val="1F4E79"/>
-          <w:sz w:val="20"/>
+          <w:sz w:val="19"/>
         </w:rPr>
-        <w:t xml:space="preserve">• </w:t>
+        <w:t xml:space="preserve">- </w:t>
       </w:r>
       <w:r>
         <w:rPr>
           <w:rFonts w:ascii="Aptos" w:hAnsi="Aptos"/>
           <w:color w:val="222222"/>
-          <w:sz w:val="20"/>
+          <w:sz w:val="19"/>
         </w:rPr>
-        <w:t>Type conversion using Number(), String(), parseInt(), and parseFloat().</w:t>
+        <w:t>Used reduce() and a ternary operator to count occurrences of "apple".</w:t>
       </w:r>
     </w:p>
     <w:p>
       <w:pPr>
-        <w:spacing w:after="44" w:line="250" w:lineRule="auto"/>
+        <w:spacing w:after="32" w:line="245" w:lineRule="auto"/>
         <w:ind w:left="317" w:hanging="230"/>
       </w:pPr>
       <w:r>
@@ -1140,22 +1595,22 @@
           <w:rFonts w:ascii="Aptos" w:hAnsi="Aptos"/>
           <w:b/>
           <w:color w:val="1F4E79"/>
-          <w:sz w:val="20"/>
+          <w:sz w:val="19"/>
         </w:rPr>
-        <w:t xml:space="preserve">• </w:t>
+        <w:t xml:space="preserve">- </w:t>
       </w:r>
       <w:r>
         <w:rPr>
           <w:rFonts w:ascii="Aptos" w:hAnsi="Aptos"/>
           <w:color w:val="222222"/>
-          <w:sz w:val="20"/>
+          <w:sz w:val="19"/>
         </w:rPr>
-        <w:t>Array searching and reading with indexOf(), includes(), length, direct index access, and last-element access.</w:t>
+        <w:t>Combined filter() and map() to square only even numbers.</w:t>
       </w:r>
     </w:p>
     <w:p>
       <w:pPr>
-        <w:spacing w:after="44" w:line="250" w:lineRule="auto"/>
+        <w:spacing w:after="32" w:line="245" w:lineRule="auto"/>
         <w:ind w:left="317" w:hanging="230"/>
       </w:pPr>
       <w:r>
@@ -1163,17 +1618,63 @@
           <w:rFonts w:ascii="Aptos" w:hAnsi="Aptos"/>
           <w:b/>
           <w:color w:val="1F4E79"/>
-          <w:sz w:val="20"/>
+          <w:sz w:val="19"/>
         </w:rPr>
-        <w:t xml:space="preserve">• </w:t>
+        <w:t xml:space="preserve">- </w:t>
       </w:r>
       <w:r>
         <w:rPr>
           <w:rFonts w:ascii="Aptos" w:hAnsi="Aptos"/>
           <w:color w:val="222222"/>
-          <w:sz w:val="20"/>
+          <w:sz w:val="19"/>
         </w:rPr>
-        <w:t>Array mutation using push(), pop(), unshift(), shift(), and splice().</w:t>
+        <w:t>Extracted product titles from object arrays using map().</w:t>
+      </w:r>
+    </w:p>
+    <w:p>
+      <w:pPr>
+        <w:spacing w:after="32" w:line="245" w:lineRule="auto"/>
+        <w:ind w:left="317" w:hanging="230"/>
+      </w:pPr>
+      <w:r>
+        <w:rPr>
+          <w:rFonts w:ascii="Aptos" w:hAnsi="Aptos"/>
+          <w:b/>
+          <w:color w:val="1F4E79"/>
+          <w:sz w:val="19"/>
+        </w:rPr>
+        <w:t xml:space="preserve">- </w:t>
+      </w:r>
+      <w:r>
+        <w:rPr>
+          <w:rFonts w:ascii="Aptos" w:hAnsi="Aptos"/>
+          <w:color w:val="222222"/>
+          <w:sz w:val="19"/>
+        </w:rPr>
+        <w:t>Calculated an average score using reduce() and scores.length.</w:t>
+      </w:r>
+    </w:p>
+    <w:p>
+      <w:pPr>
+        <w:spacing w:after="32" w:line="245" w:lineRule="auto"/>
+        <w:ind w:left="317" w:hanging="230"/>
+      </w:pPr>
+      <w:r>
+        <w:rPr>
+          <w:rFonts w:ascii="Aptos" w:hAnsi="Aptos"/>
+          <w:b/>
+          <w:color w:val="1F4E79"/>
+          <w:sz w:val="19"/>
+        </w:rPr>
+        <w:t xml:space="preserve">- </w:t>
+      </w:r>
+      <w:r>
+        <w:rPr>
+          <w:rFonts w:ascii="Aptos" w:hAnsi="Aptos"/>
+          <w:color w:val="222222"/>
+          <w:sz w:val="19"/>
+        </w:rPr>
+        <w:t>Flattened a nested array without flat() by using reduce() with concat().</w:t>
       </w:r>
     </w:p>
     <w:tbl>
@@ -1191,7 +1692,7 @@
         </w:tblBorders>
       </w:tblPr>
       <w:tblGrid>
-        <w:gridCol w:w="10166"/>
+        <w:gridCol w:w="10224"/>
       </w:tblGrid>
       <w:tr>
         <w:trPr>
@@ -1199,7 +1700,7 @@
         </w:trPr>
         <w:tc>
           <w:tcPr>
-            <w:tcW w:type="dxa" w:w="10166"/>
+            <w:tcW w:type="dxa" w:w="10224"/>
             <w:shd w:fill="F4F7FB"/>
           </w:tcPr>
           <w:p>
@@ -1211,9 +1712,9 @@
               <w:rPr>
                 <w:rFonts w:ascii="Consolas" w:hAnsi="Consolas"/>
                 <w:color w:val="2D2D2D"/>
-                <w:sz w:val="17"/>
+                <w:sz w:val="16"/>
               </w:rPr>
-              <w:t>arr.filter(x =&gt; typeof x === "number")</w:t>
+              <w:t>names.forEach(name =&gt; console.log(`Hello, ${name}`));</w:t>
             </w:r>
           </w:p>
           <w:p>
@@ -1224,9 +1725,9 @@
               <w:rPr>
                 <w:rFonts w:ascii="Consolas" w:hAnsi="Consolas"/>
                 <w:color w:val="2D2D2D"/>
-                <w:sz w:val="17"/>
+                <w:sz w:val="16"/>
               </w:rPr>
-              <w:t xml:space="preserve">   .map(y =&gt; y * 2)</w:t>
+              <w:t>const adults = users.filter(user =&gt; user.age &gt;= 18);</w:t>
             </w:r>
           </w:p>
           <w:p>
@@ -1237,9 +1738,9 @@
               <w:rPr>
                 <w:rFonts w:ascii="Consolas" w:hAnsi="Consolas"/>
                 <w:color w:val="2D2D2D"/>
-                <w:sz w:val="17"/>
+                <w:sz w:val="16"/>
               </w:rPr>
-              <w:t xml:space="preserve">   .forEach(abc =&gt; console.log("Element after * 2:", abc * 2));</w:t>
+              <w:t>const totalCost = prices.reduce((total, price) =&gt; total + price, 0);</w:t>
             </w:r>
           </w:p>
           <w:p>
@@ -1250,35 +1751,9 @@
               <w:rPr>
                 <w:rFonts w:ascii="Consolas" w:hAnsi="Consolas"/>
                 <w:color w:val="2D2D2D"/>
-                <w:sz w:val="17"/>
+                <w:sz w:val="16"/>
               </w:rPr>
-              <w:t>console.log(Math.floor(Math.random() * 100) + 1);</w:t>
-            </w:r>
-          </w:p>
-          <w:p>
-            <w:pPr>
-              <w:spacing w:after="0"/>
-            </w:pPr>
-            <w:r>
-              <w:rPr>
-                <w:rFonts w:ascii="Consolas" w:hAnsi="Consolas"/>
-                <w:color w:val="2D2D2D"/>
-                <w:sz w:val="17"/>
-              </w:rPr>
-              <w:t>console.log(Number(strnum));</w:t>
-            </w:r>
-          </w:p>
-          <w:p>
-            <w:pPr>
-              <w:spacing w:after="0"/>
-            </w:pPr>
-            <w:r>
-              <w:rPr>
-                <w:rFonts w:ascii="Consolas" w:hAnsi="Consolas"/>
-                <w:color w:val="2D2D2D"/>
-                <w:sz w:val="17"/>
-              </w:rPr>
-              <w:t>console.log(colors.splice(0, 1));</w:t>
+              <w:t>const flatNumbers = nestedNumbers.reduce((flatArray, currentArray) =&gt; flatArray.concat(currentArray), []);</w:t>
             </w:r>
           </w:p>
         </w:tc>
@@ -1292,7 +1767,7 @@
     <w:p>
       <w:pPr>
         <w:pStyle w:val="Heading1"/>
-        <w:spacing w:before="240" w:after="80"/>
+        <w:spacing w:before="220" w:after="80"/>
       </w:pPr>
       <w:r>
         <w:rPr>
@@ -1301,12 +1776,12 @@
           <w:color w:val="1F4E79"/>
           <w:sz w:val="32"/>
         </w:rPr>
-        <w:t>Day 2 Practice Questions</w:t>
+        <w:t>Day 4 Asynchronous JavaScript</w:t>
       </w:r>
     </w:p>
     <w:p>
       <w:pPr>
-        <w:spacing w:after="100" w:line="259" w:lineRule="auto"/>
+        <w:spacing w:after="100" w:line="254" w:lineRule="auto"/>
       </w:pPr>
       <w:r>
         <w:rPr>
@@ -1314,27 +1789,27 @@
           <w:color w:val="222222"/>
           <w:sz w:val="20"/>
         </w:rPr>
-        <w:t>The new Day2 question files turned the concepts into small problem-solving scripts. Each file focused on a different combination of array methods, functions, Math methods, and conversions.</w:t>
+        <w:t>Day 4 now contains Promise practice plus real API-style practice. The code demonstrates manual Promise creation, rejection handling, timer functions, fetch requests, JSON parsing, API response transformation, and error handling.</w:t>
       </w:r>
     </w:p>
     <w:p>
       <w:pPr>
         <w:pStyle w:val="Heading2"/>
-        <w:spacing w:before="140" w:after="80"/>
+        <w:spacing w:before="120" w:after="80"/>
       </w:pPr>
       <w:r>
         <w:rPr>
           <w:rFonts w:ascii="Aptos" w:hAnsi="Aptos"/>
           <w:b/>
           <w:color w:val="1F4E79"/>
-          <w:sz w:val="25"/>
+          <w:sz w:val="24"/>
         </w:rPr>
-        <w:t>Question 1: Guest List Formatter</w:t>
+        <w:t>Promise and Timer Topics Practiced</w:t>
       </w:r>
     </w:p>
     <w:p>
       <w:pPr>
-        <w:spacing w:after="44" w:line="250" w:lineRule="auto"/>
+        <w:spacing w:after="32" w:line="245" w:lineRule="auto"/>
         <w:ind w:left="317" w:hanging="230"/>
       </w:pPr>
       <w:r>
@@ -1344,7 +1819,7 @@
           <w:color w:val="1F4E79"/>
           <w:sz w:val="19"/>
         </w:rPr>
-        <w:t xml:space="preserve">• </w:t>
+        <w:t xml:space="preserve">- </w:t>
       </w:r>
       <w:r>
         <w:rPr>
@@ -1352,12 +1827,12 @@
           <w:color w:val="222222"/>
           <w:sz w:val="19"/>
         </w:rPr>
-        <w:t>Created formatGuests(names) to format an array of names.</w:t>
+        <w:t>Created getData() to return a new Promise.</w:t>
       </w:r>
     </w:p>
     <w:p>
       <w:pPr>
-        <w:spacing w:after="44" w:line="250" w:lineRule="auto"/>
+        <w:spacing w:after="32" w:line="245" w:lineRule="auto"/>
         <w:ind w:left="317" w:hanging="230"/>
       </w:pPr>
       <w:r>
@@ -1367,7 +1842,7 @@
           <w:color w:val="1F4E79"/>
           <w:sz w:val="19"/>
         </w:rPr>
-        <w:t xml:space="preserve">• </w:t>
+        <w:t xml:space="preserve">- </w:t>
       </w:r>
       <w:r>
         <w:rPr>
@@ -1375,12 +1850,12 @@
           <w:color w:val="222222"/>
           <w:sz w:val="19"/>
         </w:rPr>
-        <w:t>Used slice(1) to remove the first name because it represents the host.</w:t>
+        <w:t>Used resolve() in reference code and reject() in active code to understand both success and error paths.</w:t>
       </w:r>
     </w:p>
     <w:p>
       <w:pPr>
-        <w:spacing w:after="44" w:line="250" w:lineRule="auto"/>
+        <w:spacing w:after="32" w:line="245" w:lineRule="auto"/>
         <w:ind w:left="317" w:hanging="230"/>
       </w:pPr>
       <w:r>
@@ -1390,7 +1865,7 @@
           <w:color w:val="1F4E79"/>
           <w:sz w:val="19"/>
         </w:rPr>
-        <w:t xml:space="preserve">• </w:t>
+        <w:t xml:space="preserve">- </w:t>
       </w:r>
       <w:r>
         <w:rPr>
@@ -1398,12 +1873,12 @@
           <w:color w:val="222222"/>
           <w:sz w:val="19"/>
         </w:rPr>
-        <w:t>Used map() with a template literal to add "Guest: " before each remaining name.</w:t>
+        <w:t>Used an if condition inside the Promise to decide whether to resolve or reject.</w:t>
       </w:r>
     </w:p>
     <w:p>
       <w:pPr>
-        <w:spacing w:after="44" w:line="250" w:lineRule="auto"/>
+        <w:spacing w:after="32" w:line="245" w:lineRule="auto"/>
         <w:ind w:left="317" w:hanging="230"/>
       </w:pPr>
       <w:r>
@@ -1413,7 +1888,7 @@
           <w:color w:val="1F4E79"/>
           <w:sz w:val="19"/>
         </w:rPr>
-        <w:t xml:space="preserve">• </w:t>
+        <w:t xml:space="preserve">- </w:t>
       </w:r>
       <w:r>
         <w:rPr>
@@ -1421,7 +1896,76 @@
           <w:color w:val="222222"/>
           <w:sz w:val="19"/>
         </w:rPr>
-        <w:t>Used join("\n") to return one string with each guest on a new line.</w:t>
+        <w:t>Handled successful Promise output with .then() and rejected output with .catch().</w:t>
+      </w:r>
+    </w:p>
+    <w:p>
+      <w:pPr>
+        <w:spacing w:after="32" w:line="245" w:lineRule="auto"/>
+        <w:ind w:left="317" w:hanging="230"/>
+      </w:pPr>
+      <w:r>
+        <w:rPr>
+          <w:rFonts w:ascii="Aptos" w:hAnsi="Aptos"/>
+          <w:b/>
+          <w:color w:val="1F4E79"/>
+          <w:sz w:val="19"/>
+        </w:rPr>
+        <w:t xml:space="preserve">- </w:t>
+      </w:r>
+      <w:r>
+        <w:rPr>
+          <w:rFonts w:ascii="Aptos" w:hAnsi="Aptos"/>
+          <w:color w:val="222222"/>
+          <w:sz w:val="19"/>
+        </w:rPr>
+        <w:t>Used setTimeout() to simulate delayed work and print messages after a delay.</w:t>
+      </w:r>
+    </w:p>
+    <w:p>
+      <w:pPr>
+        <w:spacing w:after="32" w:line="245" w:lineRule="auto"/>
+        <w:ind w:left="317" w:hanging="230"/>
+      </w:pPr>
+      <w:r>
+        <w:rPr>
+          <w:rFonts w:ascii="Aptos" w:hAnsi="Aptos"/>
+          <w:b/>
+          <w:color w:val="1F4E79"/>
+          <w:sz w:val="19"/>
+        </w:rPr>
+        <w:t xml:space="preserve">- </w:t>
+      </w:r>
+      <w:r>
+        <w:rPr>
+          <w:rFonts w:ascii="Aptos" w:hAnsi="Aptos"/>
+          <w:color w:val="222222"/>
+          <w:sz w:val="19"/>
+        </w:rPr>
+        <w:t>Used setInterval() to repeatedly print checking messages after a fixed interval.</w:t>
+      </w:r>
+    </w:p>
+    <w:p>
+      <w:pPr>
+        <w:spacing w:after="32" w:line="245" w:lineRule="auto"/>
+        <w:ind w:left="317" w:hanging="230"/>
+      </w:pPr>
+      <w:r>
+        <w:rPr>
+          <w:rFonts w:ascii="Aptos" w:hAnsi="Aptos"/>
+          <w:b/>
+          <w:color w:val="1F4E79"/>
+          <w:sz w:val="19"/>
+        </w:rPr>
+        <w:t xml:space="preserve">- </w:t>
+      </w:r>
+      <w:r>
+        <w:rPr>
+          <w:rFonts w:ascii="Aptos" w:hAnsi="Aptos"/>
+          <w:color w:val="222222"/>
+          <w:sz w:val="19"/>
+        </w:rPr>
+        <w:t>Observed that setInterval() keeps the program running until stopped.</w:t>
       </w:r>
     </w:p>
     <w:tbl>
@@ -1439,7 +1983,7 @@
         </w:tblBorders>
       </w:tblPr>
       <w:tblGrid>
-        <w:gridCol w:w="10166"/>
+        <w:gridCol w:w="10224"/>
       </w:tblGrid>
       <w:tr>
         <w:trPr>
@@ -1447,7 +1991,7 @@
         </w:trPr>
         <w:tc>
           <w:tcPr>
-            <w:tcW w:type="dxa" w:w="10166"/>
+            <w:tcW w:type="dxa" w:w="10224"/>
             <w:shd w:fill="F4F7FB"/>
           </w:tcPr>
           <w:p>
@@ -1459,9 +2003,9 @@
               <w:rPr>
                 <w:rFonts w:ascii="Consolas" w:hAnsi="Consolas"/>
                 <w:color w:val="2D2D2D"/>
-                <w:sz w:val="17"/>
+                <w:sz w:val="16"/>
               </w:rPr>
-              <w:t>const guests = names.slice(1).map(name =&gt; `Guest: ${name}`);</w:t>
+              <w:t>function getData() {</w:t>
             </w:r>
           </w:p>
           <w:p>
@@ -1472,9 +2016,61 @@
               <w:rPr>
                 <w:rFonts w:ascii="Consolas" w:hAnsi="Consolas"/>
                 <w:color w:val="2D2D2D"/>
-                <w:sz w:val="17"/>
+                <w:sz w:val="16"/>
               </w:rPr>
-              <w:t>return guests.join("\n");</w:t>
+              <w:t xml:space="preserve">    return new Promise((resolve, reject) =&gt; {</w:t>
+            </w:r>
+          </w:p>
+          <w:p>
+            <w:pPr>
+              <w:spacing w:after="0"/>
+            </w:pPr>
+            <w:r>
+              <w:rPr>
+                <w:rFonts w:ascii="Consolas" w:hAnsi="Consolas"/>
+                <w:color w:val="2D2D2D"/>
+                <w:sz w:val="16"/>
+              </w:rPr>
+              <w:t xml:space="preserve">        if (2 &gt; 3) { resolve("Data received"); } else { reject("not working"); }</w:t>
+            </w:r>
+          </w:p>
+          <w:p>
+            <w:pPr>
+              <w:spacing w:after="0"/>
+            </w:pPr>
+            <w:r>
+              <w:rPr>
+                <w:rFonts w:ascii="Consolas" w:hAnsi="Consolas"/>
+                <w:color w:val="2D2D2D"/>
+                <w:sz w:val="16"/>
+              </w:rPr>
+              <w:t xml:space="preserve">    });</w:t>
+            </w:r>
+          </w:p>
+          <w:p>
+            <w:pPr>
+              <w:spacing w:after="0"/>
+            </w:pPr>
+            <w:r>
+              <w:rPr>
+                <w:rFonts w:ascii="Consolas" w:hAnsi="Consolas"/>
+                <w:color w:val="2D2D2D"/>
+                <w:sz w:val="16"/>
+              </w:rPr>
+              <w:t>}</w:t>
+            </w:r>
+          </w:p>
+          <w:p>
+            <w:pPr>
+              <w:spacing w:after="0"/>
+            </w:pPr>
+            <w:r>
+              <w:rPr>
+                <w:rFonts w:ascii="Consolas" w:hAnsi="Consolas"/>
+                <w:color w:val="2D2D2D"/>
+                <w:sz w:val="16"/>
+              </w:rPr>
+              <w:t>getData().then(data =&gt; console.log(data)).catch(error =&gt; console.error("Error:", error));</w:t>
             </w:r>
           </w:p>
         </w:tc>
@@ -1487,22 +2083,50 @@
     </w:p>
     <w:p>
       <w:pPr>
-        <w:pStyle w:val="Heading2"/>
-        <w:spacing w:before="140" w:after="80"/>
+        <w:pStyle w:val="Heading1"/>
+        <w:spacing w:before="220" w:after="80"/>
       </w:pPr>
       <w:r>
         <w:rPr>
           <w:rFonts w:ascii="Aptos" w:hAnsi="Aptos"/>
           <w:b/>
           <w:color w:val="1F4E79"/>
-          <w:sz w:val="25"/>
+          <w:sz w:val="32"/>
         </w:rPr>
-        <w:t>Question 2: Logic Gate</w:t>
+        <w:t>Day 4 Fetch and API Practice</w:t>
       </w:r>
     </w:p>
     <w:p>
       <w:pPr>
-        <w:spacing w:after="44" w:line="250" w:lineRule="auto"/>
+        <w:spacing w:after="100" w:line="254" w:lineRule="auto"/>
+      </w:pPr>
+      <w:r>
+        <w:rPr>
+          <w:rFonts w:ascii="Aptos" w:hAnsi="Aptos"/>
+          <w:color w:val="222222"/>
+          <w:sz w:val="20"/>
+        </w:rPr>
+        <w:t>The edited index.js and promise.js files use fetch() with the JSONPlaceholder todos API. The api.js file adds a Weatherstack-style current weather request for Delhi using an API key placeholder and transforms the returned weather data into a smaller result object.</w:t>
+      </w:r>
+    </w:p>
+    <w:p>
+      <w:pPr>
+        <w:pStyle w:val="Heading2"/>
+        <w:spacing w:before="120" w:after="80"/>
+      </w:pPr>
+      <w:r>
+        <w:rPr>
+          <w:rFonts w:ascii="Aptos" w:hAnsi="Aptos"/>
+          <w:b/>
+          <w:color w:val="1F4E79"/>
+          <w:sz w:val="24"/>
+        </w:rPr>
+        <w:t>Fetch Chain Topics Practiced</w:t>
+      </w:r>
+    </w:p>
+    <w:p>
+      <w:pPr>
+        <w:spacing w:after="32" w:line="245" w:lineRule="auto"/>
         <w:ind w:left="317" w:hanging="230"/>
       </w:pPr>
       <w:r>
@@ -1512,7 +2136,7 @@
           <w:color w:val="1F4E79"/>
           <w:sz w:val="19"/>
         </w:rPr>
-        <w:t xml:space="preserve">• </w:t>
+        <w:t xml:space="preserve">- </w:t>
       </w:r>
       <w:r>
         <w:rPr>
@@ -1520,12 +2144,12 @@
           <w:color w:val="222222"/>
           <w:sz w:val="19"/>
         </w:rPr>
-        <w:t>Created getHighNumbers as an arrow function.</w:t>
+        <w:t>Used fetch("https://jsonplaceholder.typicode.com/todos") to request remote todo data.</w:t>
       </w:r>
     </w:p>
     <w:p>
       <w:pPr>
-        <w:spacing w:after="44" w:line="250" w:lineRule="auto"/>
+        <w:spacing w:after="32" w:line="245" w:lineRule="auto"/>
         <w:ind w:left="317" w:hanging="230"/>
       </w:pPr>
       <w:r>
@@ -1535,7 +2159,7 @@
           <w:color w:val="1F4E79"/>
           <w:sz w:val="19"/>
         </w:rPr>
-        <w:t xml:space="preserve">• </w:t>
+        <w:t xml:space="preserve">- </w:t>
       </w:r>
       <w:r>
         <w:rPr>
@@ -1543,12 +2167,12 @@
           <w:color w:val="222222"/>
           <w:sz w:val="19"/>
         </w:rPr>
-        <w:t>Filtered mixed values to keep only numbers using typeof value === "number".</w:t>
+        <w:t>Converted the response to JavaScript data using res.json().</w:t>
       </w:r>
     </w:p>
     <w:p>
       <w:pPr>
-        <w:spacing w:after="44" w:line="250" w:lineRule="auto"/>
+        <w:spacing w:after="32" w:line="245" w:lineRule="auto"/>
         <w:ind w:left="317" w:hanging="230"/>
       </w:pPr>
       <w:r>
@@ -1558,7 +2182,7 @@
           <w:color w:val="1F4E79"/>
           <w:sz w:val="19"/>
         </w:rPr>
-        <w:t xml:space="preserve">• </w:t>
+        <w:t xml:space="preserve">- </w:t>
       </w:r>
       <w:r>
         <w:rPr>
@@ -1566,12 +2190,12 @@
           <w:color w:val="222222"/>
           <w:sz w:val="19"/>
         </w:rPr>
-        <w:t>Generated a random threshold between 1 and 50 using Math.floor(Math.random() * 50) + 1.</w:t>
+        <w:t>Chained multiple .then() calls to process the data step by step.</w:t>
       </w:r>
     </w:p>
     <w:p>
       <w:pPr>
-        <w:spacing w:after="44" w:line="250" w:lineRule="auto"/>
+        <w:spacing w:after="32" w:line="245" w:lineRule="auto"/>
         <w:ind w:left="317" w:hanging="230"/>
       </w:pPr>
       <w:r>
@@ -1581,7 +2205,7 @@
           <w:color w:val="1F4E79"/>
           <w:sz w:val="19"/>
         </w:rPr>
-        <w:t xml:space="preserve">• </w:t>
+        <w:t xml:space="preserve">- </w:t>
       </w:r>
       <w:r>
         <w:rPr>
@@ -1589,7 +2213,275 @@
           <w:color w:val="222222"/>
           <w:sz w:val="19"/>
         </w:rPr>
-        <w:t>Filtered the numeric values again to keep only numbers greater than the threshold.</w:t>
+        <w:t>Filtered API results to keep only todos with even id values using d.id % 2 === 0.</w:t>
+      </w:r>
+    </w:p>
+    <w:p>
+      <w:pPr>
+        <w:spacing w:after="32" w:line="245" w:lineRule="auto"/>
+        <w:ind w:left="317" w:hanging="230"/>
+      </w:pPr>
+      <w:r>
+        <w:rPr>
+          <w:rFonts w:ascii="Aptos" w:hAnsi="Aptos"/>
+          <w:b/>
+          <w:color w:val="1F4E79"/>
+          <w:sz w:val="19"/>
+        </w:rPr>
+        <w:t xml:space="preserve">- </w:t>
+      </w:r>
+      <w:r>
+        <w:rPr>
+          <w:rFonts w:ascii="Aptos" w:hAnsi="Aptos"/>
+          <w:color w:val="222222"/>
+          <w:sz w:val="19"/>
+        </w:rPr>
+        <w:t>Mapped through filtered results and changed each title by adding the prefix "Aaryan ".</w:t>
+      </w:r>
+    </w:p>
+    <w:p>
+      <w:pPr>
+        <w:spacing w:after="32" w:line="245" w:lineRule="auto"/>
+        <w:ind w:left="317" w:hanging="230"/>
+      </w:pPr>
+      <w:r>
+        <w:rPr>
+          <w:rFonts w:ascii="Aptos" w:hAnsi="Aptos"/>
+          <w:b/>
+          <w:color w:val="1F4E79"/>
+          <w:sz w:val="19"/>
+        </w:rPr>
+        <w:t xml:space="preserve">- </w:t>
+      </w:r>
+      <w:r>
+        <w:rPr>
+          <w:rFonts w:ascii="Aptos" w:hAnsi="Aptos"/>
+          <w:color w:val="222222"/>
+          <w:sz w:val="19"/>
+        </w:rPr>
+        <w:t>Printed transformed API data with console.log().</w:t>
+      </w:r>
+    </w:p>
+    <w:p>
+      <w:pPr>
+        <w:spacing w:after="32" w:line="245" w:lineRule="auto"/>
+        <w:ind w:left="317" w:hanging="230"/>
+      </w:pPr>
+      <w:r>
+        <w:rPr>
+          <w:rFonts w:ascii="Aptos" w:hAnsi="Aptos"/>
+          <w:b/>
+          <w:color w:val="1F4E79"/>
+          <w:sz w:val="19"/>
+        </w:rPr>
+        <w:t xml:space="preserve">- </w:t>
+      </w:r>
+      <w:r>
+        <w:rPr>
+          <w:rFonts w:ascii="Aptos" w:hAnsi="Aptos"/>
+          <w:color w:val="222222"/>
+          <w:sz w:val="19"/>
+        </w:rPr>
+        <w:t>Handled fetch problems with .catch(error =&gt; console.error("Error fetching data:", error)).</w:t>
+      </w:r>
+    </w:p>
+    <w:p>
+      <w:pPr>
+        <w:pStyle w:val="Heading2"/>
+        <w:spacing w:before="120" w:after="80"/>
+      </w:pPr>
+      <w:r>
+        <w:rPr>
+          <w:rFonts w:ascii="Aptos" w:hAnsi="Aptos"/>
+          <w:b/>
+          <w:color w:val="1F4E79"/>
+          <w:sz w:val="24"/>
+        </w:rPr>
+        <w:t>Weather API Topics Practiced</w:t>
+      </w:r>
+    </w:p>
+    <w:p>
+      <w:pPr>
+        <w:spacing w:after="32" w:line="245" w:lineRule="auto"/>
+        <w:ind w:left="317" w:hanging="230"/>
+      </w:pPr>
+      <w:r>
+        <w:rPr>
+          <w:rFonts w:ascii="Aptos" w:hAnsi="Aptos"/>
+          <w:b/>
+          <w:color w:val="1F4E79"/>
+          <w:sz w:val="19"/>
+        </w:rPr>
+        <w:t xml:space="preserve">- </w:t>
+      </w:r>
+      <w:r>
+        <w:rPr>
+          <w:rFonts w:ascii="Aptos" w:hAnsi="Aptos"/>
+          <w:color w:val="222222"/>
+          <w:sz w:val="19"/>
+        </w:rPr>
+        <w:t>Stored an API key placeholder in API_KEY.</w:t>
+      </w:r>
+    </w:p>
+    <w:p>
+      <w:pPr>
+        <w:spacing w:after="32" w:line="245" w:lineRule="auto"/>
+        <w:ind w:left="317" w:hanging="230"/>
+      </w:pPr>
+      <w:r>
+        <w:rPr>
+          <w:rFonts w:ascii="Aptos" w:hAnsi="Aptos"/>
+          <w:b/>
+          <w:color w:val="1F4E79"/>
+          <w:sz w:val="19"/>
+        </w:rPr>
+        <w:t xml:space="preserve">- </w:t>
+      </w:r>
+      <w:r>
+        <w:rPr>
+          <w:rFonts w:ascii="Aptos" w:hAnsi="Aptos"/>
+          <w:color w:val="222222"/>
+          <w:sz w:val="19"/>
+        </w:rPr>
+        <w:t>Used a template literal URL to insert the API key into the Weatherstack request.</w:t>
+      </w:r>
+    </w:p>
+    <w:p>
+      <w:pPr>
+        <w:spacing w:after="32" w:line="245" w:lineRule="auto"/>
+        <w:ind w:left="317" w:hanging="230"/>
+      </w:pPr>
+      <w:r>
+        <w:rPr>
+          <w:rFonts w:ascii="Aptos" w:hAnsi="Aptos"/>
+          <w:b/>
+          <w:color w:val="1F4E79"/>
+          <w:sz w:val="19"/>
+        </w:rPr>
+        <w:t xml:space="preserve">- </w:t>
+      </w:r>
+      <w:r>
+        <w:rPr>
+          <w:rFonts w:ascii="Aptos" w:hAnsi="Aptos"/>
+          <w:color w:val="222222"/>
+          <w:sz w:val="19"/>
+        </w:rPr>
+        <w:t>Converted the weather API response using res.json().</w:t>
+      </w:r>
+    </w:p>
+    <w:p>
+      <w:pPr>
+        <w:spacing w:after="32" w:line="245" w:lineRule="auto"/>
+        <w:ind w:left="317" w:hanging="230"/>
+      </w:pPr>
+      <w:r>
+        <w:rPr>
+          <w:rFonts w:ascii="Aptos" w:hAnsi="Aptos"/>
+          <w:b/>
+          <w:color w:val="1F4E79"/>
+          <w:sz w:val="19"/>
+        </w:rPr>
+        <w:t xml:space="preserve">- </w:t>
+      </w:r>
+      <w:r>
+        <w:rPr>
+          <w:rFonts w:ascii="Aptos" w:hAnsi="Aptos"/>
+          <w:color w:val="222222"/>
+          <w:sz w:val="19"/>
+        </w:rPr>
+        <w:t>Accessed nested response data such as data.current and data.location.name.</w:t>
+      </w:r>
+    </w:p>
+    <w:p>
+      <w:pPr>
+        <w:spacing w:after="32" w:line="245" w:lineRule="auto"/>
+        <w:ind w:left="317" w:hanging="230"/>
+      </w:pPr>
+      <w:r>
+        <w:rPr>
+          <w:rFonts w:ascii="Aptos" w:hAnsi="Aptos"/>
+          <w:b/>
+          <w:color w:val="1F4E79"/>
+          <w:sz w:val="19"/>
+        </w:rPr>
+        <w:t xml:space="preserve">- </w:t>
+      </w:r>
+      <w:r>
+        <w:rPr>
+          <w:rFonts w:ascii="Aptos" w:hAnsi="Aptos"/>
+          <w:color w:val="222222"/>
+          <w:sz w:val="19"/>
+        </w:rPr>
+        <w:t>Created a new result object with location, temperatureC, temperatureF, description, and isHot.</w:t>
+      </w:r>
+    </w:p>
+    <w:p>
+      <w:pPr>
+        <w:spacing w:after="32" w:line="245" w:lineRule="auto"/>
+        <w:ind w:left="317" w:hanging="230"/>
+      </w:pPr>
+      <w:r>
+        <w:rPr>
+          <w:rFonts w:ascii="Aptos" w:hAnsi="Aptos"/>
+          <w:b/>
+          <w:color w:val="1F4E79"/>
+          <w:sz w:val="19"/>
+        </w:rPr>
+        <w:t xml:space="preserve">- </w:t>
+      </w:r>
+      <w:r>
+        <w:rPr>
+          <w:rFonts w:ascii="Aptos" w:hAnsi="Aptos"/>
+          <w:color w:val="222222"/>
+          <w:sz w:val="19"/>
+        </w:rPr>
+        <w:t>Converted Celsius to Fahrenheit using (temperature * 1.8) + 32.</w:t>
+      </w:r>
+    </w:p>
+    <w:p>
+      <w:pPr>
+        <w:spacing w:after="32" w:line="245" w:lineRule="auto"/>
+        <w:ind w:left="317" w:hanging="230"/>
+      </w:pPr>
+      <w:r>
+        <w:rPr>
+          <w:rFonts w:ascii="Aptos" w:hAnsi="Aptos"/>
+          <w:b/>
+          <w:color w:val="1F4E79"/>
+          <w:sz w:val="19"/>
+        </w:rPr>
+        <w:t xml:space="preserve">- </w:t>
+      </w:r>
+      <w:r>
+        <w:rPr>
+          <w:rFonts w:ascii="Aptos" w:hAnsi="Aptos"/>
+          <w:color w:val="222222"/>
+          <w:sz w:val="19"/>
+        </w:rPr>
+        <w:t>Used the ternary operator to set isHot to "Yes" or "No" based on temperature &gt; 32.</w:t>
+      </w:r>
+    </w:p>
+    <w:p>
+      <w:pPr>
+        <w:spacing w:after="32" w:line="245" w:lineRule="auto"/>
+        <w:ind w:left="317" w:hanging="230"/>
+      </w:pPr>
+      <w:r>
+        <w:rPr>
+          <w:rFonts w:ascii="Aptos" w:hAnsi="Aptos"/>
+          <w:b/>
+          <w:color w:val="1F4E79"/>
+          <w:sz w:val="19"/>
+        </w:rPr>
+        <w:t xml:space="preserve">- </w:t>
+      </w:r>
+      <w:r>
+        <w:rPr>
+          <w:rFonts w:ascii="Aptos" w:hAnsi="Aptos"/>
+          <w:color w:val="222222"/>
+          <w:sz w:val="19"/>
+        </w:rPr>
+        <w:t>Returned transformed data through the Promise chain and printed finalData.</w:t>
       </w:r>
     </w:p>
     <w:tbl>
@@ -1607,7 +2499,7 @@
         </w:tblBorders>
       </w:tblPr>
       <w:tblGrid>
-        <w:gridCol w:w="10166"/>
+        <w:gridCol w:w="10224"/>
       </w:tblGrid>
       <w:tr>
         <w:trPr>
@@ -1615,7 +2507,7 @@
         </w:trPr>
         <w:tc>
           <w:tcPr>
-            <w:tcW w:type="dxa" w:w="10166"/>
+            <w:tcW w:type="dxa" w:w="10224"/>
             <w:shd w:fill="F4F7FB"/>
           </w:tcPr>
           <w:p>
@@ -1627,9 +2519,9 @@
               <w:rPr>
                 <w:rFonts w:ascii="Consolas" w:hAnsi="Consolas"/>
                 <w:color w:val="2D2D2D"/>
-                <w:sz w:val="17"/>
+                <w:sz w:val="16"/>
               </w:rPr>
-              <w:t>const threshold = Math.floor(Math.random() * 50) + 1;</w:t>
+              <w:t>fetch("https://jsonplaceholder.typicode.com/todos")</w:t>
             </w:r>
           </w:p>
           <w:p>
@@ -1640,9 +2532,9 @@
               <w:rPr>
                 <w:rFonts w:ascii="Consolas" w:hAnsi="Consolas"/>
                 <w:color w:val="2D2D2D"/>
-                <w:sz w:val="17"/>
+                <w:sz w:val="16"/>
               </w:rPr>
-              <w:t>return values</w:t>
+              <w:t xml:space="preserve">    .then(res =&gt; res.json())</w:t>
             </w:r>
           </w:p>
           <w:p>
@@ -1653,9 +2545,9 @@
               <w:rPr>
                 <w:rFonts w:ascii="Consolas" w:hAnsi="Consolas"/>
                 <w:color w:val="2D2D2D"/>
-                <w:sz w:val="17"/>
+                <w:sz w:val="16"/>
               </w:rPr>
-              <w:t xml:space="preserve">    .filter(value =&gt; typeof value === "number")</w:t>
+              <w:t xml:space="preserve">    .then(data =&gt; data.filter(d =&gt; d.id % 2 === 0))</w:t>
             </w:r>
           </w:p>
           <w:p>
@@ -1666,164 +2558,9 @@
               <w:rPr>
                 <w:rFonts w:ascii="Consolas" w:hAnsi="Consolas"/>
                 <w:color w:val="2D2D2D"/>
-                <w:sz w:val="17"/>
+                <w:sz w:val="16"/>
               </w:rPr>
-              <w:t xml:space="preserve">    .filter(number =&gt; number &gt; threshold);</w:t>
-            </w:r>
-          </w:p>
-        </w:tc>
-      </w:tr>
-    </w:tbl>
-    <w:p>
-      <w:pPr>
-        <w:spacing w:after="20"/>
-      </w:pPr>
-    </w:p>
-    <w:p>
-      <w:pPr>
-        <w:pStyle w:val="Heading2"/>
-        <w:spacing w:before="140" w:after="80"/>
-      </w:pPr>
-      <w:r>
-        <w:rPr>
-          <w:rFonts w:ascii="Aptos" w:hAnsi="Aptos"/>
-          <w:b/>
-          <w:color w:val="1F4E79"/>
-          <w:sz w:val="25"/>
-        </w:rPr>
-        <w:t>Question 3: Price Calculator</w:t>
-      </w:r>
-    </w:p>
-    <w:p>
-      <w:pPr>
-        <w:spacing w:after="44" w:line="250" w:lineRule="auto"/>
-        <w:ind w:left="317" w:hanging="230"/>
-      </w:pPr>
-      <w:r>
-        <w:rPr>
-          <w:rFonts w:ascii="Aptos" w:hAnsi="Aptos"/>
-          <w:b/>
-          <w:color w:val="1F4E79"/>
-          <w:sz w:val="19"/>
-        </w:rPr>
-        <w:t xml:space="preserve">• </w:t>
-      </w:r>
-      <w:r>
-        <w:rPr>
-          <w:rFonts w:ascii="Aptos" w:hAnsi="Aptos"/>
-          <w:color w:val="222222"/>
-          <w:sz w:val="19"/>
-        </w:rPr>
-        <w:t>Used splice(prices.length - 1, 1) to remove the last item as the handling fee.</w:t>
-      </w:r>
-    </w:p>
-    <w:p>
-      <w:pPr>
-        <w:spacing w:after="44" w:line="250" w:lineRule="auto"/>
-        <w:ind w:left="317" w:hanging="230"/>
-      </w:pPr>
-      <w:r>
-        <w:rPr>
-          <w:rFonts w:ascii="Aptos" w:hAnsi="Aptos"/>
-          <w:b/>
-          <w:color w:val="1F4E79"/>
-          <w:sz w:val="19"/>
-        </w:rPr>
-        <w:t xml:space="preserve">• </w:t>
-      </w:r>
-      <w:r>
-        <w:rPr>
-          <w:rFonts w:ascii="Aptos" w:hAnsi="Aptos"/>
-          <w:color w:val="222222"/>
-          <w:sz w:val="19"/>
-        </w:rPr>
-        <w:t>Converted string prices to numbers with map(price =&gt; Number(price)).</w:t>
-      </w:r>
-    </w:p>
-    <w:p>
-      <w:pPr>
-        <w:spacing w:after="44" w:line="250" w:lineRule="auto"/>
-        <w:ind w:left="317" w:hanging="230"/>
-      </w:pPr>
-      <w:r>
-        <w:rPr>
-          <w:rFonts w:ascii="Aptos" w:hAnsi="Aptos"/>
-          <w:b/>
-          <w:color w:val="1F4E79"/>
-          <w:sz w:val="19"/>
-        </w:rPr>
-        <w:t xml:space="preserve">• </w:t>
-      </w:r>
-      <w:r>
-        <w:rPr>
-          <w:rFonts w:ascii="Aptos" w:hAnsi="Aptos"/>
-          <w:color w:val="222222"/>
-          <w:sz w:val="19"/>
-        </w:rPr>
-        <w:t>Used an arrow function inside reduce() to calculate the total.</w:t>
-      </w:r>
-    </w:p>
-    <w:p>
-      <w:pPr>
-        <w:spacing w:after="44" w:line="250" w:lineRule="auto"/>
-        <w:ind w:left="317" w:hanging="230"/>
-      </w:pPr>
-      <w:r>
-        <w:rPr>
-          <w:rFonts w:ascii="Aptos" w:hAnsi="Aptos"/>
-          <w:b/>
-          <w:color w:val="1F4E79"/>
-          <w:sz w:val="19"/>
-        </w:rPr>
-        <w:t xml:space="preserve">• </w:t>
-      </w:r>
-      <w:r>
-        <w:rPr>
-          <w:rFonts w:ascii="Aptos" w:hAnsi="Aptos"/>
-          <w:color w:val="222222"/>
-          <w:sz w:val="19"/>
-        </w:rPr>
-        <w:t>Printed the final output using a template literal: Total Price: $[sum].</w:t>
-      </w:r>
-    </w:p>
-    <w:tbl>
-      <w:tblPr>
-        <w:tblW w:type="auto" w:w="0"/>
-        <w:jc w:val="center"/>
-        <w:tblLook w:firstColumn="1" w:firstRow="1" w:lastColumn="0" w:lastRow="0" w:noHBand="0" w:noVBand="1" w:val="04A0"/>
-        <w:tblBorders>
-          <w:top w:val="single" w:sz="4" w:space="0" w:color="C9D5E3"/>
-          <w:left w:val="single" w:sz="4" w:space="0" w:color="C9D5E3"/>
-          <w:bottom w:val="single" w:sz="4" w:space="0" w:color="C9D5E3"/>
-          <w:right w:val="single" w:sz="4" w:space="0" w:color="C9D5E3"/>
-          <w:insideH w:val="single" w:sz="4" w:space="0" w:color="C9D5E3"/>
-          <w:insideV w:val="single" w:sz="4" w:space="0" w:color="C9D5E3"/>
-        </w:tblBorders>
-      </w:tblPr>
-      <w:tblGrid>
-        <w:gridCol w:w="10166"/>
-      </w:tblGrid>
-      <w:tr>
-        <w:trPr>
-          <w:tblHeader w:val="true"/>
-        </w:trPr>
-        <w:tc>
-          <w:tcPr>
-            <w:tcW w:type="dxa" w:w="10166"/>
-            <w:shd w:fill="F4F7FB"/>
-          </w:tcPr>
-          <w:p>
-            <w:pPr>
-              <w:spacing w:after="0"/>
-            </w:pPr>
-            <w:r/>
-            <w:r>
-              <w:rPr>
-                <w:rFonts w:ascii="Consolas" w:hAnsi="Consolas"/>
-                <w:color w:val="2D2D2D"/>
-                <w:sz w:val="17"/>
-              </w:rPr>
-              <w:t>prices.splice(prices.length - 1, 1);</w:t>
+              <w:t xml:space="preserve">    .then(data =&gt; data.map(d =&gt; (d.title = "Aaryan " + d.title)))</w:t>
             </w:r>
           </w:p>
           <w:p>
@@ -1834,9 +2571,9 @@
               <w:rPr>
                 <w:rFonts w:ascii="Consolas" w:hAnsi="Consolas"/>
                 <w:color w:val="2D2D2D"/>
-                <w:sz w:val="17"/>
+                <w:sz w:val="16"/>
               </w:rPr>
-              <w:t>const numberPrices = prices.map(price =&gt; Number(price));</w:t>
+              <w:t xml:space="preserve">    .catch(error =&gt; console.error("Error fetching data:", error));</w:t>
             </w:r>
           </w:p>
           <w:p>
@@ -1847,9 +2584,8 @@
               <w:rPr>
                 <w:rFonts w:ascii="Consolas" w:hAnsi="Consolas"/>
                 <w:color w:val="2D2D2D"/>
-                <w:sz w:val="17"/>
+                <w:sz w:val="16"/>
               </w:rPr>
-              <w:t>const sumPrices = (total, price) =&gt; total + price;</w:t>
             </w:r>
           </w:p>
           <w:p>
@@ -1860,391 +2596,9 @@
               <w:rPr>
                 <w:rFonts w:ascii="Consolas" w:hAnsi="Consolas"/>
                 <w:color w:val="2D2D2D"/>
-                <w:sz w:val="17"/>
+                <w:sz w:val="16"/>
               </w:rPr>
-              <w:t>console.log(`Total Price: $${totalPrice}`);</w:t>
-            </w:r>
-          </w:p>
-        </w:tc>
-      </w:tr>
-    </w:tbl>
-    <w:p>
-      <w:pPr>
-        <w:spacing w:after="20"/>
-      </w:pPr>
-    </w:p>
-    <w:p>
-      <w:pPr>
-        <w:pStyle w:val="Heading1"/>
-        <w:spacing w:before="240" w:after="80"/>
-      </w:pPr>
-      <w:r>
-        <w:rPr>
-          <w:rFonts w:ascii="Aptos" w:hAnsi="Aptos"/>
-          <w:b/>
-          <w:color w:val="1F4E79"/>
-          <w:sz w:val="32"/>
-        </w:rPr>
-        <w:t>Day 2 Browser Practice</w:t>
-      </w:r>
-    </w:p>
-    <w:p>
-      <w:pPr>
-        <w:spacing w:after="100" w:line="259" w:lineRule="auto"/>
-      </w:pPr>
-      <w:r>
-        <w:rPr>
-          <w:rFonts w:ascii="Aptos" w:hAnsi="Aptos"/>
-          <w:color w:val="222222"/>
-          <w:sz w:val="20"/>
-        </w:rPr>
-        <w:t>The newer Day2 browser files introduced a simple login page and home page. This practice connected HTML structure, CSS styling, and JavaScript behavior in the browser.</w:t>
-      </w:r>
-    </w:p>
-    <w:p>
-      <w:pPr>
-        <w:pStyle w:val="Heading2"/>
-        <w:spacing w:before="140" w:after="80"/>
-      </w:pPr>
-      <w:r>
-        <w:rPr>
-          <w:rFonts w:ascii="Aptos" w:hAnsi="Aptos"/>
-          <w:b/>
-          <w:color w:val="1F4E79"/>
-          <w:sz w:val="25"/>
-        </w:rPr>
-        <w:t>HTML and CSS Topics Practiced</w:t>
-      </w:r>
-    </w:p>
-    <w:p>
-      <w:pPr>
-        <w:spacing w:after="44" w:line="250" w:lineRule="auto"/>
-        <w:ind w:left="317" w:hanging="230"/>
-      </w:pPr>
-      <w:r>
-        <w:rPr>
-          <w:rFonts w:ascii="Aptos" w:hAnsi="Aptos"/>
-          <w:b/>
-          <w:color w:val="1F4E79"/>
-          <w:sz w:val="20"/>
-        </w:rPr>
-        <w:t xml:space="preserve">• </w:t>
-      </w:r>
-      <w:r>
-        <w:rPr>
-          <w:rFonts w:ascii="Aptos" w:hAnsi="Aptos"/>
-          <w:color w:val="222222"/>
-          <w:sz w:val="20"/>
-        </w:rPr>
-        <w:t>Created a login page with input fields for username and password.</w:t>
-      </w:r>
-    </w:p>
-    <w:p>
-      <w:pPr>
-        <w:spacing w:after="44" w:line="250" w:lineRule="auto"/>
-        <w:ind w:left="317" w:hanging="230"/>
-      </w:pPr>
-      <w:r>
-        <w:rPr>
-          <w:rFonts w:ascii="Aptos" w:hAnsi="Aptos"/>
-          <w:b/>
-          <w:color w:val="1F4E79"/>
-          <w:sz w:val="20"/>
-        </w:rPr>
-        <w:t xml:space="preserve">• </w:t>
-      </w:r>
-      <w:r>
-        <w:rPr>
-          <w:rFonts w:ascii="Aptos" w:hAnsi="Aptos"/>
-          <w:color w:val="222222"/>
-          <w:sz w:val="20"/>
-        </w:rPr>
-        <w:t>Used input types text and password to control how data is entered.</w:t>
-      </w:r>
-    </w:p>
-    <w:p>
-      <w:pPr>
-        <w:spacing w:after="44" w:line="250" w:lineRule="auto"/>
-        <w:ind w:left="317" w:hanging="230"/>
-      </w:pPr>
-      <w:r>
-        <w:rPr>
-          <w:rFonts w:ascii="Aptos" w:hAnsi="Aptos"/>
-          <w:b/>
-          <w:color w:val="1F4E79"/>
-          <w:sz w:val="20"/>
-        </w:rPr>
-        <w:t xml:space="preserve">• </w:t>
-      </w:r>
-      <w:r>
-        <w:rPr>
-          <w:rFonts w:ascii="Aptos" w:hAnsi="Aptos"/>
-          <w:color w:val="222222"/>
-          <w:sz w:val="20"/>
-        </w:rPr>
-        <w:t>Connected external JavaScript with &lt;script src="login.js"&gt;&lt;/script&gt;.</w:t>
-      </w:r>
-    </w:p>
-    <w:p>
-      <w:pPr>
-        <w:spacing w:after="44" w:line="250" w:lineRule="auto"/>
-        <w:ind w:left="317" w:hanging="230"/>
-      </w:pPr>
-      <w:r>
-        <w:rPr>
-          <w:rFonts w:ascii="Aptos" w:hAnsi="Aptos"/>
-          <w:b/>
-          <w:color w:val="1F4E79"/>
-          <w:sz w:val="20"/>
-        </w:rPr>
-        <w:t xml:space="preserve">• </w:t>
-      </w:r>
-      <w:r>
-        <w:rPr>
-          <w:rFonts w:ascii="Aptos" w:hAnsi="Aptos"/>
-          <w:color w:val="222222"/>
-          <w:sz w:val="20"/>
-        </w:rPr>
-        <w:t>Connected external CSS with &lt;link rel="stylesheet" href="login.css"&gt;.</w:t>
-      </w:r>
-    </w:p>
-    <w:p>
-      <w:pPr>
-        <w:spacing w:after="44" w:line="250" w:lineRule="auto"/>
-        <w:ind w:left="317" w:hanging="230"/>
-      </w:pPr>
-      <w:r>
-        <w:rPr>
-          <w:rFonts w:ascii="Aptos" w:hAnsi="Aptos"/>
-          <w:b/>
-          <w:color w:val="1F4E79"/>
-          <w:sz w:val="20"/>
-        </w:rPr>
-        <w:t xml:space="preserve">• </w:t>
-      </w:r>
-      <w:r>
-        <w:rPr>
-          <w:rFonts w:ascii="Aptos" w:hAnsi="Aptos"/>
-          <w:color w:val="222222"/>
-          <w:sz w:val="20"/>
-        </w:rPr>
-        <w:t>Styled h1, p, and button elements with CSS properties such as color, margin-top, and background-color.</w:t>
-      </w:r>
-    </w:p>
-    <w:p>
-      <w:pPr>
-        <w:spacing w:after="44" w:line="250" w:lineRule="auto"/>
-        <w:ind w:left="317" w:hanging="230"/>
-      </w:pPr>
-      <w:r>
-        <w:rPr>
-          <w:rFonts w:ascii="Aptos" w:hAnsi="Aptos"/>
-          <w:b/>
-          <w:color w:val="1F4E79"/>
-          <w:sz w:val="20"/>
-        </w:rPr>
-        <w:t xml:space="preserve">• </w:t>
-      </w:r>
-      <w:r>
-        <w:rPr>
-          <w:rFonts w:ascii="Aptos" w:hAnsi="Aptos"/>
-          <w:color w:val="222222"/>
-          <w:sz w:val="20"/>
-        </w:rPr>
-        <w:t>Created app.html as a simple home page with navigation links in an unordered list.</w:t>
-      </w:r>
-    </w:p>
-    <w:p>
-      <w:pPr>
-        <w:pStyle w:val="Heading2"/>
-        <w:spacing w:before="140" w:after="80"/>
-      </w:pPr>
-      <w:r>
-        <w:rPr>
-          <w:rFonts w:ascii="Aptos" w:hAnsi="Aptos"/>
-          <w:b/>
-          <w:color w:val="1F4E79"/>
-          <w:sz w:val="25"/>
-        </w:rPr>
-        <w:t>Login JavaScript Topics Practiced</w:t>
-      </w:r>
-    </w:p>
-    <w:p>
-      <w:pPr>
-        <w:spacing w:after="44" w:line="250" w:lineRule="auto"/>
-        <w:ind w:left="317" w:hanging="230"/>
-      </w:pPr>
-      <w:r>
-        <w:rPr>
-          <w:rFonts w:ascii="Aptos" w:hAnsi="Aptos"/>
-          <w:b/>
-          <w:color w:val="1F4E79"/>
-          <w:sz w:val="20"/>
-        </w:rPr>
-        <w:t xml:space="preserve">• </w:t>
-      </w:r>
-      <w:r>
-        <w:rPr>
-          <w:rFonts w:ascii="Aptos" w:hAnsi="Aptos"/>
-          <w:color w:val="222222"/>
-          <w:sz w:val="20"/>
-        </w:rPr>
-        <w:t>Created auth as an arrow function that runs when the Submit button is clicked.</w:t>
-      </w:r>
-    </w:p>
-    <w:p>
-      <w:pPr>
-        <w:spacing w:after="44" w:line="250" w:lineRule="auto"/>
-        <w:ind w:left="317" w:hanging="230"/>
-      </w:pPr>
-      <w:r>
-        <w:rPr>
-          <w:rFonts w:ascii="Aptos" w:hAnsi="Aptos"/>
-          <w:b/>
-          <w:color w:val="1F4E79"/>
-          <w:sz w:val="20"/>
-        </w:rPr>
-        <w:t xml:space="preserve">• </w:t>
-      </w:r>
-      <w:r>
-        <w:rPr>
-          <w:rFonts w:ascii="Aptos" w:hAnsi="Aptos"/>
-          <w:color w:val="222222"/>
-          <w:sz w:val="20"/>
-        </w:rPr>
-        <w:t>Read browser input values using document.getElementById("username").value and document.getElementById("password").value.</w:t>
-      </w:r>
-    </w:p>
-    <w:p>
-      <w:pPr>
-        <w:spacing w:after="44" w:line="250" w:lineRule="auto"/>
-        <w:ind w:left="317" w:hanging="230"/>
-      </w:pPr>
-      <w:r>
-        <w:rPr>
-          <w:rFonts w:ascii="Aptos" w:hAnsi="Aptos"/>
-          <w:b/>
-          <w:color w:val="1F4E79"/>
-          <w:sz w:val="20"/>
-        </w:rPr>
-        <w:t xml:space="preserve">• </w:t>
-      </w:r>
-      <w:r>
-        <w:rPr>
-          <w:rFonts w:ascii="Aptos" w:hAnsi="Aptos"/>
-          <w:color w:val="222222"/>
-          <w:sz w:val="20"/>
-        </w:rPr>
-        <w:t>Used strict equality checks with === for username and password comparison.</w:t>
-      </w:r>
-    </w:p>
-    <w:p>
-      <w:pPr>
-        <w:spacing w:after="44" w:line="250" w:lineRule="auto"/>
-        <w:ind w:left="317" w:hanging="230"/>
-      </w:pPr>
-      <w:r>
-        <w:rPr>
-          <w:rFonts w:ascii="Aptos" w:hAnsi="Aptos"/>
-          <w:b/>
-          <w:color w:val="1F4E79"/>
-          <w:sz w:val="20"/>
-        </w:rPr>
-        <w:t xml:space="preserve">• </w:t>
-      </w:r>
-      <w:r>
-        <w:rPr>
-          <w:rFonts w:ascii="Aptos" w:hAnsi="Aptos"/>
-          <w:color w:val="222222"/>
-          <w:sz w:val="20"/>
-        </w:rPr>
-        <w:t>Used the logical AND operator &amp;&amp; to require both conditions to be true.</w:t>
-      </w:r>
-    </w:p>
-    <w:p>
-      <w:pPr>
-        <w:spacing w:after="44" w:line="250" w:lineRule="auto"/>
-        <w:ind w:left="317" w:hanging="230"/>
-      </w:pPr>
-      <w:r>
-        <w:rPr>
-          <w:rFonts w:ascii="Aptos" w:hAnsi="Aptos"/>
-          <w:b/>
-          <w:color w:val="1F4E79"/>
-          <w:sz w:val="20"/>
-        </w:rPr>
-        <w:t xml:space="preserve">• </w:t>
-      </w:r>
-      <w:r>
-        <w:rPr>
-          <w:rFonts w:ascii="Aptos" w:hAnsi="Aptos"/>
-          <w:color w:val="222222"/>
-          <w:sz w:val="20"/>
-        </w:rPr>
-        <w:t>Displayed feedback to the user with alert().</w:t>
-      </w:r>
-    </w:p>
-    <w:p>
-      <w:pPr>
-        <w:spacing w:after="44" w:line="250" w:lineRule="auto"/>
-        <w:ind w:left="317" w:hanging="230"/>
-      </w:pPr>
-      <w:r>
-        <w:rPr>
-          <w:rFonts w:ascii="Aptos" w:hAnsi="Aptos"/>
-          <w:b/>
-          <w:color w:val="1F4E79"/>
-          <w:sz w:val="20"/>
-        </w:rPr>
-        <w:t xml:space="preserve">• </w:t>
-      </w:r>
-      <w:r>
-        <w:rPr>
-          <w:rFonts w:ascii="Aptos" w:hAnsi="Aptos"/>
-          <w:color w:val="222222"/>
-          <w:sz w:val="20"/>
-        </w:rPr>
-        <w:t>Practiced page navigation using window.location.href.</w:t>
-      </w:r>
-    </w:p>
-    <w:tbl>
-      <w:tblPr>
-        <w:tblW w:type="auto" w:w="0"/>
-        <w:jc w:val="center"/>
-        <w:tblLook w:firstColumn="1" w:firstRow="1" w:lastColumn="0" w:lastRow="0" w:noHBand="0" w:noVBand="1" w:val="04A0"/>
-        <w:tblBorders>
-          <w:top w:val="single" w:sz="4" w:space="0" w:color="C9D5E3"/>
-          <w:left w:val="single" w:sz="4" w:space="0" w:color="C9D5E3"/>
-          <w:bottom w:val="single" w:sz="4" w:space="0" w:color="C9D5E3"/>
-          <w:right w:val="single" w:sz="4" w:space="0" w:color="C9D5E3"/>
-          <w:insideH w:val="single" w:sz="4" w:space="0" w:color="C9D5E3"/>
-          <w:insideV w:val="single" w:sz="4" w:space="0" w:color="C9D5E3"/>
-        </w:tblBorders>
-      </w:tblPr>
-      <w:tblGrid>
-        <w:gridCol w:w="10166"/>
-      </w:tblGrid>
-      <w:tr>
-        <w:trPr>
-          <w:tblHeader w:val="true"/>
-        </w:trPr>
-        <w:tc>
-          <w:tcPr>
-            <w:tcW w:type="dxa" w:w="10166"/>
-            <w:shd w:fill="F4F7FB"/>
-          </w:tcPr>
-          <w:p>
-            <w:pPr>
-              <w:spacing w:after="0"/>
-            </w:pPr>
-            <w:r/>
-            <w:r>
-              <w:rPr>
-                <w:rFonts w:ascii="Consolas" w:hAnsi="Consolas"/>
-                <w:color w:val="2D2D2D"/>
-                <w:sz w:val="17"/>
-              </w:rPr>
-              <w:t>const auth = () =&gt; {</w:t>
+              <w:t>const result = {</w:t>
             </w:r>
           </w:p>
           <w:p>
@@ -2255,9 +2609,9 @@
               <w:rPr>
                 <w:rFonts w:ascii="Consolas" w:hAnsi="Consolas"/>
                 <w:color w:val="2D2D2D"/>
-                <w:sz w:val="17"/>
+                <w:sz w:val="16"/>
               </w:rPr>
-              <w:t xml:space="preserve">    const username = document.getElementById("username").value;</w:t>
+              <w:t xml:space="preserve">    location: data.location.name,</w:t>
             </w:r>
           </w:p>
           <w:p>
@@ -2268,9 +2622,9 @@
               <w:rPr>
                 <w:rFonts w:ascii="Consolas" w:hAnsi="Consolas"/>
                 <w:color w:val="2D2D2D"/>
-                <w:sz w:val="17"/>
+                <w:sz w:val="16"/>
               </w:rPr>
-              <w:t xml:space="preserve">    const password = document.getElementById("password").value;</w:t>
+              <w:t xml:space="preserve">    temperatureF: (weather.temperature * 1.8) + 32,</w:t>
             </w:r>
           </w:p>
           <w:p>
@@ -2281,9 +2635,9 @@
               <w:rPr>
                 <w:rFonts w:ascii="Consolas" w:hAnsi="Consolas"/>
                 <w:color w:val="2D2D2D"/>
-                <w:sz w:val="17"/>
+                <w:sz w:val="16"/>
               </w:rPr>
-              <w:t xml:space="preserve">    if (username === "admin" &amp;&amp; password === "password") {</w:t>
+              <w:t xml:space="preserve">    isHot: weather.temperature &gt; 32 ? "Yes" : "No"</w:t>
             </w:r>
           </w:p>
           <w:p>
@@ -2294,46 +2648,7 @@
               <w:rPr>
                 <w:rFonts w:ascii="Consolas" w:hAnsi="Consolas"/>
                 <w:color w:val="2D2D2D"/>
-                <w:sz w:val="17"/>
-              </w:rPr>
-              <w:t xml:space="preserve">        alert("Authentication Successfull!");</w:t>
-            </w:r>
-          </w:p>
-          <w:p>
-            <w:pPr>
-              <w:spacing w:after="0"/>
-            </w:pPr>
-            <w:r>
-              <w:rPr>
-                <w:rFonts w:ascii="Consolas" w:hAnsi="Consolas"/>
-                <w:color w:val="2D2D2D"/>
-                <w:sz w:val="17"/>
-              </w:rPr>
-              <w:t xml:space="preserve">        window.location.href = "login.html";</w:t>
-            </w:r>
-          </w:p>
-          <w:p>
-            <w:pPr>
-              <w:spacing w:after="0"/>
-            </w:pPr>
-            <w:r>
-              <w:rPr>
-                <w:rFonts w:ascii="Consolas" w:hAnsi="Consolas"/>
-                <w:color w:val="2D2D2D"/>
-                <w:sz w:val="17"/>
-              </w:rPr>
-              <w:t xml:space="preserve">    }</w:t>
-            </w:r>
-          </w:p>
-          <w:p>
-            <w:pPr>
-              <w:spacing w:after="0"/>
-            </w:pPr>
-            <w:r>
-              <w:rPr>
-                <w:rFonts w:ascii="Consolas" w:hAnsi="Consolas"/>
-                <w:color w:val="2D2D2D"/>
-                <w:sz w:val="17"/>
+                <w:sz w:val="16"/>
               </w:rPr>
               <w:t>};</w:t>
             </w:r>
@@ -2349,7 +2664,7 @@
     <w:p>
       <w:pPr>
         <w:pStyle w:val="Heading1"/>
-        <w:spacing w:before="240" w:after="80"/>
+        <w:spacing w:before="220" w:after="80"/>
       </w:pPr>
       <w:r>
         <w:rPr>
@@ -2363,7 +2678,7 @@
     </w:p>
     <w:p>
       <w:pPr>
-        <w:spacing w:after="0" w:line="259" w:lineRule="auto"/>
+        <w:spacing w:after="0" w:line="254" w:lineRule="auto"/>
       </w:pPr>
       <w:r>
         <w:rPr>
@@ -2371,13 +2686,13 @@
           <w:color w:val="222222"/>
           <w:sz w:val="20"/>
         </w:rPr>
-        <w:t>The updated training work shows progress from basic JavaScript syntax to practical browser-based interaction. Day 1 introduced variables, operators, conditions, functions, and simple DOM reading. Day 2 added modern string formatting, arrow functions, array methods, Math methods, type conversion, array mutation, problem-solving scripts, and a basic login flow using HTML, CSS, and JavaScript. These topics are a strong base for upcoming automation and Playwright practice.</w:t>
+        <w:t>The updated training journey now covers four stages: JavaScript basics, browser interaction, array-method problem solving, and asynchronous/API programming. The latest Day4 updates are important because they move from local JavaScript examples into real remote-data workflows: fetching API data, converting JSON responses, filtering and transforming returned records, reading nested objects, creating cleaner result objects, and handling errors. These topics are directly useful for future automation and Playwright API or UI testing practice.</w:t>
       </w:r>
     </w:p>
     <w:sectPr>
       <w:footerReference w:type="default" r:id="rId9"/>
       <w:pgSz w:w="12240" w:h="15840"/>
-      <w:pgMar w:top="893" w:right="1037" w:bottom="893" w:left="1037" w:header="720" w:footer="720" w:gutter="0"/>
+      <w:pgMar w:top="835" w:right="1008" w:bottom="835" w:left="1008" w:header="720" w:footer="720" w:gutter="0"/>
       <w:cols w:space="720"/>
       <w:docGrid w:linePitch="360"/>
     </w:sectPr>
@@ -2399,7 +2714,7 @@
         <w:color w:val="787878"/>
         <w:sz w:val="17"/>
       </w:rPr>
-      <w:t>Synopsis | Updated Day 1 and Day 2 JavaScript Training</w:t>
+      <w:t>Synopsis | Updated Day 1 to Day 4 JavaScript Training</w:t>
     </w:r>
   </w:p>
 </w:ftr>

</xml_diff>

<commit_message>
Updated Day6 / latest changes
</commit_message>
<xml_diff>
--- a/synopsis.docx
+++ b/synopsis.docx
@@ -12,38 +12,39 @@
           <w:rFonts w:ascii="Aptos" w:hAnsi="Aptos"/>
           <w:b/>
           <w:color w:val="1F4E79"/>
-          <w:sz w:val="48"/>
+          <w:sz w:val="46"/>
         </w:rPr>
         <w:t>SYNOPSIS</w:t>
       </w:r>
     </w:p>
     <w:p>
       <w:pPr>
-        <w:spacing w:after="160"/>
+        <w:spacing w:after="60" w:line="247" w:lineRule="auto"/>
         <w:jc w:val="center"/>
       </w:pPr>
       <w:r>
         <w:rPr>
-          <w:rFonts w:ascii="Aptos" w:hAnsi="Aptos"/>
+          <w:rFonts w:ascii="Calibri" w:hAnsi="Calibri"/>
           <w:b/>
           <w:color w:val="595959"/>
-          <w:sz w:val="26"/>
+          <w:sz w:val="25"/>
         </w:rPr>
-        <w:t>Day 1 to Day 4 JavaScript Training Code</w:t>
+        <w:t>Day 1 to Day 6 JavaScript Training Code</w:t>
       </w:r>
     </w:p>
     <w:p>
       <w:pPr>
-        <w:spacing w:after="240"/>
+        <w:spacing w:after="180" w:line="247" w:lineRule="auto"/>
         <w:jc w:val="center"/>
       </w:pPr>
       <w:r>
         <w:rPr>
-          <w:rFonts w:ascii="Aptos" w:hAnsi="Aptos"/>
+          <w:rFonts w:ascii="Calibri" w:hAnsi="Calibri"/>
+          <w:b w:val="0"/>
           <w:color w:val="5F5F5F"/>
           <w:sz w:val="18"/>
         </w:rPr>
-        <w:t>Updated with latest Day4 Promise, fetch, and API practice files</w:t>
+        <w:t>Updated with Day 6 flight, cart, movie analytics, and payroll processing practice</w:t>
       </w:r>
     </w:p>
     <w:tbl>
@@ -61,7 +62,7 @@
         </w:tblBorders>
       </w:tblPr>
       <w:tblGrid>
-        <w:gridCol w:w="10224"/>
+        <w:gridCol w:w="10282"/>
       </w:tblGrid>
       <w:tr>
         <w:trPr>
@@ -69,31 +70,43 @@
         </w:trPr>
         <w:tc>
           <w:tcPr>
-            <w:tcW w:type="dxa" w:w="10224"/>
-            <w:shd w:fill="EAF3FB"/>
+            <w:tcW w:type="dxa" w:w="10282"/>
+            <w:shd w:fill="EAF2F8"/>
             <w:vAlign w:val="center"/>
+            <w:tcBorders>
+              <w:top w:val="single" w:sz="8" w:space="0" w:color="B7C9D6"/>
+              <w:left w:val="single" w:sz="8" w:space="0" w:color="B7C9D6"/>
+              <w:bottom w:val="single" w:sz="8" w:space="0" w:color="B7C9D6"/>
+              <w:right w:val="single" w:sz="8" w:space="0" w:color="B7C9D6"/>
+            </w:tcBorders>
+            <w:tcMar>
+              <w:top w:w="80" w:type="dxa"/>
+              <w:start w:w="100" w:type="dxa"/>
+              <w:bottom w:w="80" w:type="dxa"/>
+              <w:end w:w="100" w:type="dxa"/>
+            </w:tcMar>
           </w:tcPr>
           <w:p>
             <w:pPr>
-              <w:spacing w:after="0" w:line="252" w:lineRule="auto"/>
+              <w:spacing w:after="0" w:line="240" w:lineRule="auto"/>
             </w:pPr>
-            <w:r/>
             <w:r>
               <w:rPr>
-                <w:rFonts w:ascii="Aptos" w:hAnsi="Aptos"/>
+                <w:rFonts w:ascii="Calibri" w:hAnsi="Calibri"/>
                 <w:b/>
                 <w:color w:val="1F4E79"/>
-                <w:sz w:val="19"/>
+                <w:sz w:val="18"/>
               </w:rPr>
               <w:t xml:space="preserve">Overall learning summary: </w:t>
             </w:r>
             <w:r>
               <w:rPr>
-                <w:rFonts w:ascii="Aptos" w:hAnsi="Aptos"/>
+                <w:rFonts w:ascii="Calibri" w:hAnsi="Calibri"/>
+                <w:b w:val="0"/>
                 <w:color w:val="222222"/>
-                <w:sz w:val="19"/>
+                <w:sz w:val="18"/>
               </w:rPr>
-              <w:t>The training now covers JavaScript fundamentals, browser interaction, array problem solving, asynchronous JavaScript, and API consumption. The newest Day4 files add fetch(), JSON response conversion, chained then() processing, API result filtering and mapping, Weatherstack-style API requests, nested response extraction, Fahrenheit conversion, ternary logic, and structured result objects.</w:t>
+              <w:t>The training now covers JavaScript fundamentals, browser interaction, array problem solving, asynchronous/API programming, object-oriented programming, and Day 6 data transformation practice. Day 6 now includes flight cleaning, e-commerce promotions, movie stream analytics, and payroll processing with parsing, validation, JSON strings, callbacks, template literals, and delayed Promise results.</w:t>
             </w:r>
           </w:p>
         </w:tc>
@@ -102,14 +115,14 @@
     <w:p>
       <w:pPr>
         <w:pStyle w:val="Heading1"/>
-        <w:spacing w:before="220" w:after="80"/>
+        <w:spacing w:before="200" w:after="60"/>
       </w:pPr>
       <w:r>
         <w:rPr>
           <w:rFonts w:ascii="Aptos" w:hAnsi="Aptos"/>
           <w:b/>
           <w:color w:val="1F4E79"/>
-          <w:sz w:val="32"/>
+          <w:sz w:val="30"/>
         </w:rPr>
         <w:t>Updated Topic Map</w:t>
       </w:r>
@@ -130,10 +143,10 @@
         </w:tblBorders>
       </w:tblPr>
       <w:tblGrid>
-        <w:gridCol w:w="2556"/>
-        <w:gridCol w:w="2556"/>
-        <w:gridCol w:w="2556"/>
-        <w:gridCol w:w="2556"/>
+        <w:gridCol w:w="2570"/>
+        <w:gridCol w:w="2570"/>
+        <w:gridCol w:w="2570"/>
+        <w:gridCol w:w="2570"/>
       </w:tblGrid>
       <w:tr>
         <w:trPr>
@@ -144,15 +157,34 @@
             <w:tcW w:type="dxa" w:w="1250"/>
             <w:shd w:fill="1F4E79"/>
             <w:vAlign w:val="center"/>
+            <w:tcBorders>
+              <w:top w:val="single" w:sz="8" w:space="0" w:color="B7C9D6"/>
+              <w:left w:val="single" w:sz="8" w:space="0" w:color="B7C9D6"/>
+              <w:bottom w:val="single" w:sz="8" w:space="0" w:color="B7C9D6"/>
+              <w:right w:val="single" w:sz="8" w:space="0" w:color="B7C9D6"/>
+            </w:tcBorders>
+            <w:tcMar>
+              <w:top w:w="90" w:type="dxa"/>
+              <w:start w:w="110" w:type="dxa"/>
+              <w:bottom w:w="90" w:type="dxa"/>
+              <w:end w:w="110" w:type="dxa"/>
+            </w:tcMar>
           </w:tcPr>
           <w:p>
             <w:pPr>
-              <w:spacing w:after="0" w:line="245" w:lineRule="auto"/>
+              <w:spacing w:after="0" w:line="240" w:lineRule="auto"/>
             </w:pPr>
-            <w:r/>
             <w:r>
               <w:rPr>
-                <w:rFonts w:ascii="Aptos" w:hAnsi="Aptos"/>
+                <w:rFonts w:ascii="Calibri" w:hAnsi="Calibri"/>
+                <w:b/>
+                <w:color w:val="FFFFFF"/>
+                <w:sz w:val="17"/>
+              </w:rPr>
+            </w:r>
+            <w:r>
+              <w:rPr>
+                <w:rFonts w:ascii="Calibri" w:hAnsi="Calibri"/>
                 <w:b/>
                 <w:color w:val="FFFFFF"/>
                 <w:sz w:val="17"/>
@@ -163,18 +195,37 @@
         </w:tc>
         <w:tc>
           <w:tcPr>
-            <w:tcW w:type="dxa" w:w="2050"/>
+            <w:tcW w:type="dxa" w:w="2100"/>
             <w:shd w:fill="1F4E79"/>
             <w:vAlign w:val="center"/>
+            <w:tcBorders>
+              <w:top w:val="single" w:sz="8" w:space="0" w:color="B7C9D6"/>
+              <w:left w:val="single" w:sz="8" w:space="0" w:color="B7C9D6"/>
+              <w:bottom w:val="single" w:sz="8" w:space="0" w:color="B7C9D6"/>
+              <w:right w:val="single" w:sz="8" w:space="0" w:color="B7C9D6"/>
+            </w:tcBorders>
+            <w:tcMar>
+              <w:top w:w="90" w:type="dxa"/>
+              <w:start w:w="110" w:type="dxa"/>
+              <w:bottom w:w="90" w:type="dxa"/>
+              <w:end w:w="110" w:type="dxa"/>
+            </w:tcMar>
           </w:tcPr>
           <w:p>
             <w:pPr>
-              <w:spacing w:after="0" w:line="245" w:lineRule="auto"/>
+              <w:spacing w:after="0" w:line="240" w:lineRule="auto"/>
             </w:pPr>
-            <w:r/>
             <w:r>
               <w:rPr>
-                <w:rFonts w:ascii="Aptos" w:hAnsi="Aptos"/>
+                <w:rFonts w:ascii="Calibri" w:hAnsi="Calibri"/>
+                <w:b/>
+                <w:color w:val="FFFFFF"/>
+                <w:sz w:val="17"/>
+              </w:rPr>
+            </w:r>
+            <w:r>
+              <w:rPr>
+                <w:rFonts w:ascii="Calibri" w:hAnsi="Calibri"/>
                 <w:b/>
                 <w:color w:val="FFFFFF"/>
                 <w:sz w:val="17"/>
@@ -185,18 +236,37 @@
         </w:tc>
         <w:tc>
           <w:tcPr>
-            <w:tcW w:type="dxa" w:w="3300"/>
+            <w:tcW w:type="dxa" w:w="3250"/>
             <w:shd w:fill="1F4E79"/>
             <w:vAlign w:val="center"/>
+            <w:tcBorders>
+              <w:top w:val="single" w:sz="8" w:space="0" w:color="B7C9D6"/>
+              <w:left w:val="single" w:sz="8" w:space="0" w:color="B7C9D6"/>
+              <w:bottom w:val="single" w:sz="8" w:space="0" w:color="B7C9D6"/>
+              <w:right w:val="single" w:sz="8" w:space="0" w:color="B7C9D6"/>
+            </w:tcBorders>
+            <w:tcMar>
+              <w:top w:w="90" w:type="dxa"/>
+              <w:start w:w="110" w:type="dxa"/>
+              <w:bottom w:w="90" w:type="dxa"/>
+              <w:end w:w="110" w:type="dxa"/>
+            </w:tcMar>
           </w:tcPr>
           <w:p>
             <w:pPr>
-              <w:spacing w:after="0" w:line="245" w:lineRule="auto"/>
+              <w:spacing w:after="0" w:line="240" w:lineRule="auto"/>
             </w:pPr>
-            <w:r/>
             <w:r>
               <w:rPr>
-                <w:rFonts w:ascii="Aptos" w:hAnsi="Aptos"/>
+                <w:rFonts w:ascii="Calibri" w:hAnsi="Calibri"/>
+                <w:b/>
+                <w:color w:val="FFFFFF"/>
+                <w:sz w:val="17"/>
+              </w:rPr>
+            </w:r>
+            <w:r>
+              <w:rPr>
+                <w:rFonts w:ascii="Calibri" w:hAnsi="Calibri"/>
                 <w:b/>
                 <w:color w:val="FFFFFF"/>
                 <w:sz w:val="17"/>
@@ -210,15 +280,34 @@
             <w:tcW w:type="dxa" w:w="3000"/>
             <w:shd w:fill="1F4E79"/>
             <w:vAlign w:val="center"/>
+            <w:tcBorders>
+              <w:top w:val="single" w:sz="8" w:space="0" w:color="B7C9D6"/>
+              <w:left w:val="single" w:sz="8" w:space="0" w:color="B7C9D6"/>
+              <w:bottom w:val="single" w:sz="8" w:space="0" w:color="B7C9D6"/>
+              <w:right w:val="single" w:sz="8" w:space="0" w:color="B7C9D6"/>
+            </w:tcBorders>
+            <w:tcMar>
+              <w:top w:w="90" w:type="dxa"/>
+              <w:start w:w="110" w:type="dxa"/>
+              <w:bottom w:w="90" w:type="dxa"/>
+              <w:end w:w="110" w:type="dxa"/>
+            </w:tcMar>
           </w:tcPr>
           <w:p>
             <w:pPr>
-              <w:spacing w:after="0" w:line="245" w:lineRule="auto"/>
+              <w:spacing w:after="0" w:line="240" w:lineRule="auto"/>
             </w:pPr>
-            <w:r/>
             <w:r>
               <w:rPr>
-                <w:rFonts w:ascii="Aptos" w:hAnsi="Aptos"/>
+                <w:rFonts w:ascii="Calibri" w:hAnsi="Calibri"/>
+                <w:b/>
+                <w:color w:val="FFFFFF"/>
+                <w:sz w:val="17"/>
+              </w:rPr>
+            </w:r>
+            <w:r>
+              <w:rPr>
+                <w:rFonts w:ascii="Calibri" w:hAnsi="Calibri"/>
                 <w:b/>
                 <w:color w:val="FFFFFF"/>
                 <w:sz w:val="17"/>
@@ -236,7 +325,7 @@
           </w:tcPr>
           <w:p>
             <w:pPr>
-              <w:spacing w:after="0" w:line="245" w:lineRule="auto"/>
+              <w:spacing w:after="0" w:line="240" w:lineRule="auto"/>
             </w:pPr>
             <w:r/>
             <w:r>
@@ -244,7 +333,7 @@
                 <w:rFonts w:ascii="Aptos" w:hAnsi="Aptos"/>
                 <w:b/>
                 <w:color w:val="222222"/>
-                <w:sz w:val="16"/>
+                <w:sz w:val="14"/>
               </w:rPr>
               <w:t>Day 1 basics</w:t>
             </w:r>
@@ -252,12 +341,12 @@
         </w:tc>
         <w:tc>
           <w:tcPr>
-            <w:tcW w:type="dxa" w:w="2050"/>
+            <w:tcW w:type="dxa" w:w="2100"/>
             <w:vAlign w:val="center"/>
           </w:tcPr>
           <w:p>
             <w:pPr>
-              <w:spacing w:after="0" w:line="245" w:lineRule="auto"/>
+              <w:spacing w:after="0" w:line="240" w:lineRule="auto"/>
             </w:pPr>
             <w:r/>
             <w:r>
@@ -265,7 +354,7 @@
                 <w:rFonts w:ascii="Aptos" w:hAnsi="Aptos"/>
                 <w:b w:val="0"/>
                 <w:color w:val="222222"/>
-                <w:sz w:val="16"/>
+                <w:sz w:val="14"/>
               </w:rPr>
               <w:t>index.js</w:t>
               <w:br/>
@@ -281,12 +370,12 @@
         </w:tc>
         <w:tc>
           <w:tcPr>
-            <w:tcW w:type="dxa" w:w="3300"/>
+            <w:tcW w:type="dxa" w:w="3250"/>
             <w:vAlign w:val="center"/>
           </w:tcPr>
           <w:p>
             <w:pPr>
-              <w:spacing w:after="0" w:line="245" w:lineRule="auto"/>
+              <w:spacing w:after="0" w:line="240" w:lineRule="auto"/>
             </w:pPr>
             <w:r/>
             <w:r>
@@ -294,7 +383,7 @@
                 <w:rFonts w:ascii="Aptos" w:hAnsi="Aptos"/>
                 <w:b w:val="0"/>
                 <w:color w:val="222222"/>
-                <w:sz w:val="16"/>
+                <w:sz w:val="14"/>
               </w:rPr>
               <w:t>Variables, strings, operators, conditions, type checking, value swapping, simple DOM input</w:t>
             </w:r>
@@ -307,7 +396,7 @@
           </w:tcPr>
           <w:p>
             <w:pPr>
-              <w:spacing w:after="0" w:line="245" w:lineRule="auto"/>
+              <w:spacing w:after="0" w:line="240" w:lineRule="auto"/>
             </w:pPr>
             <w:r/>
             <w:r>
@@ -315,7 +404,7 @@
                 <w:rFonts w:ascii="Aptos" w:hAnsi="Aptos"/>
                 <w:b w:val="0"/>
                 <w:color w:val="222222"/>
-                <w:sz w:val="16"/>
+                <w:sz w:val="14"/>
               </w:rPr>
               <w:t>Built comfort with syntax, console output, comparisons, branching, typeof checks, and reading input from HTML.</w:t>
             </w:r>
@@ -331,7 +420,7 @@
           </w:tcPr>
           <w:p>
             <w:pPr>
-              <w:spacing w:after="0" w:line="245" w:lineRule="auto"/>
+              <w:spacing w:after="0" w:line="240" w:lineRule="auto"/>
             </w:pPr>
             <w:r/>
             <w:r>
@@ -339,21 +428,21 @@
                 <w:rFonts w:ascii="Aptos" w:hAnsi="Aptos"/>
                 <w:b/>
                 <w:color w:val="222222"/>
-                <w:sz w:val="16"/>
+                <w:sz w:val="14"/>
               </w:rPr>
-              <w:t>Day 2 core JS</w:t>
+              <w:t>Day 2 JS</w:t>
             </w:r>
           </w:p>
         </w:tc>
         <w:tc>
           <w:tcPr>
-            <w:tcW w:type="dxa" w:w="2050"/>
+            <w:tcW w:type="dxa" w:w="2100"/>
             <w:vAlign w:val="center"/>
             <w:shd w:fill="F8FAFD"/>
           </w:tcPr>
           <w:p>
             <w:pPr>
-              <w:spacing w:after="0" w:line="245" w:lineRule="auto"/>
+              <w:spacing w:after="0" w:line="240" w:lineRule="auto"/>
             </w:pPr>
             <w:r/>
             <w:r>
@@ -361,21 +450,27 @@
                 <w:rFonts w:ascii="Aptos" w:hAnsi="Aptos"/>
                 <w:b w:val="0"/>
                 <w:color w:val="222222"/>
-                <w:sz w:val="16"/>
+                <w:sz w:val="14"/>
               </w:rPr>
               <w:t>index.js</w:t>
+              <w:br/>
+              <w:t>q1.js</w:t>
+              <w:br/>
+              <w:t>q2.js</w:t>
+              <w:br/>
+              <w:t>q3.js</w:t>
             </w:r>
           </w:p>
         </w:tc>
         <w:tc>
           <w:tcPr>
-            <w:tcW w:type="dxa" w:w="3300"/>
+            <w:tcW w:type="dxa" w:w="3250"/>
             <w:vAlign w:val="center"/>
             <w:shd w:fill="F8FAFD"/>
           </w:tcPr>
           <w:p>
             <w:pPr>
-              <w:spacing w:after="0" w:line="245" w:lineRule="auto"/>
+              <w:spacing w:after="0" w:line="240" w:lineRule="auto"/>
             </w:pPr>
             <w:r/>
             <w:r>
@@ -383,9 +478,9 @@
                 <w:rFonts w:ascii="Aptos" w:hAnsi="Aptos"/>
                 <w:b w:val="0"/>
                 <w:color w:val="222222"/>
-                <w:sz w:val="16"/>
+                <w:sz w:val="14"/>
               </w:rPr>
-              <w:t>Template literals, functions, arrow functions, filter-map-forEach, Math.random, Math.floor, conversions, array methods</w:t>
+              <w:t>Template literals, functions, arrow functions, array methods, Math, conversion, splice, reduce</w:t>
             </w:r>
           </w:p>
         </w:tc>
@@ -397,7 +492,7 @@
           </w:tcPr>
           <w:p>
             <w:pPr>
-              <w:spacing w:after="0" w:line="245" w:lineRule="auto"/>
+              <w:spacing w:after="0" w:line="240" w:lineRule="auto"/>
             </w:pPr>
             <w:r/>
             <w:r>
@@ -405,9 +500,9 @@
                 <w:rFonts w:ascii="Aptos" w:hAnsi="Aptos"/>
                 <w:b w:val="0"/>
                 <w:color w:val="222222"/>
-                <w:sz w:val="16"/>
+                <w:sz w:val="14"/>
               </w:rPr>
-              <w:t>Practiced functions, array pipelines, random values, number/string conversion, and array add/remove/search operations.</w:t>
+              <w:t>Practiced array pipelines, random values, conversions, guest formatting, high-number filtering, and price calculation.</w:t>
             </w:r>
           </w:p>
         </w:tc>
@@ -420,7 +515,7 @@
           </w:tcPr>
           <w:p>
             <w:pPr>
-              <w:spacing w:after="0" w:line="245" w:lineRule="auto"/>
+              <w:spacing w:after="0" w:line="240" w:lineRule="auto"/>
             </w:pPr>
             <w:r/>
             <w:r>
@@ -428,20 +523,20 @@
                 <w:rFonts w:ascii="Aptos" w:hAnsi="Aptos"/>
                 <w:b/>
                 <w:color w:val="222222"/>
-                <w:sz w:val="16"/>
+                <w:sz w:val="14"/>
               </w:rPr>
-              <w:t>Day 2 questions</w:t>
+              <w:t>Day 2 web</w:t>
             </w:r>
           </w:p>
         </w:tc>
         <w:tc>
           <w:tcPr>
-            <w:tcW w:type="dxa" w:w="2050"/>
+            <w:tcW w:type="dxa" w:w="2100"/>
             <w:vAlign w:val="center"/>
           </w:tcPr>
           <w:p>
             <w:pPr>
-              <w:spacing w:after="0" w:line="245" w:lineRule="auto"/>
+              <w:spacing w:after="0" w:line="240" w:lineRule="auto"/>
             </w:pPr>
             <w:r/>
             <w:r>
@@ -449,24 +544,26 @@
                 <w:rFonts w:ascii="Aptos" w:hAnsi="Aptos"/>
                 <w:b w:val="0"/>
                 <w:color w:val="222222"/>
-                <w:sz w:val="16"/>
+                <w:sz w:val="14"/>
               </w:rPr>
-              <w:t>q1.js</w:t>
+              <w:t>login.html</w:t>
               <w:br/>
-              <w:t>q2.js</w:t>
+              <w:t>login.css</w:t>
               <w:br/>
-              <w:t>q3.js</w:t>
+              <w:t>login.js</w:t>
+              <w:br/>
+              <w:t>app.html</w:t>
             </w:r>
           </w:p>
         </w:tc>
         <w:tc>
           <w:tcPr>
-            <w:tcW w:type="dxa" w:w="3300"/>
+            <w:tcW w:type="dxa" w:w="3250"/>
             <w:vAlign w:val="center"/>
           </w:tcPr>
           <w:p>
             <w:pPr>
-              <w:spacing w:after="0" w:line="245" w:lineRule="auto"/>
+              <w:spacing w:after="0" w:line="240" w:lineRule="auto"/>
             </w:pPr>
             <w:r/>
             <w:r>
@@ -474,9 +571,9 @@
                 <w:rFonts w:ascii="Aptos" w:hAnsi="Aptos"/>
                 <w:b w:val="0"/>
                 <w:color w:val="222222"/>
-                <w:sz w:val="16"/>
+                <w:sz w:val="14"/>
               </w:rPr>
-              <w:t>slice, map, join, chained filter, random threshold, splice, Number, reduce, template literal output</w:t>
+              <w:t>HTML forms, external CSS/JS, DOM value reading, authentication condition, alerts, links, window.location.href</w:t>
             </w:r>
           </w:p>
         </w:tc>
@@ -487,7 +584,7 @@
           </w:tcPr>
           <w:p>
             <w:pPr>
-              <w:spacing w:after="0" w:line="245" w:lineRule="auto"/>
+              <w:spacing w:after="0" w:line="240" w:lineRule="auto"/>
             </w:pPr>
             <w:r/>
             <w:r>
@@ -495,9 +592,9 @@
                 <w:rFonts w:ascii="Aptos" w:hAnsi="Aptos"/>
                 <w:b w:val="0"/>
                 <w:color w:val="222222"/>
-                <w:sz w:val="16"/>
+                <w:sz w:val="14"/>
               </w:rPr>
-              <w:t>Solved guest formatting, high-number filtering, and total price calculation problems.</w:t>
+              <w:t>Created a login screen and connected HTML, CSS, and JavaScript for browser interaction.</w:t>
             </w:r>
           </w:p>
         </w:tc>
@@ -511,7 +608,7 @@
           </w:tcPr>
           <w:p>
             <w:pPr>
-              <w:spacing w:after="0" w:line="245" w:lineRule="auto"/>
+              <w:spacing w:after="0" w:line="240" w:lineRule="auto"/>
             </w:pPr>
             <w:r/>
             <w:r>
@@ -519,21 +616,21 @@
                 <w:rFonts w:ascii="Aptos" w:hAnsi="Aptos"/>
                 <w:b/>
                 <w:color w:val="222222"/>
-                <w:sz w:val="16"/>
+                <w:sz w:val="14"/>
               </w:rPr>
-              <w:t>Day 2 web practice</w:t>
+              <w:t>Day 3 arrays</w:t>
             </w:r>
           </w:p>
         </w:tc>
         <w:tc>
           <w:tcPr>
-            <w:tcW w:type="dxa" w:w="2050"/>
+            <w:tcW w:type="dxa" w:w="2100"/>
             <w:vAlign w:val="center"/>
             <w:shd w:fill="F8FAFD"/>
           </w:tcPr>
           <w:p>
             <w:pPr>
-              <w:spacing w:after="0" w:line="245" w:lineRule="auto"/>
+              <w:spacing w:after="0" w:line="240" w:lineRule="auto"/>
             </w:pPr>
             <w:r/>
             <w:r>
@@ -541,27 +638,21 @@
                 <w:rFonts w:ascii="Aptos" w:hAnsi="Aptos"/>
                 <w:b w:val="0"/>
                 <w:color w:val="222222"/>
-                <w:sz w:val="16"/>
+                <w:sz w:val="14"/>
               </w:rPr>
-              <w:t>login.html</w:t>
-              <w:br/>
-              <w:t>login.css</w:t>
-              <w:br/>
-              <w:t>login.js</w:t>
-              <w:br/>
-              <w:t>app.html</w:t>
+              <w:t>questions.js</w:t>
             </w:r>
           </w:p>
         </w:tc>
         <w:tc>
           <w:tcPr>
-            <w:tcW w:type="dxa" w:w="3300"/>
+            <w:tcW w:type="dxa" w:w="3250"/>
             <w:vAlign w:val="center"/>
             <w:shd w:fill="F8FAFD"/>
           </w:tcPr>
           <w:p>
             <w:pPr>
-              <w:spacing w:after="0" w:line="245" w:lineRule="auto"/>
+              <w:spacing w:after="0" w:line="240" w:lineRule="auto"/>
             </w:pPr>
             <w:r/>
             <w:r>
@@ -569,9 +660,9 @@
                 <w:rFonts w:ascii="Aptos" w:hAnsi="Aptos"/>
                 <w:b w:val="0"/>
                 <w:color w:val="222222"/>
-                <w:sz w:val="16"/>
+                <w:sz w:val="14"/>
               </w:rPr>
-              <w:t>HTML forms, external CSS/JS, DOM value reading, authentication condition, alerts, links, window.location.href</w:t>
+              <w:t>forEach, map, filter, reduce, object arrays, chaining, concat, average calculation, flattening without flat()</w:t>
             </w:r>
           </w:p>
         </w:tc>
@@ -583,7 +674,7 @@
           </w:tcPr>
           <w:p>
             <w:pPr>
-              <w:spacing w:after="0" w:line="245" w:lineRule="auto"/>
+              <w:spacing w:after="0" w:line="240" w:lineRule="auto"/>
             </w:pPr>
             <w:r/>
             <w:r>
@@ -591,9 +682,9 @@
                 <w:rFonts w:ascii="Aptos" w:hAnsi="Aptos"/>
                 <w:b w:val="0"/>
                 <w:color w:val="222222"/>
-                <w:sz w:val="16"/>
+                <w:sz w:val="14"/>
               </w:rPr>
-              <w:t>Created a basic login screen and connected HTML, CSS, and JavaScript for browser interaction.</w:t>
+              <w:t>Solved 10 practice questions from iteration to reduce-based logic and transformation.</w:t>
             </w:r>
           </w:p>
         </w:tc>
@@ -606,7 +697,7 @@
           </w:tcPr>
           <w:p>
             <w:pPr>
-              <w:spacing w:after="0" w:line="245" w:lineRule="auto"/>
+              <w:spacing w:after="0" w:line="240" w:lineRule="auto"/>
             </w:pPr>
             <w:r/>
             <w:r>
@@ -614,20 +705,20 @@
                 <w:rFonts w:ascii="Aptos" w:hAnsi="Aptos"/>
                 <w:b/>
                 <w:color w:val="222222"/>
-                <w:sz w:val="16"/>
+                <w:sz w:val="14"/>
               </w:rPr>
-              <w:t>Day 3 arrays</w:t>
+              <w:t>Day 4 async/API</w:t>
             </w:r>
           </w:p>
         </w:tc>
         <w:tc>
           <w:tcPr>
-            <w:tcW w:type="dxa" w:w="2050"/>
+            <w:tcW w:type="dxa" w:w="2100"/>
             <w:vAlign w:val="center"/>
           </w:tcPr>
           <w:p>
             <w:pPr>
-              <w:spacing w:after="0" w:line="245" w:lineRule="auto"/>
+              <w:spacing w:after="0" w:line="240" w:lineRule="auto"/>
             </w:pPr>
             <w:r/>
             <w:r>
@@ -635,20 +726,24 @@
                 <w:rFonts w:ascii="Aptos" w:hAnsi="Aptos"/>
                 <w:b w:val="0"/>
                 <w:color w:val="222222"/>
-                <w:sz w:val="16"/>
+                <w:sz w:val="14"/>
               </w:rPr>
-              <w:t>questions.js</w:t>
+              <w:t>index.js</w:t>
+              <w:br/>
+              <w:t>promise.js</w:t>
+              <w:br/>
+              <w:t>api.js</w:t>
             </w:r>
           </w:p>
         </w:tc>
         <w:tc>
           <w:tcPr>
-            <w:tcW w:type="dxa" w:w="3300"/>
+            <w:tcW w:type="dxa" w:w="3250"/>
             <w:vAlign w:val="center"/>
           </w:tcPr>
           <w:p>
             <w:pPr>
-              <w:spacing w:after="0" w:line="245" w:lineRule="auto"/>
+              <w:spacing w:after="0" w:line="240" w:lineRule="auto"/>
             </w:pPr>
             <w:r/>
             <w:r>
@@ -656,9 +751,9 @@
                 <w:rFonts w:ascii="Aptos" w:hAnsi="Aptos"/>
                 <w:b w:val="0"/>
                 <w:color w:val="222222"/>
-                <w:sz w:val="16"/>
+                <w:sz w:val="14"/>
               </w:rPr>
-              <w:t>forEach, map, filter, reduce, object arrays, chaining, concat, average calculation, flattening without flat()</w:t>
+              <w:t>Promise, resolve/reject, then/catch, setTimeout, setInterval, fetch, JSON parsing, API transformation</w:t>
             </w:r>
           </w:p>
         </w:tc>
@@ -669,7 +764,7 @@
           </w:tcPr>
           <w:p>
             <w:pPr>
-              <w:spacing w:after="0" w:line="245" w:lineRule="auto"/>
+              <w:spacing w:after="0" w:line="240" w:lineRule="auto"/>
             </w:pPr>
             <w:r/>
             <w:r>
@@ -677,9 +772,9 @@
                 <w:rFonts w:ascii="Aptos" w:hAnsi="Aptos"/>
                 <w:b w:val="0"/>
                 <w:color w:val="222222"/>
-                <w:sz w:val="16"/>
+                <w:sz w:val="14"/>
               </w:rPr>
-              <w:t>Solved 10 practice questions across warm-up, filtering, reduce, transformation, extraction, and logic challenges.</w:t>
+              <w:t>Practiced async flow, API calls, filtering/mapping remote data, Weatherstack-style transformation, and error handling.</w:t>
             </w:r>
           </w:p>
         </w:tc>
@@ -693,7 +788,7 @@
           </w:tcPr>
           <w:p>
             <w:pPr>
-              <w:spacing w:after="0" w:line="245" w:lineRule="auto"/>
+              <w:spacing w:after="0" w:line="240" w:lineRule="auto"/>
             </w:pPr>
             <w:r/>
             <w:r>
@@ -701,21 +796,21 @@
                 <w:rFonts w:ascii="Aptos" w:hAnsi="Aptos"/>
                 <w:b/>
                 <w:color w:val="222222"/>
-                <w:sz w:val="16"/>
+                <w:sz w:val="14"/>
               </w:rPr>
-              <w:t>Day 4 async</w:t>
+              <w:t>Day 5 async tools</w:t>
             </w:r>
           </w:p>
         </w:tc>
         <w:tc>
           <w:tcPr>
-            <w:tcW w:type="dxa" w:w="2050"/>
+            <w:tcW w:type="dxa" w:w="2100"/>
             <w:vAlign w:val="center"/>
             <w:shd w:fill="F8FAFD"/>
           </w:tcPr>
           <w:p>
             <w:pPr>
-              <w:spacing w:after="0" w:line="245" w:lineRule="auto"/>
+              <w:spacing w:after="0" w:line="240" w:lineRule="auto"/>
             </w:pPr>
             <w:r/>
             <w:r>
@@ -723,23 +818,23 @@
                 <w:rFonts w:ascii="Aptos" w:hAnsi="Aptos"/>
                 <w:b w:val="0"/>
                 <w:color w:val="222222"/>
-                <w:sz w:val="16"/>
+                <w:sz w:val="14"/>
               </w:rPr>
-              <w:t>index.js</w:t>
+              <w:t>index1.js</w:t>
               <w:br/>
-              <w:t>promise.js</w:t>
+              <w:t>index2.js</w:t>
             </w:r>
           </w:p>
         </w:tc>
         <w:tc>
           <w:tcPr>
-            <w:tcW w:type="dxa" w:w="3300"/>
+            <w:tcW w:type="dxa" w:w="3250"/>
             <w:vAlign w:val="center"/>
             <w:shd w:fill="F8FAFD"/>
           </w:tcPr>
           <w:p>
             <w:pPr>
-              <w:spacing w:after="0" w:line="245" w:lineRule="auto"/>
+              <w:spacing w:after="0" w:line="240" w:lineRule="auto"/>
             </w:pPr>
             <w:r/>
             <w:r>
@@ -747,9 +842,9 @@
                 <w:rFonts w:ascii="Aptos" w:hAnsi="Aptos"/>
                 <w:b w:val="0"/>
                 <w:color w:val="222222"/>
-                <w:sz w:val="16"/>
+                <w:sz w:val="14"/>
               </w:rPr>
-              <w:t>Promise, resolve, reject, then, catch, conditional rejection, asynchronous delay, setTimeout, setInterval, fetch, JSON parsing</w:t>
+              <w:t>async, await, fetch with await, JSON.stringify, JSON.parse, clearTimeout, clearInterval</w:t>
             </w:r>
           </w:p>
         </w:tc>
@@ -761,7 +856,7 @@
           </w:tcPr>
           <w:p>
             <w:pPr>
-              <w:spacing w:after="0" w:line="245" w:lineRule="auto"/>
+              <w:spacing w:after="0" w:line="240" w:lineRule="auto"/>
             </w:pPr>
             <w:r/>
             <w:r>
@@ -769,9 +864,9 @@
                 <w:rFonts w:ascii="Aptos" w:hAnsi="Aptos"/>
                 <w:b w:val="0"/>
                 <w:color w:val="222222"/>
-                <w:sz w:val="16"/>
+                <w:sz w:val="14"/>
               </w:rPr>
-              <w:t>Practiced async flow, rejection handling, chained API calls, filtering API data, mapping API titles, delayed output, and repeated checking.</w:t>
+              <w:t>Moved from promise chains into async/await and practiced converting objects to strings and strings back to objects.</w:t>
             </w:r>
           </w:p>
         </w:tc>
@@ -784,7 +879,7 @@
           </w:tcPr>
           <w:p>
             <w:pPr>
-              <w:spacing w:after="0" w:line="245" w:lineRule="auto"/>
+              <w:spacing w:after="0" w:line="240" w:lineRule="auto"/>
             </w:pPr>
             <w:r/>
             <w:r>
@@ -792,20 +887,20 @@
                 <w:rFonts w:ascii="Aptos" w:hAnsi="Aptos"/>
                 <w:b/>
                 <w:color w:val="222222"/>
-                <w:sz w:val="16"/>
+                <w:sz w:val="14"/>
               </w:rPr>
-              <w:t>Day 4 API</w:t>
+              <w:t>Day 5 OOP basics</w:t>
             </w:r>
           </w:p>
         </w:tc>
         <w:tc>
           <w:tcPr>
-            <w:tcW w:type="dxa" w:w="2050"/>
+            <w:tcW w:type="dxa" w:w="2100"/>
             <w:vAlign w:val="center"/>
           </w:tcPr>
           <w:p>
             <w:pPr>
-              <w:spacing w:after="0" w:line="245" w:lineRule="auto"/>
+              <w:spacing w:after="0" w:line="240" w:lineRule="auto"/>
             </w:pPr>
             <w:r/>
             <w:r>
@@ -813,20 +908,24 @@
                 <w:rFonts w:ascii="Aptos" w:hAnsi="Aptos"/>
                 <w:b w:val="0"/>
                 <w:color w:val="222222"/>
-                <w:sz w:val="16"/>
+                <w:sz w:val="14"/>
               </w:rPr>
-              <w:t>api.js</w:t>
+              <w:t>oops.js</w:t>
+              <w:br/>
+              <w:t>inher.js</w:t>
+              <w:br/>
+              <w:t>poly.js</w:t>
             </w:r>
           </w:p>
         </w:tc>
         <w:tc>
           <w:tcPr>
-            <w:tcW w:type="dxa" w:w="3300"/>
+            <w:tcW w:type="dxa" w:w="3250"/>
             <w:vAlign w:val="center"/>
           </w:tcPr>
           <w:p>
             <w:pPr>
-              <w:spacing w:after="0" w:line="245" w:lineRule="auto"/>
+              <w:spacing w:after="0" w:line="240" w:lineRule="auto"/>
             </w:pPr>
             <w:r/>
             <w:r>
@@ -834,9 +933,9 @@
                 <w:rFonts w:ascii="Aptos" w:hAnsi="Aptos"/>
                 <w:b w:val="0"/>
                 <w:color w:val="222222"/>
-                <w:sz w:val="16"/>
+                <w:sz w:val="14"/>
               </w:rPr>
-              <w:t>API key placeholder, template literal URL, Weatherstack request, response object access, Fahrenheit conversion, ternary operator, structured result object</w:t>
+              <w:t>class, constructor, object creation, methods, inheritance, extends, super, method overriding, polymorphism</w:t>
             </w:r>
           </w:p>
         </w:tc>
@@ -847,7 +946,7 @@
           </w:tcPr>
           <w:p>
             <w:pPr>
-              <w:spacing w:after="0" w:line="245" w:lineRule="auto"/>
+              <w:spacing w:after="0" w:line="240" w:lineRule="auto"/>
             </w:pPr>
             <w:r/>
             <w:r>
@@ -855,9 +954,243 @@
                 <w:rFonts w:ascii="Aptos" w:hAnsi="Aptos"/>
                 <w:b w:val="0"/>
                 <w:color w:val="222222"/>
-                <w:sz w:val="16"/>
+                <w:sz w:val="14"/>
               </w:rPr>
-              <w:t>Practiced calling a weather API, reading nested response fields, transforming weather data, and handling API errors.</w:t>
+              <w:t>Created classes and objects, reused parent behavior, and showed different child classes responding to the same method.</w:t>
+            </w:r>
+          </w:p>
+        </w:tc>
+      </w:tr>
+      <w:tr>
+        <w:tc>
+          <w:tcPr>
+            <w:tcW w:type="dxa" w:w="1250"/>
+            <w:vAlign w:val="center"/>
+            <w:shd w:fill="F8FAFD"/>
+          </w:tcPr>
+          <w:p>
+            <w:pPr>
+              <w:spacing w:after="0" w:line="240" w:lineRule="auto"/>
+            </w:pPr>
+            <w:r/>
+            <w:r>
+              <w:rPr>
+                <w:rFonts w:ascii="Aptos" w:hAnsi="Aptos"/>
+                <w:b/>
+                <w:color w:val="222222"/>
+                <w:sz w:val="14"/>
+              </w:rPr>
+              <w:t>Day 5 OOP pillars</w:t>
+            </w:r>
+          </w:p>
+        </w:tc>
+        <w:tc>
+          <w:tcPr>
+            <w:tcW w:type="dxa" w:w="2100"/>
+            <w:vAlign w:val="center"/>
+            <w:shd w:fill="F8FAFD"/>
+          </w:tcPr>
+          <w:p>
+            <w:pPr>
+              <w:spacing w:after="0" w:line="240" w:lineRule="auto"/>
+            </w:pPr>
+            <w:r/>
+            <w:r>
+              <w:rPr>
+                <w:rFonts w:ascii="Aptos" w:hAnsi="Aptos"/>
+                <w:b w:val="0"/>
+                <w:color w:val="222222"/>
+                <w:sz w:val="14"/>
+              </w:rPr>
+              <w:t>encap.js</w:t>
+              <w:br/>
+              <w:t>Abstraction.js</w:t>
+              <w:br/>
+              <w:t>Assesment.js</w:t>
+            </w:r>
+          </w:p>
+        </w:tc>
+        <w:tc>
+          <w:tcPr>
+            <w:tcW w:type="dxa" w:w="3250"/>
+            <w:vAlign w:val="center"/>
+            <w:shd w:fill="F8FAFD"/>
+          </w:tcPr>
+          <w:p>
+            <w:pPr>
+              <w:spacing w:after="0" w:line="240" w:lineRule="auto"/>
+            </w:pPr>
+            <w:r/>
+            <w:r>
+              <w:rPr>
+                <w:rFonts w:ascii="Aptos" w:hAnsi="Aptos"/>
+                <w:b w:val="0"/>
+                <w:color w:val="222222"/>
+                <w:sz w:val="14"/>
+              </w:rPr>
+              <w:t>encapsulation, private fields, abstraction, private methods, validation, inheritance, polymorphism</w:t>
+            </w:r>
+          </w:p>
+        </w:tc>
+        <w:tc>
+          <w:tcPr>
+            <w:tcW w:type="dxa" w:w="3000"/>
+            <w:vAlign w:val="center"/>
+            <w:shd w:fill="F8FAFD"/>
+          </w:tcPr>
+          <w:p>
+            <w:pPr>
+              <w:spacing w:after="0" w:line="240" w:lineRule="auto"/>
+            </w:pPr>
+            <w:r/>
+            <w:r>
+              <w:rPr>
+                <w:rFonts w:ascii="Aptos" w:hAnsi="Aptos"/>
+                <w:b w:val="0"/>
+                <w:color w:val="222222"/>
+                <w:sz w:val="14"/>
+              </w:rPr>
+              <w:t>Practiced BankAccount, CoffeeMachine, ShoppingCart, FoodOrder, Person/Student, and Animal examples covering all OOP pillars.</w:t>
+            </w:r>
+          </w:p>
+        </w:tc>
+      </w:tr>
+      <w:tr>
+        <w:tc>
+          <w:tcPr>
+            <w:tcW w:type="dxa" w:w="2570"/>
+            <w:vAlign w:val="center"/>
+            <w:tcBorders>
+              <w:top w:val="single" w:sz="8" w:space="0" w:color="B7C9D6"/>
+              <w:left w:val="single" w:sz="8" w:space="0" w:color="B7C9D6"/>
+              <w:bottom w:val="single" w:sz="8" w:space="0" w:color="B7C9D6"/>
+              <w:right w:val="single" w:sz="8" w:space="0" w:color="B7C9D6"/>
+            </w:tcBorders>
+            <w:tcMar>
+              <w:top w:w="80" w:type="dxa"/>
+              <w:start w:w="100" w:type="dxa"/>
+              <w:bottom w:w="80" w:type="dxa"/>
+              <w:end w:w="100" w:type="dxa"/>
+            </w:tcMar>
+            <w:shd w:fill="FFFFFF"/>
+          </w:tcPr>
+          <w:p>
+            <w:pPr>
+              <w:spacing w:after="0" w:line="240" w:lineRule="auto"/>
+            </w:pPr>
+            <w:r>
+              <w:rPr>
+                <w:rFonts w:ascii="Calibri" w:hAnsi="Calibri"/>
+                <w:b w:val="0"/>
+                <w:color w:val="222222"/>
+                <w:sz w:val="14"/>
+              </w:rPr>
+              <w:t>Day 6 data processing</w:t>
+            </w:r>
+          </w:p>
+        </w:tc>
+        <w:tc>
+          <w:tcPr>
+            <w:tcW w:type="dxa" w:w="2570"/>
+            <w:vAlign w:val="center"/>
+            <w:tcBorders>
+              <w:top w:val="single" w:sz="8" w:space="0" w:color="B7C9D6"/>
+              <w:left w:val="single" w:sz="8" w:space="0" w:color="B7C9D6"/>
+              <w:bottom w:val="single" w:sz="8" w:space="0" w:color="B7C9D6"/>
+              <w:right w:val="single" w:sz="8" w:space="0" w:color="B7C9D6"/>
+            </w:tcBorders>
+            <w:tcMar>
+              <w:top w:w="80" w:type="dxa"/>
+              <w:start w:w="100" w:type="dxa"/>
+              <w:bottom w:w="80" w:type="dxa"/>
+              <w:end w:w="100" w:type="dxa"/>
+            </w:tcMar>
+            <w:shd w:fill="FFFFFF"/>
+          </w:tcPr>
+          <w:p>
+            <w:pPr>
+              <w:spacing w:after="0" w:line="240" w:lineRule="auto"/>
+            </w:pPr>
+            <w:r>
+              <w:rPr>
+                <w:rFonts w:ascii="Calibri" w:hAnsi="Calibri"/>
+                <w:b w:val="0"/>
+                <w:color w:val="222222"/>
+                <w:sz w:val="14"/>
+              </w:rPr>
+              <w:t>q1_flight_booking_cleaner.js</w:t>
+              <w:br/>
+              <w:t>q2_ecommerce_discount_applicator.js</w:t>
+              <w:br/>
+              <w:t>q3_movie_stream_analytics.js</w:t>
+              <w:br/>
+              <w:t>q4_automated_payroll_processor.js</w:t>
+            </w:r>
+          </w:p>
+        </w:tc>
+        <w:tc>
+          <w:tcPr>
+            <w:tcW w:type="dxa" w:w="2570"/>
+            <w:vAlign w:val="center"/>
+            <w:tcBorders>
+              <w:top w:val="single" w:sz="8" w:space="0" w:color="B7C9D6"/>
+              <w:left w:val="single" w:sz="8" w:space="0" w:color="B7C9D6"/>
+              <w:bottom w:val="single" w:sz="8" w:space="0" w:color="B7C9D6"/>
+              <w:right w:val="single" w:sz="8" w:space="0" w:color="B7C9D6"/>
+            </w:tcBorders>
+            <w:tcMar>
+              <w:top w:w="80" w:type="dxa"/>
+              <w:start w:w="100" w:type="dxa"/>
+              <w:bottom w:w="80" w:type="dxa"/>
+              <w:end w:w="100" w:type="dxa"/>
+            </w:tcMar>
+            <w:shd w:fill="FFFFFF"/>
+          </w:tcPr>
+          <w:p>
+            <w:pPr>
+              <w:spacing w:after="0" w:line="240" w:lineRule="auto"/>
+            </w:pPr>
+            <w:r>
+              <w:rPr>
+                <w:rFonts w:ascii="Calibri" w:hAnsi="Calibri"/>
+                <w:b w:val="0"/>
+                <w:color w:val="222222"/>
+                <w:sz w:val="14"/>
+              </w:rPr>
+              <w:t>Parsing, Number conversion, validation, filter, sort, JSON.stringify, callbacks, map, object spread, reduce, template literals, setTimeout, Promise</w:t>
+            </w:r>
+          </w:p>
+        </w:tc>
+        <w:tc>
+          <w:tcPr>
+            <w:tcW w:type="dxa" w:w="2570"/>
+            <w:vAlign w:val="center"/>
+            <w:tcBorders>
+              <w:top w:val="single" w:sz="8" w:space="0" w:color="B7C9D6"/>
+              <w:left w:val="single" w:sz="8" w:space="0" w:color="B7C9D6"/>
+              <w:bottom w:val="single" w:sz="8" w:space="0" w:color="B7C9D6"/>
+              <w:right w:val="single" w:sz="8" w:space="0" w:color="B7C9D6"/>
+            </w:tcBorders>
+            <w:tcMar>
+              <w:top w:w="80" w:type="dxa"/>
+              <w:start w:w="100" w:type="dxa"/>
+              <w:bottom w:w="80" w:type="dxa"/>
+              <w:end w:w="100" w:type="dxa"/>
+            </w:tcMar>
+            <w:shd w:fill="FFFFFF"/>
+          </w:tcPr>
+          <w:p>
+            <w:pPr>
+              <w:spacing w:after="0" w:line="240" w:lineRule="auto"/>
+            </w:pPr>
+            <w:r>
+              <w:rPr>
+                <w:rFonts w:ascii="Calibri" w:hAnsi="Calibri"/>
+                <w:b w:val="0"/>
+                <w:color w:val="222222"/>
+                <w:sz w:val="14"/>
+              </w:rPr>
+              <w:t>Cleaned flights, applied cart discounts, ranked top movie streams, and processed payroll with net salaries and status labels.</w:t>
             </w:r>
           </w:p>
         </w:tc>
@@ -866,57 +1199,42 @@
     <w:p>
       <w:pPr>
         <w:pStyle w:val="Heading1"/>
-        <w:spacing w:before="220" w:after="80"/>
+        <w:spacing w:before="200" w:after="60"/>
       </w:pPr>
       <w:r>
         <w:rPr>
           <w:rFonts w:ascii="Aptos" w:hAnsi="Aptos"/>
           <w:b/>
           <w:color w:val="1F4E79"/>
-          <w:sz w:val="32"/>
+          <w:sz w:val="30"/>
         </w:rPr>
         <w:t>Day 1 Synopsis</w:t>
       </w:r>
     </w:p>
     <w:p>
       <w:pPr>
-        <w:spacing w:after="100" w:line="254" w:lineRule="auto"/>
+        <w:spacing w:after="80" w:line="250" w:lineRule="auto"/>
       </w:pPr>
       <w:r>
         <w:rPr>
           <w:rFonts w:ascii="Aptos" w:hAnsi="Aptos"/>
           <w:color w:val="222222"/>
-          <w:sz w:val="20"/>
+          <w:sz w:val="19"/>
         </w:rPr>
         <w:t>Day 1 focused on JavaScript foundations and the first connection between HTML and JavaScript. The code showed how values are stored, printed, compared, checked, and changed.</w:t>
       </w:r>
     </w:p>
     <w:p>
       <w:pPr>
-        <w:pStyle w:val="Heading2"/>
-        <w:spacing w:before="120" w:after="80"/>
+        <w:spacing w:after="24" w:line="240" w:lineRule="auto"/>
+        <w:ind w:left="288" w:hanging="202"/>
       </w:pPr>
       <w:r>
         <w:rPr>
           <w:rFonts w:ascii="Aptos" w:hAnsi="Aptos"/>
           <w:b/>
           <w:color w:val="1F4E79"/>
-          <w:sz w:val="24"/>
-        </w:rPr>
-        <w:t>Day 1 Topics Practiced</w:t>
-      </w:r>
-    </w:p>
-    <w:p>
-      <w:pPr>
-        <w:spacing w:after="32" w:line="245" w:lineRule="auto"/>
-        <w:ind w:left="317" w:hanging="230"/>
-      </w:pPr>
-      <w:r>
-        <w:rPr>
-          <w:rFonts w:ascii="Aptos" w:hAnsi="Aptos"/>
-          <w:b/>
-          <w:color w:val="1F4E79"/>
-          <w:sz w:val="19"/>
+          <w:sz w:val="18"/>
         </w:rPr>
         <w:t xml:space="preserve">- </w:t>
       </w:r>
@@ -924,22 +1242,22 @@
         <w:rPr>
           <w:rFonts w:ascii="Aptos" w:hAnsi="Aptos"/>
           <w:color w:val="222222"/>
-          <w:sz w:val="19"/>
+          <w:sz w:val="18"/>
         </w:rPr>
         <w:t>Variables with let for storing numbers and strings.</w:t>
       </w:r>
     </w:p>
     <w:p>
       <w:pPr>
-        <w:spacing w:after="32" w:line="245" w:lineRule="auto"/>
-        <w:ind w:left="317" w:hanging="230"/>
+        <w:spacing w:after="24" w:line="240" w:lineRule="auto"/>
+        <w:ind w:left="288" w:hanging="202"/>
       </w:pPr>
       <w:r>
         <w:rPr>
           <w:rFonts w:ascii="Aptos" w:hAnsi="Aptos"/>
           <w:b/>
           <w:color w:val="1F4E79"/>
-          <w:sz w:val="19"/>
+          <w:sz w:val="18"/>
         </w:rPr>
         <w:t xml:space="preserve">- </w:t>
       </w:r>
@@ -947,22 +1265,22 @@
         <w:rPr>
           <w:rFonts w:ascii="Aptos" w:hAnsi="Aptos"/>
           <w:color w:val="222222"/>
-          <w:sz w:val="19"/>
+          <w:sz w:val="18"/>
         </w:rPr>
-        <w:t>String methods and properties such as length, toUpperCase(), toLowerCase(), and substring().</w:t>
+        <w:t>String methods and properties: length, toUpperCase(), toLowerCase(), and substring().</w:t>
       </w:r>
     </w:p>
     <w:p>
       <w:pPr>
-        <w:spacing w:after="32" w:line="245" w:lineRule="auto"/>
-        <w:ind w:left="317" w:hanging="230"/>
+        <w:spacing w:after="24" w:line="240" w:lineRule="auto"/>
+        <w:ind w:left="288" w:hanging="202"/>
       </w:pPr>
       <w:r>
         <w:rPr>
           <w:rFonts w:ascii="Aptos" w:hAnsi="Aptos"/>
           <w:b/>
           <w:color w:val="1F4E79"/>
-          <w:sz w:val="19"/>
+          <w:sz w:val="18"/>
         </w:rPr>
         <w:t xml:space="preserve">- </w:t>
       </w:r>
@@ -970,22 +1288,22 @@
         <w:rPr>
           <w:rFonts w:ascii="Aptos" w:hAnsi="Aptos"/>
           <w:color w:val="222222"/>
-          <w:sz w:val="19"/>
+          <w:sz w:val="18"/>
         </w:rPr>
         <w:t>Arithmetic and comparison operators for calculations and boolean results.</w:t>
       </w:r>
     </w:p>
     <w:p>
       <w:pPr>
-        <w:spacing w:after="32" w:line="245" w:lineRule="auto"/>
-        <w:ind w:left="317" w:hanging="230"/>
+        <w:spacing w:after="24" w:line="240" w:lineRule="auto"/>
+        <w:ind w:left="288" w:hanging="202"/>
       </w:pPr>
       <w:r>
         <w:rPr>
           <w:rFonts w:ascii="Aptos" w:hAnsi="Aptos"/>
           <w:b/>
           <w:color w:val="1F4E79"/>
-          <w:sz w:val="19"/>
+          <w:sz w:val="18"/>
         </w:rPr>
         <w:t xml:space="preserve">- </w:t>
       </w:r>
@@ -993,22 +1311,22 @@
         <w:rPr>
           <w:rFonts w:ascii="Aptos" w:hAnsi="Aptos"/>
           <w:color w:val="222222"/>
-          <w:sz w:val="19"/>
+          <w:sz w:val="18"/>
         </w:rPr>
         <w:t>Conditional flow using if-else and switch-case.</w:t>
       </w:r>
     </w:p>
     <w:p>
       <w:pPr>
-        <w:spacing w:after="32" w:line="245" w:lineRule="auto"/>
-        <w:ind w:left="317" w:hanging="230"/>
+        <w:spacing w:after="24" w:line="240" w:lineRule="auto"/>
+        <w:ind w:left="288" w:hanging="202"/>
       </w:pPr>
       <w:r>
         <w:rPr>
           <w:rFonts w:ascii="Aptos" w:hAnsi="Aptos"/>
           <w:b/>
           <w:color w:val="1F4E79"/>
-          <w:sz w:val="19"/>
+          <w:sz w:val="18"/>
         </w:rPr>
         <w:t xml:space="preserve">- </w:t>
       </w:r>
@@ -1016,22 +1334,22 @@
         <w:rPr>
           <w:rFonts w:ascii="Aptos" w:hAnsi="Aptos"/>
           <w:color w:val="222222"/>
-          <w:sz w:val="19"/>
+          <w:sz w:val="18"/>
         </w:rPr>
         <w:t>Type checking with typeof inside a checkType() function.</w:t>
       </w:r>
     </w:p>
     <w:p>
       <w:pPr>
-        <w:spacing w:after="32" w:line="245" w:lineRule="auto"/>
-        <w:ind w:left="317" w:hanging="230"/>
+        <w:spacing w:after="24" w:line="240" w:lineRule="auto"/>
+        <w:ind w:left="288" w:hanging="202"/>
       </w:pPr>
       <w:r>
         <w:rPr>
           <w:rFonts w:ascii="Aptos" w:hAnsi="Aptos"/>
           <w:b/>
           <w:color w:val="1F4E79"/>
-          <w:sz w:val="19"/>
+          <w:sz w:val="18"/>
         </w:rPr>
         <w:t xml:space="preserve">- </w:t>
       </w:r>
@@ -1039,22 +1357,22 @@
         <w:rPr>
           <w:rFonts w:ascii="Aptos" w:hAnsi="Aptos"/>
           <w:color w:val="222222"/>
-          <w:sz w:val="19"/>
+          <w:sz w:val="18"/>
         </w:rPr>
         <w:t>Swapping values using a temporary variable.</w:t>
       </w:r>
     </w:p>
     <w:p>
       <w:pPr>
-        <w:spacing w:after="32" w:line="245" w:lineRule="auto"/>
-        <w:ind w:left="317" w:hanging="230"/>
+        <w:spacing w:after="24" w:line="240" w:lineRule="auto"/>
+        <w:ind w:left="288" w:hanging="202"/>
       </w:pPr>
       <w:r>
         <w:rPr>
           <w:rFonts w:ascii="Aptos" w:hAnsi="Aptos"/>
           <w:b/>
           <w:color w:val="1F4E79"/>
-          <w:sz w:val="19"/>
+          <w:sz w:val="18"/>
         </w:rPr>
         <w:t xml:space="preserve">- </w:t>
       </w:r>
@@ -1062,65 +1380,50 @@
         <w:rPr>
           <w:rFonts w:ascii="Aptos" w:hAnsi="Aptos"/>
           <w:color w:val="222222"/>
-          <w:sz w:val="19"/>
+          <w:sz w:val="18"/>
         </w:rPr>
-        <w:t>Simple HTML input handling with getElementById(), reading .value, printing it, and clearing the input box.</w:t>
+        <w:t>Simple HTML input handling with getElementById(), .value, console output, and clearing the input box.</w:t>
       </w:r>
     </w:p>
     <w:p>
       <w:pPr>
         <w:pStyle w:val="Heading1"/>
-        <w:spacing w:before="220" w:after="80"/>
+        <w:spacing w:before="200" w:after="60"/>
       </w:pPr>
       <w:r>
         <w:rPr>
           <w:rFonts w:ascii="Aptos" w:hAnsi="Aptos"/>
           <w:b/>
           <w:color w:val="1F4E79"/>
-          <w:sz w:val="32"/>
+          <w:sz w:val="30"/>
         </w:rPr>
         <w:t>Day 2 Synopsis</w:t>
       </w:r>
     </w:p>
     <w:p>
       <w:pPr>
-        <w:spacing w:after="100" w:line="254" w:lineRule="auto"/>
+        <w:spacing w:after="80" w:line="250" w:lineRule="auto"/>
       </w:pPr>
       <w:r>
         <w:rPr>
           <w:rFonts w:ascii="Aptos" w:hAnsi="Aptos"/>
           <w:color w:val="222222"/>
-          <w:sz w:val="20"/>
+          <w:sz w:val="19"/>
         </w:rPr>
-        <w:t>Day 2 expanded the basics into modern syntax, array operations, and browser practice. It included template literals, arrow functions, array pipelines, Math methods, type conversion, array mutation, and a basic login flow.</w:t>
+        <w:t>Day 2 expanded the basics into modern syntax, array operations, browser practice, and small problem-solving scripts.</w:t>
       </w:r>
     </w:p>
     <w:p>
       <w:pPr>
-        <w:pStyle w:val="Heading2"/>
-        <w:spacing w:before="120" w:after="80"/>
+        <w:spacing w:after="24" w:line="240" w:lineRule="auto"/>
+        <w:ind w:left="288" w:hanging="202"/>
       </w:pPr>
       <w:r>
         <w:rPr>
           <w:rFonts w:ascii="Aptos" w:hAnsi="Aptos"/>
           <w:b/>
           <w:color w:val="1F4E79"/>
-          <w:sz w:val="24"/>
-        </w:rPr>
-        <w:t>Day 2 Topics Practiced</w:t>
-      </w:r>
-    </w:p>
-    <w:p>
-      <w:pPr>
-        <w:spacing w:after="32" w:line="245" w:lineRule="auto"/>
-        <w:ind w:left="317" w:hanging="230"/>
-      </w:pPr>
-      <w:r>
-        <w:rPr>
-          <w:rFonts w:ascii="Aptos" w:hAnsi="Aptos"/>
-          <w:b/>
-          <w:color w:val="1F4E79"/>
-          <w:sz w:val="19"/>
+          <w:sz w:val="18"/>
         </w:rPr>
         <w:t xml:space="preserve">- </w:t>
       </w:r>
@@ -1128,22 +1431,22 @@
         <w:rPr>
           <w:rFonts w:ascii="Aptos" w:hAnsi="Aptos"/>
           <w:color w:val="222222"/>
-          <w:sz w:val="19"/>
+          <w:sz w:val="18"/>
         </w:rPr>
-        <w:t>Template literals using backticks and ${} placeholders.</w:t>
+        <w:t>Template literals, string concatenation, multiplication-table output, and arrow functions.</w:t>
       </w:r>
     </w:p>
     <w:p>
       <w:pPr>
-        <w:spacing w:after="32" w:line="245" w:lineRule="auto"/>
-        <w:ind w:left="317" w:hanging="230"/>
+        <w:spacing w:after="24" w:line="240" w:lineRule="auto"/>
+        <w:ind w:left="288" w:hanging="202"/>
       </w:pPr>
       <w:r>
         <w:rPr>
           <w:rFonts w:ascii="Aptos" w:hAnsi="Aptos"/>
           <w:b/>
           <w:color w:val="1F4E79"/>
-          <w:sz w:val="19"/>
+          <w:sz w:val="18"/>
         </w:rPr>
         <w:t xml:space="preserve">- </w:t>
       </w:r>
@@ -1151,22 +1454,22 @@
         <w:rPr>
           <w:rFonts w:ascii="Aptos" w:hAnsi="Aptos"/>
           <w:color w:val="222222"/>
-          <w:sz w:val="19"/>
+          <w:sz w:val="18"/>
         </w:rPr>
-        <w:t>A multiplication table function that returns multi-line text.</w:t>
+        <w:t>Array pipelines using filter(), map(), and forEach().</w:t>
       </w:r>
     </w:p>
     <w:p>
       <w:pPr>
-        <w:spacing w:after="32" w:line="245" w:lineRule="auto"/>
-        <w:ind w:left="317" w:hanging="230"/>
+        <w:spacing w:after="24" w:line="240" w:lineRule="auto"/>
+        <w:ind w:left="288" w:hanging="202"/>
       </w:pPr>
       <w:r>
         <w:rPr>
           <w:rFonts w:ascii="Aptos" w:hAnsi="Aptos"/>
           <w:b/>
           <w:color w:val="1F4E79"/>
-          <w:sz w:val="19"/>
+          <w:sz w:val="18"/>
         </w:rPr>
         <w:t xml:space="preserve">- </w:t>
       </w:r>
@@ -1174,22 +1477,22 @@
         <w:rPr>
           <w:rFonts w:ascii="Aptos" w:hAnsi="Aptos"/>
           <w:color w:val="222222"/>
-          <w:sz w:val="19"/>
+          <w:sz w:val="18"/>
         </w:rPr>
-        <w:t>Arrow functions and array pipelines with filter(), map(), and forEach().</w:t>
+        <w:t>Math.random(), Math.floor(), Number(), String(), parseInt(), and parseFloat().</w:t>
       </w:r>
     </w:p>
     <w:p>
       <w:pPr>
-        <w:spacing w:after="32" w:line="245" w:lineRule="auto"/>
-        <w:ind w:left="317" w:hanging="230"/>
+        <w:spacing w:after="24" w:line="240" w:lineRule="auto"/>
+        <w:ind w:left="288" w:hanging="202"/>
       </w:pPr>
       <w:r>
         <w:rPr>
           <w:rFonts w:ascii="Aptos" w:hAnsi="Aptos"/>
           <w:b/>
           <w:color w:val="1F4E79"/>
-          <w:sz w:val="19"/>
+          <w:sz w:val="18"/>
         </w:rPr>
         <w:t xml:space="preserve">- </w:t>
       </w:r>
@@ -1197,22 +1500,22 @@
         <w:rPr>
           <w:rFonts w:ascii="Aptos" w:hAnsi="Aptos"/>
           <w:color w:val="222222"/>
-          <w:sz w:val="19"/>
+          <w:sz w:val="18"/>
         </w:rPr>
-        <w:t>Random number generation with Math.random() and Math.floor().</w:t>
+        <w:t>Array methods: indexOf(), includes(), push(), pop(), unshift(), shift(), splice(), slice(), join(), and reduce().</w:t>
       </w:r>
     </w:p>
     <w:p>
       <w:pPr>
-        <w:spacing w:after="32" w:line="245" w:lineRule="auto"/>
-        <w:ind w:left="317" w:hanging="230"/>
+        <w:spacing w:after="24" w:line="240" w:lineRule="auto"/>
+        <w:ind w:left="288" w:hanging="202"/>
       </w:pPr>
       <w:r>
         <w:rPr>
           <w:rFonts w:ascii="Aptos" w:hAnsi="Aptos"/>
           <w:b/>
           <w:color w:val="1F4E79"/>
-          <w:sz w:val="19"/>
+          <w:sz w:val="18"/>
         </w:rPr>
         <w:t xml:space="preserve">- </w:t>
       </w:r>
@@ -1220,22 +1523,22 @@
         <w:rPr>
           <w:rFonts w:ascii="Aptos" w:hAnsi="Aptos"/>
           <w:color w:val="222222"/>
-          <w:sz w:val="19"/>
+          <w:sz w:val="18"/>
         </w:rPr>
-        <w:t>Type conversion with Number(), String(), parseInt(), and parseFloat().</w:t>
+        <w:t>Practice files for guest formatting, high-number filtering, and total price calculation.</w:t>
       </w:r>
     </w:p>
     <w:p>
       <w:pPr>
-        <w:spacing w:after="32" w:line="245" w:lineRule="auto"/>
-        <w:ind w:left="317" w:hanging="230"/>
+        <w:spacing w:after="24" w:line="240" w:lineRule="auto"/>
+        <w:ind w:left="288" w:hanging="202"/>
       </w:pPr>
       <w:r>
         <w:rPr>
           <w:rFonts w:ascii="Aptos" w:hAnsi="Aptos"/>
           <w:b/>
           <w:color w:val="1F4E79"/>
-          <w:sz w:val="19"/>
+          <w:sz w:val="18"/>
         </w:rPr>
         <w:t xml:space="preserve">- </w:t>
       </w:r>
@@ -1243,55 +1546,9 @@
         <w:rPr>
           <w:rFonts w:ascii="Aptos" w:hAnsi="Aptos"/>
           <w:color w:val="222222"/>
-          <w:sz w:val="19"/>
+          <w:sz w:val="18"/>
         </w:rPr>
-        <w:t>Array methods including indexOf(), includes(), push(), pop(), unshift(), shift(), and splice().</w:t>
-      </w:r>
-    </w:p>
-    <w:p>
-      <w:pPr>
-        <w:spacing w:after="32" w:line="245" w:lineRule="auto"/>
-        <w:ind w:left="317" w:hanging="230"/>
-      </w:pPr>
-      <w:r>
-        <w:rPr>
-          <w:rFonts w:ascii="Aptos" w:hAnsi="Aptos"/>
-          <w:b/>
-          <w:color w:val="1F4E79"/>
-          <w:sz w:val="19"/>
-        </w:rPr>
-        <w:t xml:space="preserve">- </w:t>
-      </w:r>
-      <w:r>
-        <w:rPr>
-          <w:rFonts w:ascii="Aptos" w:hAnsi="Aptos"/>
-          <w:color w:val="222222"/>
-          <w:sz w:val="19"/>
-        </w:rPr>
-        <w:t>Practice questions using slice(), join(), chained filter(), random thresholds, Number(), reduce(), and template literal output.</w:t>
-      </w:r>
-    </w:p>
-    <w:p>
-      <w:pPr>
-        <w:spacing w:after="32" w:line="245" w:lineRule="auto"/>
-        <w:ind w:left="317" w:hanging="230"/>
-      </w:pPr>
-      <w:r>
-        <w:rPr>
-          <w:rFonts w:ascii="Aptos" w:hAnsi="Aptos"/>
-          <w:b/>
-          <w:color w:val="1F4E79"/>
-          <w:sz w:val="19"/>
-        </w:rPr>
-        <w:t xml:space="preserve">- </w:t>
-      </w:r>
-      <w:r>
-        <w:rPr>
-          <w:rFonts w:ascii="Aptos" w:hAnsi="Aptos"/>
-          <w:color w:val="222222"/>
-          <w:sz w:val="19"/>
-        </w:rPr>
-        <w:t>Login practice with HTML inputs, external CSS/JS, document.getElementById().value, strict equality, &amp;&amp;, alert(), links, and window.location.href.</w:t>
+        <w:t>Login page practice with HTML inputs, CSS styling, external JavaScript, strict equality, &amp;&amp;, alert(), and window.location.href.</w:t>
       </w:r>
     </w:p>
     <w:tbl>
@@ -1309,7 +1566,7 @@
         </w:tblBorders>
       </w:tblPr>
       <w:tblGrid>
-        <w:gridCol w:w="10224"/>
+        <w:gridCol w:w="10282"/>
       </w:tblGrid>
       <w:tr>
         <w:trPr>
@@ -1317,7 +1574,7 @@
         </w:trPr>
         <w:tc>
           <w:tcPr>
-            <w:tcW w:type="dxa" w:w="10224"/>
+            <w:tcW w:type="dxa" w:w="10282"/>
             <w:shd w:fill="F4F7FB"/>
           </w:tcPr>
           <w:p>
@@ -1329,20 +1586,7 @@
               <w:rPr>
                 <w:rFonts w:ascii="Consolas" w:hAnsi="Consolas"/>
                 <w:color w:val="2D2D2D"/>
-                <w:sz w:val="16"/>
-              </w:rPr>
-              <w:t>arr.filter(x =&gt; typeof x === "number").map(y =&gt; y * 2);</w:t>
-            </w:r>
-          </w:p>
-          <w:p>
-            <w:pPr>
-              <w:spacing w:after="0"/>
-            </w:pPr>
-            <w:r>
-              <w:rPr>
-                <w:rFonts w:ascii="Consolas" w:hAnsi="Consolas"/>
-                <w:color w:val="2D2D2D"/>
-                <w:sz w:val="16"/>
+                <w:sz w:val="15"/>
               </w:rPr>
               <w:t>const guests = names.slice(1).map(name =&gt; `Guest: ${name}`);</w:t>
             </w:r>
@@ -1355,9 +1599,9 @@
               <w:rPr>
                 <w:rFonts w:ascii="Consolas" w:hAnsi="Consolas"/>
                 <w:color w:val="2D2D2D"/>
-                <w:sz w:val="16"/>
+                <w:sz w:val="15"/>
               </w:rPr>
-              <w:t>prices.splice(prices.length - 1, 1);</w:t>
+              <w:t>const totalPrice = numberPrices.reduce((total, price) =&gt; total + price, 0);</w:t>
             </w:r>
           </w:p>
           <w:p>
@@ -1368,7 +1612,7 @@
               <w:rPr>
                 <w:rFonts w:ascii="Consolas" w:hAnsi="Consolas"/>
                 <w:color w:val="2D2D2D"/>
-                <w:sz w:val="16"/>
+                <w:sz w:val="15"/>
               </w:rPr>
               <w:t>if (username === "admin" &amp;&amp; password === "password") { alert("Authentication Successfull!"); }</w:t>
             </w:r>
@@ -1378,63 +1622,48 @@
     </w:tbl>
     <w:p>
       <w:pPr>
-        <w:spacing w:after="20"/>
+        <w:spacing w:after="0"/>
       </w:pPr>
     </w:p>
     <w:p>
       <w:pPr>
         <w:pStyle w:val="Heading1"/>
-        <w:spacing w:before="220" w:after="80"/>
+        <w:spacing w:before="200" w:after="60"/>
       </w:pPr>
       <w:r>
         <w:rPr>
           <w:rFonts w:ascii="Aptos" w:hAnsi="Aptos"/>
           <w:b/>
           <w:color w:val="1F4E79"/>
-          <w:sz w:val="32"/>
+          <w:sz w:val="30"/>
         </w:rPr>
         <w:t>Day 3 Array Method Practice</w:t>
       </w:r>
     </w:p>
     <w:p>
       <w:pPr>
-        <w:spacing w:after="100" w:line="254" w:lineRule="auto"/>
+        <w:spacing w:after="80" w:line="250" w:lineRule="auto"/>
       </w:pPr>
       <w:r>
         <w:rPr>
           <w:rFonts w:ascii="Aptos" w:hAnsi="Aptos"/>
           <w:color w:val="222222"/>
-          <w:sz w:val="20"/>
+          <w:sz w:val="19"/>
         </w:rPr>
         <w:t>Day 3 was a focused practice day for JavaScript array methods. The questions.js file solved 10 questions arranged by level, moving from basic iteration to reduce-based logic and array transformation.</w:t>
       </w:r>
     </w:p>
     <w:p>
       <w:pPr>
-        <w:pStyle w:val="Heading2"/>
-        <w:spacing w:before="120" w:after="80"/>
+        <w:spacing w:after="24" w:line="240" w:lineRule="auto"/>
+        <w:ind w:left="288" w:hanging="202"/>
       </w:pPr>
       <w:r>
         <w:rPr>
           <w:rFonts w:ascii="Aptos" w:hAnsi="Aptos"/>
           <w:b/>
           <w:color w:val="1F4E79"/>
-          <w:sz w:val="24"/>
-        </w:rPr>
-        <w:t>Day 3 Topics Practiced</w:t>
-      </w:r>
-    </w:p>
-    <w:p>
-      <w:pPr>
-        <w:spacing w:after="32" w:line="245" w:lineRule="auto"/>
-        <w:ind w:left="317" w:hanging="230"/>
-      </w:pPr>
-      <w:r>
-        <w:rPr>
-          <w:rFonts w:ascii="Aptos" w:hAnsi="Aptos"/>
-          <w:b/>
-          <w:color w:val="1F4E79"/>
-          <w:sz w:val="19"/>
+          <w:sz w:val="18"/>
         </w:rPr>
         <w:t xml:space="preserve">- </w:t>
       </w:r>
@@ -1442,22 +1671,22 @@
         <w:rPr>
           <w:rFonts w:ascii="Aptos" w:hAnsi="Aptos"/>
           <w:color w:val="222222"/>
-          <w:sz w:val="19"/>
+          <w:sz w:val="18"/>
         </w:rPr>
-        <w:t>Used forEach() to loop through names and print each one with a greeting prefix.</w:t>
+        <w:t>Used forEach() to print names with a greeting prefix.</w:t>
       </w:r>
     </w:p>
     <w:p>
       <w:pPr>
-        <w:spacing w:after="32" w:line="245" w:lineRule="auto"/>
-        <w:ind w:left="317" w:hanging="230"/>
+        <w:spacing w:after="24" w:line="240" w:lineRule="auto"/>
+        <w:ind w:left="288" w:hanging="202"/>
       </w:pPr>
       <w:r>
         <w:rPr>
           <w:rFonts w:ascii="Aptos" w:hAnsi="Aptos"/>
           <w:b/>
           <w:color w:val="1F4E79"/>
-          <w:sz w:val="19"/>
+          <w:sz w:val="18"/>
         </w:rPr>
         <w:t xml:space="preserve">- </w:t>
       </w:r>
@@ -1465,22 +1694,22 @@
         <w:rPr>
           <w:rFonts w:ascii="Aptos" w:hAnsi="Aptos"/>
           <w:color w:val="222222"/>
-          <w:sz w:val="19"/>
+          <w:sz w:val="18"/>
         </w:rPr>
-        <w:t>Used map() to convert Celsius values to Fahrenheit with F = C * 1.8 + 32.</w:t>
+        <w:t>Used map() to convert Celsius values to Fahrenheit.</w:t>
       </w:r>
     </w:p>
     <w:p>
       <w:pPr>
-        <w:spacing w:after="32" w:line="245" w:lineRule="auto"/>
-        <w:ind w:left="317" w:hanging="230"/>
+        <w:spacing w:after="24" w:line="240" w:lineRule="auto"/>
+        <w:ind w:left="288" w:hanging="202"/>
       </w:pPr>
       <w:r>
         <w:rPr>
           <w:rFonts w:ascii="Aptos" w:hAnsi="Aptos"/>
           <w:b/>
           <w:color w:val="1F4E79"/>
-          <w:sz w:val="19"/>
+          <w:sz w:val="18"/>
         </w:rPr>
         <w:t xml:space="preserve">- </w:t>
       </w:r>
@@ -1488,22 +1717,22 @@
         <w:rPr>
           <w:rFonts w:ascii="Aptos" w:hAnsi="Aptos"/>
           <w:color w:val="222222"/>
-          <w:sz w:val="19"/>
+          <w:sz w:val="18"/>
         </w:rPr>
-        <w:t>Filtered an array of user objects to keep only adults with age &gt;= 18.</w:t>
+        <w:t>Filtered user objects to keep adults with age &gt;= 18 and strings longer than 5 characters.</w:t>
       </w:r>
     </w:p>
     <w:p>
       <w:pPr>
-        <w:spacing w:after="32" w:line="245" w:lineRule="auto"/>
-        <w:ind w:left="317" w:hanging="230"/>
+        <w:spacing w:after="24" w:line="240" w:lineRule="auto"/>
+        <w:ind w:left="288" w:hanging="202"/>
       </w:pPr>
       <w:r>
         <w:rPr>
           <w:rFonts w:ascii="Aptos" w:hAnsi="Aptos"/>
           <w:b/>
           <w:color w:val="1F4E79"/>
-          <w:sz w:val="19"/>
+          <w:sz w:val="18"/>
         </w:rPr>
         <w:t xml:space="preserve">- </w:t>
       </w:r>
@@ -1511,22 +1740,22 @@
         <w:rPr>
           <w:rFonts w:ascii="Aptos" w:hAnsi="Aptos"/>
           <w:color w:val="222222"/>
-          <w:sz w:val="19"/>
+          <w:sz w:val="18"/>
         </w:rPr>
-        <w:t>Created an arrow function that filters strings longer than 5 characters.</w:t>
+        <w:t>Used reduce() to calculate total cost, count apple occurrences, and calculate average score.</w:t>
       </w:r>
     </w:p>
     <w:p>
       <w:pPr>
-        <w:spacing w:after="32" w:line="245" w:lineRule="auto"/>
-        <w:ind w:left="317" w:hanging="230"/>
+        <w:spacing w:after="24" w:line="240" w:lineRule="auto"/>
+        <w:ind w:left="288" w:hanging="202"/>
       </w:pPr>
       <w:r>
         <w:rPr>
           <w:rFonts w:ascii="Aptos" w:hAnsi="Aptos"/>
           <w:b/>
           <w:color w:val="1F4E79"/>
-          <w:sz w:val="19"/>
+          <w:sz w:val="18"/>
         </w:rPr>
         <w:t xml:space="preserve">- </w:t>
       </w:r>
@@ -1534,22 +1763,22 @@
         <w:rPr>
           <w:rFonts w:ascii="Aptos" w:hAnsi="Aptos"/>
           <w:color w:val="222222"/>
-          <w:sz w:val="19"/>
+          <w:sz w:val="18"/>
         </w:rPr>
-        <w:t>Used reduce() with an initial value of 0 to calculate total cost.</w:t>
+        <w:t>Formatted cost output with toFixed(2).</w:t>
       </w:r>
     </w:p>
     <w:p>
       <w:pPr>
-        <w:spacing w:after="32" w:line="245" w:lineRule="auto"/>
-        <w:ind w:left="317" w:hanging="230"/>
+        <w:spacing w:after="24" w:line="240" w:lineRule="auto"/>
+        <w:ind w:left="288" w:hanging="202"/>
       </w:pPr>
       <w:r>
         <w:rPr>
           <w:rFonts w:ascii="Aptos" w:hAnsi="Aptos"/>
           <w:b/>
           <w:color w:val="1F4E79"/>
-          <w:sz w:val="19"/>
+          <w:sz w:val="18"/>
         </w:rPr>
         <w:t xml:space="preserve">- </w:t>
       </w:r>
@@ -1557,22 +1786,22 @@
         <w:rPr>
           <w:rFonts w:ascii="Aptos" w:hAnsi="Aptos"/>
           <w:color w:val="222222"/>
-          <w:sz w:val="19"/>
+          <w:sz w:val="18"/>
         </w:rPr>
-        <w:t>Formatted cost output with toFixed(2).</w:t>
+        <w:t>Combined filter() and map() to square only even numbers.</w:t>
       </w:r>
     </w:p>
     <w:p>
       <w:pPr>
-        <w:spacing w:after="32" w:line="245" w:lineRule="auto"/>
-        <w:ind w:left="317" w:hanging="230"/>
+        <w:spacing w:after="24" w:line="240" w:lineRule="auto"/>
+        <w:ind w:left="288" w:hanging="202"/>
       </w:pPr>
       <w:r>
         <w:rPr>
           <w:rFonts w:ascii="Aptos" w:hAnsi="Aptos"/>
           <w:b/>
           <w:color w:val="1F4E79"/>
-          <w:sz w:val="19"/>
+          <w:sz w:val="18"/>
         </w:rPr>
         <w:t xml:space="preserve">- </w:t>
       </w:r>
@@ -1580,22 +1809,22 @@
         <w:rPr>
           <w:rFonts w:ascii="Aptos" w:hAnsi="Aptos"/>
           <w:color w:val="222222"/>
-          <w:sz w:val="19"/>
+          <w:sz w:val="18"/>
         </w:rPr>
-        <w:t>Used reduce() and a ternary operator to count occurrences of "apple".</w:t>
+        <w:t>Extracted product titles from object arrays using map().</w:t>
       </w:r>
     </w:p>
     <w:p>
       <w:pPr>
-        <w:spacing w:after="32" w:line="245" w:lineRule="auto"/>
-        <w:ind w:left="317" w:hanging="230"/>
+        <w:spacing w:after="24" w:line="240" w:lineRule="auto"/>
+        <w:ind w:left="288" w:hanging="202"/>
       </w:pPr>
       <w:r>
         <w:rPr>
           <w:rFonts w:ascii="Aptos" w:hAnsi="Aptos"/>
           <w:b/>
           <w:color w:val="1F4E79"/>
-          <w:sz w:val="19"/>
+          <w:sz w:val="18"/>
         </w:rPr>
         <w:t xml:space="preserve">- </w:t>
       </w:r>
@@ -1603,78 +1832,9 @@
         <w:rPr>
           <w:rFonts w:ascii="Aptos" w:hAnsi="Aptos"/>
           <w:color w:val="222222"/>
-          <w:sz w:val="19"/>
+          <w:sz w:val="18"/>
         </w:rPr>
-        <w:t>Combined filter() and map() to square only even numbers.</w:t>
-      </w:r>
-    </w:p>
-    <w:p>
-      <w:pPr>
-        <w:spacing w:after="32" w:line="245" w:lineRule="auto"/>
-        <w:ind w:left="317" w:hanging="230"/>
-      </w:pPr>
-      <w:r>
-        <w:rPr>
-          <w:rFonts w:ascii="Aptos" w:hAnsi="Aptos"/>
-          <w:b/>
-          <w:color w:val="1F4E79"/>
-          <w:sz w:val="19"/>
-        </w:rPr>
-        <w:t xml:space="preserve">- </w:t>
-      </w:r>
-      <w:r>
-        <w:rPr>
-          <w:rFonts w:ascii="Aptos" w:hAnsi="Aptos"/>
-          <w:color w:val="222222"/>
-          <w:sz w:val="19"/>
-        </w:rPr>
-        <w:t>Extracted product titles from object arrays using map().</w:t>
-      </w:r>
-    </w:p>
-    <w:p>
-      <w:pPr>
-        <w:spacing w:after="32" w:line="245" w:lineRule="auto"/>
-        <w:ind w:left="317" w:hanging="230"/>
-      </w:pPr>
-      <w:r>
-        <w:rPr>
-          <w:rFonts w:ascii="Aptos" w:hAnsi="Aptos"/>
-          <w:b/>
-          <w:color w:val="1F4E79"/>
-          <w:sz w:val="19"/>
-        </w:rPr>
-        <w:t xml:space="preserve">- </w:t>
-      </w:r>
-      <w:r>
-        <w:rPr>
-          <w:rFonts w:ascii="Aptos" w:hAnsi="Aptos"/>
-          <w:color w:val="222222"/>
-          <w:sz w:val="19"/>
-        </w:rPr>
-        <w:t>Calculated an average score using reduce() and scores.length.</w:t>
-      </w:r>
-    </w:p>
-    <w:p>
-      <w:pPr>
-        <w:spacing w:after="32" w:line="245" w:lineRule="auto"/>
-        <w:ind w:left="317" w:hanging="230"/>
-      </w:pPr>
-      <w:r>
-        <w:rPr>
-          <w:rFonts w:ascii="Aptos" w:hAnsi="Aptos"/>
-          <w:b/>
-          <w:color w:val="1F4E79"/>
-          <w:sz w:val="19"/>
-        </w:rPr>
-        <w:t xml:space="preserve">- </w:t>
-      </w:r>
-      <w:r>
-        <w:rPr>
-          <w:rFonts w:ascii="Aptos" w:hAnsi="Aptos"/>
-          <w:color w:val="222222"/>
-          <w:sz w:val="19"/>
-        </w:rPr>
-        <w:t>Flattened a nested array without flat() by using reduce() with concat().</w:t>
+        <w:t>Flattened nested arrays without flat() by using reduce() with concat().</w:t>
       </w:r>
     </w:p>
     <w:tbl>
@@ -1692,7 +1852,7 @@
         </w:tblBorders>
       </w:tblPr>
       <w:tblGrid>
-        <w:gridCol w:w="10224"/>
+        <w:gridCol w:w="10282"/>
       </w:tblGrid>
       <w:tr>
         <w:trPr>
@@ -1700,7 +1860,7 @@
         </w:trPr>
         <w:tc>
           <w:tcPr>
-            <w:tcW w:type="dxa" w:w="10224"/>
+            <w:tcW w:type="dxa" w:w="10282"/>
             <w:shd w:fill="F4F7FB"/>
           </w:tcPr>
           <w:p>
@@ -1712,7 +1872,7 @@
               <w:rPr>
                 <w:rFonts w:ascii="Consolas" w:hAnsi="Consolas"/>
                 <w:color w:val="2D2D2D"/>
-                <w:sz w:val="16"/>
+                <w:sz w:val="15"/>
               </w:rPr>
               <w:t>names.forEach(name =&gt; console.log(`Hello, ${name}`));</w:t>
             </w:r>
@@ -1725,7 +1885,7 @@
               <w:rPr>
                 <w:rFonts w:ascii="Consolas" w:hAnsi="Consolas"/>
                 <w:color w:val="2D2D2D"/>
-                <w:sz w:val="16"/>
+                <w:sz w:val="15"/>
               </w:rPr>
               <w:t>const adults = users.filter(user =&gt; user.age &gt;= 18);</w:t>
             </w:r>
@@ -1738,7 +1898,7 @@
               <w:rPr>
                 <w:rFonts w:ascii="Consolas" w:hAnsi="Consolas"/>
                 <w:color w:val="2D2D2D"/>
-                <w:sz w:val="16"/>
+                <w:sz w:val="15"/>
               </w:rPr>
               <w:t>const totalCost = prices.reduce((total, price) =&gt; total + price, 0);</w:t>
             </w:r>
@@ -1751,7 +1911,7 @@
               <w:rPr>
                 <w:rFonts w:ascii="Consolas" w:hAnsi="Consolas"/>
                 <w:color w:val="2D2D2D"/>
-                <w:sz w:val="16"/>
+                <w:sz w:val="15"/>
               </w:rPr>
               <w:t>const flatNumbers = nestedNumbers.reduce((flatArray, currentArray) =&gt; flatArray.concat(currentArray), []);</w:t>
             </w:r>
@@ -1761,63 +1921,48 @@
     </w:tbl>
     <w:p>
       <w:pPr>
-        <w:spacing w:after="20"/>
+        <w:spacing w:after="0"/>
       </w:pPr>
     </w:p>
     <w:p>
       <w:pPr>
         <w:pStyle w:val="Heading1"/>
-        <w:spacing w:before="220" w:after="80"/>
+        <w:spacing w:before="200" w:after="60"/>
       </w:pPr>
       <w:r>
         <w:rPr>
           <w:rFonts w:ascii="Aptos" w:hAnsi="Aptos"/>
           <w:b/>
           <w:color w:val="1F4E79"/>
-          <w:sz w:val="32"/>
+          <w:sz w:val="30"/>
         </w:rPr>
-        <w:t>Day 4 Asynchronous JavaScript</w:t>
+        <w:t>Day 4 Asynchronous and API Practice</w:t>
       </w:r>
     </w:p>
     <w:p>
       <w:pPr>
-        <w:spacing w:after="100" w:line="254" w:lineRule="auto"/>
+        <w:spacing w:after="80" w:line="250" w:lineRule="auto"/>
       </w:pPr>
       <w:r>
         <w:rPr>
           <w:rFonts w:ascii="Aptos" w:hAnsi="Aptos"/>
           <w:color w:val="222222"/>
-          <w:sz w:val="20"/>
+          <w:sz w:val="19"/>
         </w:rPr>
-        <w:t>Day 4 now contains Promise practice plus real API-style practice. The code demonstrates manual Promise creation, rejection handling, timer functions, fetch requests, JSON parsing, API response transformation, and error handling.</w:t>
+        <w:t>Day 4 introduced asynchronous JavaScript and remote API consumption. The files demonstrate manual Promise creation, rejection handling, timers, fetch requests, JSON parsing, response transformation, and error handling.</w:t>
       </w:r>
     </w:p>
     <w:p>
       <w:pPr>
-        <w:pStyle w:val="Heading2"/>
-        <w:spacing w:before="120" w:after="80"/>
+        <w:spacing w:after="24" w:line="240" w:lineRule="auto"/>
+        <w:ind w:left="288" w:hanging="202"/>
       </w:pPr>
       <w:r>
         <w:rPr>
           <w:rFonts w:ascii="Aptos" w:hAnsi="Aptos"/>
           <w:b/>
           <w:color w:val="1F4E79"/>
-          <w:sz w:val="24"/>
-        </w:rPr>
-        <w:t>Promise and Timer Topics Practiced</w:t>
-      </w:r>
-    </w:p>
-    <w:p>
-      <w:pPr>
-        <w:spacing w:after="32" w:line="245" w:lineRule="auto"/>
-        <w:ind w:left="317" w:hanging="230"/>
-      </w:pPr>
-      <w:r>
-        <w:rPr>
-          <w:rFonts w:ascii="Aptos" w:hAnsi="Aptos"/>
-          <w:b/>
-          <w:color w:val="1F4E79"/>
-          <w:sz w:val="19"/>
+          <w:sz w:val="18"/>
         </w:rPr>
         <w:t xml:space="preserve">- </w:t>
       </w:r>
@@ -1825,22 +1970,22 @@
         <w:rPr>
           <w:rFonts w:ascii="Aptos" w:hAnsi="Aptos"/>
           <w:color w:val="222222"/>
-          <w:sz w:val="19"/>
+          <w:sz w:val="18"/>
         </w:rPr>
-        <w:t>Created getData() to return a new Promise.</w:t>
+        <w:t>Created getData() to return a Promise and practiced resolve(), reject(), .then(), and .catch().</w:t>
       </w:r>
     </w:p>
     <w:p>
       <w:pPr>
-        <w:spacing w:after="32" w:line="245" w:lineRule="auto"/>
-        <w:ind w:left="317" w:hanging="230"/>
+        <w:spacing w:after="24" w:line="240" w:lineRule="auto"/>
+        <w:ind w:left="288" w:hanging="202"/>
       </w:pPr>
       <w:r>
         <w:rPr>
           <w:rFonts w:ascii="Aptos" w:hAnsi="Aptos"/>
           <w:b/>
           <w:color w:val="1F4E79"/>
-          <w:sz w:val="19"/>
+          <w:sz w:val="18"/>
         </w:rPr>
         <w:t xml:space="preserve">- </w:t>
       </w:r>
@@ -1848,22 +1993,22 @@
         <w:rPr>
           <w:rFonts w:ascii="Aptos" w:hAnsi="Aptos"/>
           <w:color w:val="222222"/>
-          <w:sz w:val="19"/>
+          <w:sz w:val="18"/>
         </w:rPr>
-        <w:t>Used resolve() in reference code and reject() in active code to understand both success and error paths.</w:t>
+        <w:t>Used setTimeout() for delayed work and setInterval() for repeated checking.</w:t>
       </w:r>
     </w:p>
     <w:p>
       <w:pPr>
-        <w:spacing w:after="32" w:line="245" w:lineRule="auto"/>
-        <w:ind w:left="317" w:hanging="230"/>
+        <w:spacing w:after="24" w:line="240" w:lineRule="auto"/>
+        <w:ind w:left="288" w:hanging="202"/>
       </w:pPr>
       <w:r>
         <w:rPr>
           <w:rFonts w:ascii="Aptos" w:hAnsi="Aptos"/>
           <w:b/>
           <w:color w:val="1F4E79"/>
-          <w:sz w:val="19"/>
+          <w:sz w:val="18"/>
         </w:rPr>
         <w:t xml:space="preserve">- </w:t>
       </w:r>
@@ -1871,22 +2016,22 @@
         <w:rPr>
           <w:rFonts w:ascii="Aptos" w:hAnsi="Aptos"/>
           <w:color w:val="222222"/>
-          <w:sz w:val="19"/>
+          <w:sz w:val="18"/>
         </w:rPr>
-        <w:t>Used an if condition inside the Promise to decide whether to resolve or reject.</w:t>
+        <w:t>Used fetch() to call the JSONPlaceholder todos API and res.json() to convert responses.</w:t>
       </w:r>
     </w:p>
     <w:p>
       <w:pPr>
-        <w:spacing w:after="32" w:line="245" w:lineRule="auto"/>
-        <w:ind w:left="317" w:hanging="230"/>
+        <w:spacing w:after="24" w:line="240" w:lineRule="auto"/>
+        <w:ind w:left="288" w:hanging="202"/>
       </w:pPr>
       <w:r>
         <w:rPr>
           <w:rFonts w:ascii="Aptos" w:hAnsi="Aptos"/>
           <w:b/>
           <w:color w:val="1F4E79"/>
-          <w:sz w:val="19"/>
+          <w:sz w:val="18"/>
         </w:rPr>
         <w:t xml:space="preserve">- </w:t>
       </w:r>
@@ -1894,22 +2039,22 @@
         <w:rPr>
           <w:rFonts w:ascii="Aptos" w:hAnsi="Aptos"/>
           <w:color w:val="222222"/>
-          <w:sz w:val="19"/>
+          <w:sz w:val="18"/>
         </w:rPr>
-        <w:t>Handled successful Promise output with .then() and rejected output with .catch().</w:t>
+        <w:t>Chained then() calls to filter todos by even id and map titles with an added prefix.</w:t>
       </w:r>
     </w:p>
     <w:p>
       <w:pPr>
-        <w:spacing w:after="32" w:line="245" w:lineRule="auto"/>
-        <w:ind w:left="317" w:hanging="230"/>
+        <w:spacing w:after="24" w:line="240" w:lineRule="auto"/>
+        <w:ind w:left="288" w:hanging="202"/>
       </w:pPr>
       <w:r>
         <w:rPr>
           <w:rFonts w:ascii="Aptos" w:hAnsi="Aptos"/>
           <w:b/>
           <w:color w:val="1F4E79"/>
-          <w:sz w:val="19"/>
+          <w:sz w:val="18"/>
         </w:rPr>
         <w:t xml:space="preserve">- </w:t>
       </w:r>
@@ -1917,22 +2062,22 @@
         <w:rPr>
           <w:rFonts w:ascii="Aptos" w:hAnsi="Aptos"/>
           <w:color w:val="222222"/>
-          <w:sz w:val="19"/>
+          <w:sz w:val="18"/>
         </w:rPr>
-        <w:t>Used setTimeout() to simulate delayed work and print messages after a delay.</w:t>
+        <w:t>Used a Weatherstack-style URL with an API_KEY placeholder and a template literal.</w:t>
       </w:r>
     </w:p>
     <w:p>
       <w:pPr>
-        <w:spacing w:after="32" w:line="245" w:lineRule="auto"/>
-        <w:ind w:left="317" w:hanging="230"/>
+        <w:spacing w:after="24" w:line="240" w:lineRule="auto"/>
+        <w:ind w:left="288" w:hanging="202"/>
       </w:pPr>
       <w:r>
         <w:rPr>
           <w:rFonts w:ascii="Aptos" w:hAnsi="Aptos"/>
           <w:b/>
           <w:color w:val="1F4E79"/>
-          <w:sz w:val="19"/>
+          <w:sz w:val="18"/>
         </w:rPr>
         <w:t xml:space="preserve">- </w:t>
       </w:r>
@@ -1940,22 +2085,22 @@
         <w:rPr>
           <w:rFonts w:ascii="Aptos" w:hAnsi="Aptos"/>
           <w:color w:val="222222"/>
-          <w:sz w:val="19"/>
+          <w:sz w:val="18"/>
         </w:rPr>
-        <w:t>Used setInterval() to repeatedly print checking messages after a fixed interval.</w:t>
+        <w:t>Read nested response fields such as data.current and data.location.name.</w:t>
       </w:r>
     </w:p>
     <w:p>
       <w:pPr>
-        <w:spacing w:after="32" w:line="245" w:lineRule="auto"/>
-        <w:ind w:left="317" w:hanging="230"/>
+        <w:spacing w:after="24" w:line="240" w:lineRule="auto"/>
+        <w:ind w:left="288" w:hanging="202"/>
       </w:pPr>
       <w:r>
         <w:rPr>
           <w:rFonts w:ascii="Aptos" w:hAnsi="Aptos"/>
           <w:b/>
           <w:color w:val="1F4E79"/>
-          <w:sz w:val="19"/>
+          <w:sz w:val="18"/>
         </w:rPr>
         <w:t xml:space="preserve">- </w:t>
       </w:r>
@@ -1963,9 +2108,32 @@
         <w:rPr>
           <w:rFonts w:ascii="Aptos" w:hAnsi="Aptos"/>
           <w:color w:val="222222"/>
-          <w:sz w:val="19"/>
+          <w:sz w:val="18"/>
         </w:rPr>
-        <w:t>Observed that setInterval() keeps the program running until stopped.</w:t>
+        <w:t>Built a result object with location, temperatureC, temperatureF, description, and isHot.</w:t>
+      </w:r>
+    </w:p>
+    <w:p>
+      <w:pPr>
+        <w:spacing w:after="24" w:line="240" w:lineRule="auto"/>
+        <w:ind w:left="288" w:hanging="202"/>
+      </w:pPr>
+      <w:r>
+        <w:rPr>
+          <w:rFonts w:ascii="Aptos" w:hAnsi="Aptos"/>
+          <w:b/>
+          <w:color w:val="1F4E79"/>
+          <w:sz w:val="18"/>
+        </w:rPr>
+        <w:t xml:space="preserve">- </w:t>
+      </w:r>
+      <w:r>
+        <w:rPr>
+          <w:rFonts w:ascii="Aptos" w:hAnsi="Aptos"/>
+          <w:color w:val="222222"/>
+          <w:sz w:val="18"/>
+        </w:rPr>
+        <w:t>Used a ternary operator to mark whether the temperature is hot.</w:t>
       </w:r>
     </w:p>
     <w:tbl>
@@ -1983,7 +2151,7 @@
         </w:tblBorders>
       </w:tblPr>
       <w:tblGrid>
-        <w:gridCol w:w="10224"/>
+        <w:gridCol w:w="10282"/>
       </w:tblGrid>
       <w:tr>
         <w:trPr>
@@ -1991,7 +2159,7 @@
         </w:trPr>
         <w:tc>
           <w:tcPr>
-            <w:tcW w:type="dxa" w:w="10224"/>
+            <w:tcW w:type="dxa" w:w="10282"/>
             <w:shd w:fill="F4F7FB"/>
           </w:tcPr>
           <w:p>
@@ -2003,9 +2171,9 @@
               <w:rPr>
                 <w:rFonts w:ascii="Consolas" w:hAnsi="Consolas"/>
                 <w:color w:val="2D2D2D"/>
-                <w:sz w:val="16"/>
+                <w:sz w:val="15"/>
               </w:rPr>
-              <w:t>function getData() {</w:t>
+              <w:t>fetch("https://jsonplaceholder.typicode.com/todos")</w:t>
             </w:r>
           </w:p>
           <w:p>
@@ -2016,9 +2184,9 @@
               <w:rPr>
                 <w:rFonts w:ascii="Consolas" w:hAnsi="Consolas"/>
                 <w:color w:val="2D2D2D"/>
-                <w:sz w:val="16"/>
+                <w:sz w:val="15"/>
               </w:rPr>
-              <w:t xml:space="preserve">    return new Promise((resolve, reject) =&gt; {</w:t>
+              <w:t xml:space="preserve">  .then(res =&gt; res.json())</w:t>
             </w:r>
           </w:p>
           <w:p>
@@ -2029,9 +2197,9 @@
               <w:rPr>
                 <w:rFonts w:ascii="Consolas" w:hAnsi="Consolas"/>
                 <w:color w:val="2D2D2D"/>
-                <w:sz w:val="16"/>
+                <w:sz w:val="15"/>
               </w:rPr>
-              <w:t xml:space="preserve">        if (2 &gt; 3) { resolve("Data received"); } else { reject("not working"); }</w:t>
+              <w:t xml:space="preserve">  .then(data =&gt; data.filter(d =&gt; d.id % 2 === 0))</w:t>
             </w:r>
           </w:p>
           <w:p>
@@ -2042,9 +2210,9 @@
               <w:rPr>
                 <w:rFonts w:ascii="Consolas" w:hAnsi="Consolas"/>
                 <w:color w:val="2D2D2D"/>
-                <w:sz w:val="16"/>
+                <w:sz w:val="15"/>
               </w:rPr>
-              <w:t xml:space="preserve">    });</w:t>
+              <w:t xml:space="preserve">  .then(data =&gt; data.map(d =&gt; (d.title = "Aaryan " + d.title)));</w:t>
             </w:r>
           </w:p>
           <w:p>
@@ -2055,22 +2223,9 @@
               <w:rPr>
                 <w:rFonts w:ascii="Consolas" w:hAnsi="Consolas"/>
                 <w:color w:val="2D2D2D"/>
-                <w:sz w:val="16"/>
+                <w:sz w:val="15"/>
               </w:rPr>
-              <w:t>}</w:t>
-            </w:r>
-          </w:p>
-          <w:p>
-            <w:pPr>
-              <w:spacing w:after="0"/>
-            </w:pPr>
-            <w:r>
-              <w:rPr>
-                <w:rFonts w:ascii="Consolas" w:hAnsi="Consolas"/>
-                <w:color w:val="2D2D2D"/>
-                <w:sz w:val="16"/>
-              </w:rPr>
-              <w:t>getData().then(data =&gt; console.log(data)).catch(error =&gt; console.error("Error:", error));</w:t>
+              <w:t>const result = { temperatureF: (weather.temperature * 1.8) + 32, isHot: weather.temperature &gt; 32 ? "Yes" : "No" };</w:t>
             </w:r>
           </w:p>
         </w:tc>
@@ -2078,63 +2233,48 @@
     </w:tbl>
     <w:p>
       <w:pPr>
-        <w:spacing w:after="20"/>
+        <w:spacing w:after="0"/>
       </w:pPr>
     </w:p>
     <w:p>
       <w:pPr>
         <w:pStyle w:val="Heading1"/>
-        <w:spacing w:before="220" w:after="80"/>
+        <w:spacing w:before="200" w:after="60"/>
       </w:pPr>
       <w:r>
         <w:rPr>
           <w:rFonts w:ascii="Aptos" w:hAnsi="Aptos"/>
           <w:b/>
           <w:color w:val="1F4E79"/>
-          <w:sz w:val="32"/>
+          <w:sz w:val="30"/>
         </w:rPr>
-        <w:t>Day 4 Fetch and API Practice</w:t>
+        <w:t>Day 5 Async/Await and JSON Practice</w:t>
       </w:r>
     </w:p>
     <w:p>
       <w:pPr>
-        <w:spacing w:after="100" w:line="254" w:lineRule="auto"/>
+        <w:spacing w:after="80" w:line="250" w:lineRule="auto"/>
       </w:pPr>
       <w:r>
         <w:rPr>
           <w:rFonts w:ascii="Aptos" w:hAnsi="Aptos"/>
           <w:color w:val="222222"/>
-          <w:sz w:val="20"/>
+          <w:sz w:val="19"/>
         </w:rPr>
-        <w:t>The edited index.js and promise.js files use fetch() with the JSONPlaceholder todos API. The api.js file adds a Weatherstack-style current weather request for Delhi using an API key placeholder and transforms the returned weather data into a smaller result object.</w:t>
+        <w:t>Day 5 began by improving asynchronous code with async/await and by practicing JSON conversion and timer cancellation. The index1.js and index2.js files build on the Day 4 Promise and fetch work.</w:t>
       </w:r>
     </w:p>
     <w:p>
       <w:pPr>
-        <w:pStyle w:val="Heading2"/>
-        <w:spacing w:before="120" w:after="80"/>
+        <w:spacing w:after="24" w:line="240" w:lineRule="auto"/>
+        <w:ind w:left="288" w:hanging="202"/>
       </w:pPr>
       <w:r>
         <w:rPr>
           <w:rFonts w:ascii="Aptos" w:hAnsi="Aptos"/>
           <w:b/>
           <w:color w:val="1F4E79"/>
-          <w:sz w:val="24"/>
-        </w:rPr>
-        <w:t>Fetch Chain Topics Practiced</w:t>
-      </w:r>
-    </w:p>
-    <w:p>
-      <w:pPr>
-        <w:spacing w:after="32" w:line="245" w:lineRule="auto"/>
-        <w:ind w:left="317" w:hanging="230"/>
-      </w:pPr>
-      <w:r>
-        <w:rPr>
-          <w:rFonts w:ascii="Aptos" w:hAnsi="Aptos"/>
-          <w:b/>
-          <w:color w:val="1F4E79"/>
-          <w:sz w:val="19"/>
+          <w:sz w:val="18"/>
         </w:rPr>
         <w:t xml:space="preserve">- </w:t>
       </w:r>
@@ -2142,22 +2282,22 @@
         <w:rPr>
           <w:rFonts w:ascii="Aptos" w:hAnsi="Aptos"/>
           <w:color w:val="222222"/>
-          <w:sz w:val="19"/>
+          <w:sz w:val="18"/>
         </w:rPr>
-        <w:t>Used fetch("https://jsonplaceholder.typicode.com/todos") to request remote todo data.</w:t>
+        <w:t>Created async functions such as getData() and getTodos().</w:t>
       </w:r>
     </w:p>
     <w:p>
       <w:pPr>
-        <w:spacing w:after="32" w:line="245" w:lineRule="auto"/>
-        <w:ind w:left="317" w:hanging="230"/>
+        <w:spacing w:after="24" w:line="240" w:lineRule="auto"/>
+        <w:ind w:left="288" w:hanging="202"/>
       </w:pPr>
       <w:r>
         <w:rPr>
           <w:rFonts w:ascii="Aptos" w:hAnsi="Aptos"/>
           <w:b/>
           <w:color w:val="1F4E79"/>
-          <w:sz w:val="19"/>
+          <w:sz w:val="18"/>
         </w:rPr>
         <w:t xml:space="preserve">- </w:t>
       </w:r>
@@ -2165,22 +2305,22 @@
         <w:rPr>
           <w:rFonts w:ascii="Aptos" w:hAnsi="Aptos"/>
           <w:color w:val="222222"/>
-          <w:sz w:val="19"/>
+          <w:sz w:val="18"/>
         </w:rPr>
-        <w:t>Converted the response to JavaScript data using res.json().</w:t>
+        <w:t>Used await with a Promise to wait for delayed resolve/reject behavior.</w:t>
       </w:r>
     </w:p>
     <w:p>
       <w:pPr>
-        <w:spacing w:after="32" w:line="245" w:lineRule="auto"/>
-        <w:ind w:left="317" w:hanging="230"/>
+        <w:spacing w:after="24" w:line="240" w:lineRule="auto"/>
+        <w:ind w:left="288" w:hanging="202"/>
       </w:pPr>
       <w:r>
         <w:rPr>
           <w:rFonts w:ascii="Aptos" w:hAnsi="Aptos"/>
           <w:b/>
           <w:color w:val="1F4E79"/>
-          <w:sz w:val="19"/>
+          <w:sz w:val="18"/>
         </w:rPr>
         <w:t xml:space="preserve">- </w:t>
       </w:r>
@@ -2188,22 +2328,22 @@
         <w:rPr>
           <w:rFonts w:ascii="Aptos" w:hAnsi="Aptos"/>
           <w:color w:val="222222"/>
-          <w:sz w:val="19"/>
+          <w:sz w:val="18"/>
         </w:rPr>
-        <w:t>Chained multiple .then() calls to process the data step by step.</w:t>
+        <w:t>Used await fetch("https://jsonplaceholder.typicode.com/todos") to pause execution until the API response arrives.</w:t>
       </w:r>
     </w:p>
     <w:p>
       <w:pPr>
-        <w:spacing w:after="32" w:line="245" w:lineRule="auto"/>
-        <w:ind w:left="317" w:hanging="230"/>
+        <w:spacing w:after="24" w:line="240" w:lineRule="auto"/>
+        <w:ind w:left="288" w:hanging="202"/>
       </w:pPr>
       <w:r>
         <w:rPr>
           <w:rFonts w:ascii="Aptos" w:hAnsi="Aptos"/>
           <w:b/>
           <w:color w:val="1F4E79"/>
-          <w:sz w:val="19"/>
+          <w:sz w:val="18"/>
         </w:rPr>
         <w:t xml:space="preserve">- </w:t>
       </w:r>
@@ -2211,22 +2351,22 @@
         <w:rPr>
           <w:rFonts w:ascii="Aptos" w:hAnsi="Aptos"/>
           <w:color w:val="222222"/>
-          <w:sz w:val="19"/>
+          <w:sz w:val="18"/>
         </w:rPr>
-        <w:t>Filtered API results to keep only todos with even id values using d.id % 2 === 0.</w:t>
+        <w:t>Returned parsed JSON data from an async function and consumed it with .then().</w:t>
       </w:r>
     </w:p>
     <w:p>
       <w:pPr>
-        <w:spacing w:after="32" w:line="245" w:lineRule="auto"/>
-        <w:ind w:left="317" w:hanging="230"/>
+        <w:spacing w:after="24" w:line="240" w:lineRule="auto"/>
+        <w:ind w:left="288" w:hanging="202"/>
       </w:pPr>
       <w:r>
         <w:rPr>
           <w:rFonts w:ascii="Aptos" w:hAnsi="Aptos"/>
           <w:b/>
           <w:color w:val="1F4E79"/>
-          <w:sz w:val="19"/>
+          <w:sz w:val="18"/>
         </w:rPr>
         <w:t xml:space="preserve">- </w:t>
       </w:r>
@@ -2234,22 +2374,22 @@
         <w:rPr>
           <w:rFonts w:ascii="Aptos" w:hAnsi="Aptos"/>
           <w:color w:val="222222"/>
-          <w:sz w:val="19"/>
+          <w:sz w:val="18"/>
         </w:rPr>
-        <w:t>Mapped through filtered results and changed each title by adding the prefix "Aaryan ".</w:t>
+        <w:t>Practiced JSON.stringify(obj) to convert an object into a string.</w:t>
       </w:r>
     </w:p>
     <w:p>
       <w:pPr>
-        <w:spacing w:after="32" w:line="245" w:lineRule="auto"/>
-        <w:ind w:left="317" w:hanging="230"/>
+        <w:spacing w:after="24" w:line="240" w:lineRule="auto"/>
+        <w:ind w:left="288" w:hanging="202"/>
       </w:pPr>
       <w:r>
         <w:rPr>
           <w:rFonts w:ascii="Aptos" w:hAnsi="Aptos"/>
           <w:b/>
           <w:color w:val="1F4E79"/>
-          <w:sz w:val="19"/>
+          <w:sz w:val="18"/>
         </w:rPr>
         <w:t xml:space="preserve">- </w:t>
       </w:r>
@@ -2257,22 +2397,22 @@
         <w:rPr>
           <w:rFonts w:ascii="Aptos" w:hAnsi="Aptos"/>
           <w:color w:val="222222"/>
-          <w:sz w:val="19"/>
+          <w:sz w:val="18"/>
         </w:rPr>
-        <w:t>Printed transformed API data with console.log().</w:t>
+        <w:t>Practiced JSON.parse(string) to convert a JSON string back into an object.</w:t>
       </w:r>
     </w:p>
     <w:p>
       <w:pPr>
-        <w:spacing w:after="32" w:line="245" w:lineRule="auto"/>
-        <w:ind w:left="317" w:hanging="230"/>
+        <w:spacing w:after="24" w:line="240" w:lineRule="auto"/>
+        <w:ind w:left="288" w:hanging="202"/>
       </w:pPr>
       <w:r>
         <w:rPr>
           <w:rFonts w:ascii="Aptos" w:hAnsi="Aptos"/>
           <w:b/>
           <w:color w:val="1F4E79"/>
-          <w:sz w:val="19"/>
+          <w:sz w:val="18"/>
         </w:rPr>
         <w:t xml:space="preserve">- </w:t>
       </w:r>
@@ -2280,37 +2420,22 @@
         <w:rPr>
           <w:rFonts w:ascii="Aptos" w:hAnsi="Aptos"/>
           <w:color w:val="222222"/>
-          <w:sz w:val="19"/>
+          <w:sz w:val="18"/>
         </w:rPr>
-        <w:t>Handled fetch problems with .catch(error =&gt; console.error("Error fetching data:", error)).</w:t>
+        <w:t>Stored timeout and interval identifiers in variables.</w:t>
       </w:r>
     </w:p>
     <w:p>
       <w:pPr>
-        <w:pStyle w:val="Heading2"/>
-        <w:spacing w:before="120" w:after="80"/>
+        <w:spacing w:after="24" w:line="240" w:lineRule="auto"/>
+        <w:ind w:left="288" w:hanging="202"/>
       </w:pPr>
       <w:r>
         <w:rPr>
           <w:rFonts w:ascii="Aptos" w:hAnsi="Aptos"/>
           <w:b/>
           <w:color w:val="1F4E79"/>
-          <w:sz w:val="24"/>
-        </w:rPr>
-        <w:t>Weather API Topics Practiced</w:t>
-      </w:r>
-    </w:p>
-    <w:p>
-      <w:pPr>
-        <w:spacing w:after="32" w:line="245" w:lineRule="auto"/>
-        <w:ind w:left="317" w:hanging="230"/>
-      </w:pPr>
-      <w:r>
-        <w:rPr>
-          <w:rFonts w:ascii="Aptos" w:hAnsi="Aptos"/>
-          <w:b/>
-          <w:color w:val="1F4E79"/>
-          <w:sz w:val="19"/>
+          <w:sz w:val="18"/>
         </w:rPr>
         <w:t xml:space="preserve">- </w:t>
       </w:r>
@@ -2318,170 +2443,9 @@
         <w:rPr>
           <w:rFonts w:ascii="Aptos" w:hAnsi="Aptos"/>
           <w:color w:val="222222"/>
-          <w:sz w:val="19"/>
+          <w:sz w:val="18"/>
         </w:rPr>
-        <w:t>Stored an API key placeholder in API_KEY.</w:t>
-      </w:r>
-    </w:p>
-    <w:p>
-      <w:pPr>
-        <w:spacing w:after="32" w:line="245" w:lineRule="auto"/>
-        <w:ind w:left="317" w:hanging="230"/>
-      </w:pPr>
-      <w:r>
-        <w:rPr>
-          <w:rFonts w:ascii="Aptos" w:hAnsi="Aptos"/>
-          <w:b/>
-          <w:color w:val="1F4E79"/>
-          <w:sz w:val="19"/>
-        </w:rPr>
-        <w:t xml:space="preserve">- </w:t>
-      </w:r>
-      <w:r>
-        <w:rPr>
-          <w:rFonts w:ascii="Aptos" w:hAnsi="Aptos"/>
-          <w:color w:val="222222"/>
-          <w:sz w:val="19"/>
-        </w:rPr>
-        <w:t>Used a template literal URL to insert the API key into the Weatherstack request.</w:t>
-      </w:r>
-    </w:p>
-    <w:p>
-      <w:pPr>
-        <w:spacing w:after="32" w:line="245" w:lineRule="auto"/>
-        <w:ind w:left="317" w:hanging="230"/>
-      </w:pPr>
-      <w:r>
-        <w:rPr>
-          <w:rFonts w:ascii="Aptos" w:hAnsi="Aptos"/>
-          <w:b/>
-          <w:color w:val="1F4E79"/>
-          <w:sz w:val="19"/>
-        </w:rPr>
-        <w:t xml:space="preserve">- </w:t>
-      </w:r>
-      <w:r>
-        <w:rPr>
-          <w:rFonts w:ascii="Aptos" w:hAnsi="Aptos"/>
-          <w:color w:val="222222"/>
-          <w:sz w:val="19"/>
-        </w:rPr>
-        <w:t>Converted the weather API response using res.json().</w:t>
-      </w:r>
-    </w:p>
-    <w:p>
-      <w:pPr>
-        <w:spacing w:after="32" w:line="245" w:lineRule="auto"/>
-        <w:ind w:left="317" w:hanging="230"/>
-      </w:pPr>
-      <w:r>
-        <w:rPr>
-          <w:rFonts w:ascii="Aptos" w:hAnsi="Aptos"/>
-          <w:b/>
-          <w:color w:val="1F4E79"/>
-          <w:sz w:val="19"/>
-        </w:rPr>
-        <w:t xml:space="preserve">- </w:t>
-      </w:r>
-      <w:r>
-        <w:rPr>
-          <w:rFonts w:ascii="Aptos" w:hAnsi="Aptos"/>
-          <w:color w:val="222222"/>
-          <w:sz w:val="19"/>
-        </w:rPr>
-        <w:t>Accessed nested response data such as data.current and data.location.name.</w:t>
-      </w:r>
-    </w:p>
-    <w:p>
-      <w:pPr>
-        <w:spacing w:after="32" w:line="245" w:lineRule="auto"/>
-        <w:ind w:left="317" w:hanging="230"/>
-      </w:pPr>
-      <w:r>
-        <w:rPr>
-          <w:rFonts w:ascii="Aptos" w:hAnsi="Aptos"/>
-          <w:b/>
-          <w:color w:val="1F4E79"/>
-          <w:sz w:val="19"/>
-        </w:rPr>
-        <w:t xml:space="preserve">- </w:t>
-      </w:r>
-      <w:r>
-        <w:rPr>
-          <w:rFonts w:ascii="Aptos" w:hAnsi="Aptos"/>
-          <w:color w:val="222222"/>
-          <w:sz w:val="19"/>
-        </w:rPr>
-        <w:t>Created a new result object with location, temperatureC, temperatureF, description, and isHot.</w:t>
-      </w:r>
-    </w:p>
-    <w:p>
-      <w:pPr>
-        <w:spacing w:after="32" w:line="245" w:lineRule="auto"/>
-        <w:ind w:left="317" w:hanging="230"/>
-      </w:pPr>
-      <w:r>
-        <w:rPr>
-          <w:rFonts w:ascii="Aptos" w:hAnsi="Aptos"/>
-          <w:b/>
-          <w:color w:val="1F4E79"/>
-          <w:sz w:val="19"/>
-        </w:rPr>
-        <w:t xml:space="preserve">- </w:t>
-      </w:r>
-      <w:r>
-        <w:rPr>
-          <w:rFonts w:ascii="Aptos" w:hAnsi="Aptos"/>
-          <w:color w:val="222222"/>
-          <w:sz w:val="19"/>
-        </w:rPr>
-        <w:t>Converted Celsius to Fahrenheit using (temperature * 1.8) + 32.</w:t>
-      </w:r>
-    </w:p>
-    <w:p>
-      <w:pPr>
-        <w:spacing w:after="32" w:line="245" w:lineRule="auto"/>
-        <w:ind w:left="317" w:hanging="230"/>
-      </w:pPr>
-      <w:r>
-        <w:rPr>
-          <w:rFonts w:ascii="Aptos" w:hAnsi="Aptos"/>
-          <w:b/>
-          <w:color w:val="1F4E79"/>
-          <w:sz w:val="19"/>
-        </w:rPr>
-        <w:t xml:space="preserve">- </w:t>
-      </w:r>
-      <w:r>
-        <w:rPr>
-          <w:rFonts w:ascii="Aptos" w:hAnsi="Aptos"/>
-          <w:color w:val="222222"/>
-          <w:sz w:val="19"/>
-        </w:rPr>
-        <w:t>Used the ternary operator to set isHot to "Yes" or "No" based on temperature &gt; 32.</w:t>
-      </w:r>
-    </w:p>
-    <w:p>
-      <w:pPr>
-        <w:spacing w:after="32" w:line="245" w:lineRule="auto"/>
-        <w:ind w:left="317" w:hanging="230"/>
-      </w:pPr>
-      <w:r>
-        <w:rPr>
-          <w:rFonts w:ascii="Aptos" w:hAnsi="Aptos"/>
-          <w:b/>
-          <w:color w:val="1F4E79"/>
-          <w:sz w:val="19"/>
-        </w:rPr>
-        <w:t xml:space="preserve">- </w:t>
-      </w:r>
-      <w:r>
-        <w:rPr>
-          <w:rFonts w:ascii="Aptos" w:hAnsi="Aptos"/>
-          <w:color w:val="222222"/>
-          <w:sz w:val="19"/>
-        </w:rPr>
-        <w:t>Returned transformed data through the Promise chain and printed finalData.</w:t>
+        <w:t>Used clearTimeout(timeoutId) and clearInterval(i) to cancel scheduled timer behavior.</w:t>
       </w:r>
     </w:p>
     <w:tbl>
@@ -2499,7 +2463,7 @@
         </w:tblBorders>
       </w:tblPr>
       <w:tblGrid>
-        <w:gridCol w:w="10224"/>
+        <w:gridCol w:w="10282"/>
       </w:tblGrid>
       <w:tr>
         <w:trPr>
@@ -2507,7 +2471,7 @@
         </w:trPr>
         <w:tc>
           <w:tcPr>
-            <w:tcW w:type="dxa" w:w="10224"/>
+            <w:tcW w:type="dxa" w:w="10282"/>
             <w:shd w:fill="F4F7FB"/>
           </w:tcPr>
           <w:p>
@@ -2519,9 +2483,9 @@
               <w:rPr>
                 <w:rFonts w:ascii="Consolas" w:hAnsi="Consolas"/>
                 <w:color w:val="2D2D2D"/>
-                <w:sz w:val="16"/>
+                <w:sz w:val="15"/>
               </w:rPr>
-              <w:t>fetch("https://jsonplaceholder.typicode.com/todos")</w:t>
+              <w:t>async function getTodos(url) {</w:t>
             </w:r>
           </w:p>
           <w:p>
@@ -2532,9 +2496,9 @@
               <w:rPr>
                 <w:rFonts w:ascii="Consolas" w:hAnsi="Consolas"/>
                 <w:color w:val="2D2D2D"/>
-                <w:sz w:val="16"/>
+                <w:sz w:val="15"/>
               </w:rPr>
-              <w:t xml:space="preserve">    .then(res =&gt; res.json())</w:t>
+              <w:t xml:space="preserve">    let data = await fetch("https://jsonplaceholder.typicode.com/todos");</w:t>
             </w:r>
           </w:p>
           <w:p>
@@ -2545,9 +2509,9 @@
               <w:rPr>
                 <w:rFonts w:ascii="Consolas" w:hAnsi="Consolas"/>
                 <w:color w:val="2D2D2D"/>
-                <w:sz w:val="16"/>
+                <w:sz w:val="15"/>
               </w:rPr>
-              <w:t xml:space="preserve">    .then(data =&gt; data.filter(d =&gt; d.id % 2 === 0))</w:t>
+              <w:t xml:space="preserve">    data = data.json();</w:t>
             </w:r>
           </w:p>
           <w:p>
@@ -2558,9 +2522,9 @@
               <w:rPr>
                 <w:rFonts w:ascii="Consolas" w:hAnsi="Consolas"/>
                 <w:color w:val="2D2D2D"/>
-                <w:sz w:val="16"/>
+                <w:sz w:val="15"/>
               </w:rPr>
-              <w:t xml:space="preserve">    .then(data =&gt; data.map(d =&gt; (d.title = "Aaryan " + d.title)))</w:t>
+              <w:t xml:space="preserve">    return data;</w:t>
             </w:r>
           </w:p>
           <w:p>
@@ -2571,9 +2535,9 @@
               <w:rPr>
                 <w:rFonts w:ascii="Consolas" w:hAnsi="Consolas"/>
                 <w:color w:val="2D2D2D"/>
-                <w:sz w:val="16"/>
+                <w:sz w:val="15"/>
               </w:rPr>
-              <w:t xml:space="preserve">    .catch(error =&gt; console.error("Error fetching data:", error));</w:t>
+              <w:t>}</w:t>
             </w:r>
           </w:p>
           <w:p>
@@ -2584,8 +2548,9 @@
               <w:rPr>
                 <w:rFonts w:ascii="Consolas" w:hAnsi="Consolas"/>
                 <w:color w:val="2D2D2D"/>
-                <w:sz w:val="16"/>
+                <w:sz w:val="15"/>
               </w:rPr>
+              <w:t>const timeoutId = setTimeout(() =&gt; console.log("Data received"), 5000);</w:t>
             </w:r>
           </w:p>
           <w:p>
@@ -2596,9 +2561,9 @@
               <w:rPr>
                 <w:rFonts w:ascii="Consolas" w:hAnsi="Consolas"/>
                 <w:color w:val="2D2D2D"/>
-                <w:sz w:val="16"/>
+                <w:sz w:val="15"/>
               </w:rPr>
-              <w:t>const result = {</w:t>
+              <w:t>clearTimeout(timeoutId);</w:t>
             </w:r>
           </w:p>
           <w:p>
@@ -2609,9 +2574,437 @@
               <w:rPr>
                 <w:rFonts w:ascii="Consolas" w:hAnsi="Consolas"/>
                 <w:color w:val="2D2D2D"/>
-                <w:sz w:val="16"/>
+                <w:sz w:val="15"/>
               </w:rPr>
-              <w:t xml:space="preserve">    location: data.location.name,</w:t>
+              <w:t>clearInterval(i);</w:t>
+            </w:r>
+          </w:p>
+        </w:tc>
+      </w:tr>
+    </w:tbl>
+    <w:p>
+      <w:pPr>
+        <w:spacing w:after="0"/>
+      </w:pPr>
+    </w:p>
+    <w:p>
+      <w:pPr>
+        <w:pStyle w:val="Heading1"/>
+        <w:spacing w:before="200" w:after="60"/>
+      </w:pPr>
+      <w:r>
+        <w:rPr>
+          <w:rFonts w:ascii="Aptos" w:hAnsi="Aptos"/>
+          <w:b/>
+          <w:color w:val="1F4E79"/>
+          <w:sz w:val="30"/>
+        </w:rPr>
+        <w:t>Day 5 Object-Oriented Programming</w:t>
+      </w:r>
+    </w:p>
+    <w:p>
+      <w:pPr>
+        <w:spacing w:after="80" w:line="250" w:lineRule="auto"/>
+      </w:pPr>
+      <w:r>
+        <w:rPr>
+          <w:rFonts w:ascii="Aptos" w:hAnsi="Aptos"/>
+          <w:color w:val="222222"/>
+          <w:sz w:val="19"/>
+        </w:rPr>
+        <w:t>The rest of Day 5 focused on OOP in JavaScript. The examples cover class creation, object creation, constructors, methods, inheritance, encapsulation, abstraction, polymorphism, and a combined assessment file containing all four OOP pillars.</w:t>
+      </w:r>
+    </w:p>
+    <w:p>
+      <w:pPr>
+        <w:pStyle w:val="Heading2"/>
+        <w:spacing w:before="100" w:after="60"/>
+      </w:pPr>
+      <w:r>
+        <w:rPr>
+          <w:rFonts w:ascii="Aptos" w:hAnsi="Aptos"/>
+          <w:b/>
+          <w:color w:val="1F4E79"/>
+          <w:sz w:val="24"/>
+        </w:rPr>
+        <w:t>Classes, Objects, and Inheritance</w:t>
+      </w:r>
+    </w:p>
+    <w:p>
+      <w:pPr>
+        <w:spacing w:after="24" w:line="240" w:lineRule="auto"/>
+        <w:ind w:left="288" w:hanging="202"/>
+      </w:pPr>
+      <w:r>
+        <w:rPr>
+          <w:rFonts w:ascii="Aptos" w:hAnsi="Aptos"/>
+          <w:b/>
+          <w:color w:val="1F4E79"/>
+          <w:sz w:val="18"/>
+        </w:rPr>
+        <w:t xml:space="preserve">- </w:t>
+      </w:r>
+      <w:r>
+        <w:rPr>
+          <w:rFonts w:ascii="Aptos" w:hAnsi="Aptos"/>
+          <w:color w:val="222222"/>
+          <w:sz w:val="18"/>
+        </w:rPr>
+        <w:t>Created classes such as Animal, User, Admin, Person, and Student.</w:t>
+      </w:r>
+    </w:p>
+    <w:p>
+      <w:pPr>
+        <w:spacing w:after="24" w:line="240" w:lineRule="auto"/>
+        <w:ind w:left="288" w:hanging="202"/>
+      </w:pPr>
+      <w:r>
+        <w:rPr>
+          <w:rFonts w:ascii="Aptos" w:hAnsi="Aptos"/>
+          <w:b/>
+          <w:color w:val="1F4E79"/>
+          <w:sz w:val="18"/>
+        </w:rPr>
+        <w:t xml:space="preserve">- </w:t>
+      </w:r>
+      <w:r>
+        <w:rPr>
+          <w:rFonts w:ascii="Aptos" w:hAnsi="Aptos"/>
+          <w:color w:val="222222"/>
+          <w:sz w:val="18"/>
+        </w:rPr>
+        <w:t>Used constructors to initialize object properties like name, role, and course.</w:t>
+      </w:r>
+    </w:p>
+    <w:p>
+      <w:pPr>
+        <w:spacing w:after="24" w:line="240" w:lineRule="auto"/>
+        <w:ind w:left="288" w:hanging="202"/>
+      </w:pPr>
+      <w:r>
+        <w:rPr>
+          <w:rFonts w:ascii="Aptos" w:hAnsi="Aptos"/>
+          <w:b/>
+          <w:color w:val="1F4E79"/>
+          <w:sz w:val="18"/>
+        </w:rPr>
+        <w:t xml:space="preserve">- </w:t>
+      </w:r>
+      <w:r>
+        <w:rPr>
+          <w:rFonts w:ascii="Aptos" w:hAnsi="Aptos"/>
+          <w:color w:val="222222"/>
+          <w:sz w:val="18"/>
+        </w:rPr>
+        <w:t>Created objects with new, such as new Animal("Jhonny") and new Admin("Bob", "Super Admin").</w:t>
+      </w:r>
+    </w:p>
+    <w:p>
+      <w:pPr>
+        <w:spacing w:after="24" w:line="240" w:lineRule="auto"/>
+        <w:ind w:left="288" w:hanging="202"/>
+      </w:pPr>
+      <w:r>
+        <w:rPr>
+          <w:rFonts w:ascii="Aptos" w:hAnsi="Aptos"/>
+          <w:b/>
+          <w:color w:val="1F4E79"/>
+          <w:sz w:val="18"/>
+        </w:rPr>
+        <w:t xml:space="preserve">- </w:t>
+      </w:r>
+      <w:r>
+        <w:rPr>
+          <w:rFonts w:ascii="Aptos" w:hAnsi="Aptos"/>
+          <w:color w:val="222222"/>
+          <w:sz w:val="18"/>
+        </w:rPr>
+        <w:t>Used class methods such as speak(), logIn(), greet(), and draw().</w:t>
+      </w:r>
+    </w:p>
+    <w:p>
+      <w:pPr>
+        <w:spacing w:after="24" w:line="240" w:lineRule="auto"/>
+        <w:ind w:left="288" w:hanging="202"/>
+      </w:pPr>
+      <w:r>
+        <w:rPr>
+          <w:rFonts w:ascii="Aptos" w:hAnsi="Aptos"/>
+          <w:b/>
+          <w:color w:val="1F4E79"/>
+          <w:sz w:val="18"/>
+        </w:rPr>
+        <w:t xml:space="preserve">- </w:t>
+      </w:r>
+      <w:r>
+        <w:rPr>
+          <w:rFonts w:ascii="Aptos" w:hAnsi="Aptos"/>
+          <w:color w:val="222222"/>
+          <w:sz w:val="18"/>
+        </w:rPr>
+        <w:t>Used extends to create child classes from parent classes.</w:t>
+      </w:r>
+    </w:p>
+    <w:p>
+      <w:pPr>
+        <w:spacing w:after="24" w:line="240" w:lineRule="auto"/>
+        <w:ind w:left="288" w:hanging="202"/>
+      </w:pPr>
+      <w:r>
+        <w:rPr>
+          <w:rFonts w:ascii="Aptos" w:hAnsi="Aptos"/>
+          <w:b/>
+          <w:color w:val="1F4E79"/>
+          <w:sz w:val="18"/>
+        </w:rPr>
+        <w:t xml:space="preserve">- </w:t>
+      </w:r>
+      <w:r>
+        <w:rPr>
+          <w:rFonts w:ascii="Aptos" w:hAnsi="Aptos"/>
+          <w:color w:val="222222"/>
+          <w:sz w:val="18"/>
+        </w:rPr>
+        <w:t>Used super(name) to call the parent constructor and super.greet() or super.logIn() to reuse parent methods.</w:t>
+      </w:r>
+    </w:p>
+    <w:p>
+      <w:pPr>
+        <w:spacing w:after="24" w:line="240" w:lineRule="auto"/>
+        <w:ind w:left="288" w:hanging="202"/>
+      </w:pPr>
+      <w:r>
+        <w:rPr>
+          <w:rFonts w:ascii="Aptos" w:hAnsi="Aptos"/>
+          <w:b/>
+          <w:color w:val="1F4E79"/>
+          <w:sz w:val="18"/>
+        </w:rPr>
+        <w:t xml:space="preserve">- </w:t>
+      </w:r>
+      <w:r>
+        <w:rPr>
+          <w:rFonts w:ascii="Aptos" w:hAnsi="Aptos"/>
+          <w:color w:val="222222"/>
+          <w:sz w:val="18"/>
+        </w:rPr>
+        <w:t>Overrode child methods to add specialized behavior.</w:t>
+      </w:r>
+    </w:p>
+    <w:p>
+      <w:pPr>
+        <w:pStyle w:val="Heading2"/>
+        <w:spacing w:before="100" w:after="60"/>
+      </w:pPr>
+      <w:r>
+        <w:rPr>
+          <w:rFonts w:ascii="Aptos" w:hAnsi="Aptos"/>
+          <w:b/>
+          <w:color w:val="1F4E79"/>
+          <w:sz w:val="24"/>
+        </w:rPr>
+        <w:t>Encapsulation, Abstraction, and Polymorphism</w:t>
+      </w:r>
+    </w:p>
+    <w:p>
+      <w:pPr>
+        <w:spacing w:after="24" w:line="240" w:lineRule="auto"/>
+        <w:ind w:left="288" w:hanging="202"/>
+      </w:pPr>
+      <w:r>
+        <w:rPr>
+          <w:rFonts w:ascii="Aptos" w:hAnsi="Aptos"/>
+          <w:b/>
+          <w:color w:val="1F4E79"/>
+          <w:sz w:val="18"/>
+        </w:rPr>
+        <w:t xml:space="preserve">- </w:t>
+      </w:r>
+      <w:r>
+        <w:rPr>
+          <w:rFonts w:ascii="Aptos" w:hAnsi="Aptos"/>
+          <w:color w:val="222222"/>
+          <w:sz w:val="18"/>
+        </w:rPr>
+        <w:t>Used private fields such as #balance and #total to protect internal data.</w:t>
+      </w:r>
+    </w:p>
+    <w:p>
+      <w:pPr>
+        <w:spacing w:after="24" w:line="240" w:lineRule="auto"/>
+        <w:ind w:left="288" w:hanging="202"/>
+      </w:pPr>
+      <w:r>
+        <w:rPr>
+          <w:rFonts w:ascii="Aptos" w:hAnsi="Aptos"/>
+          <w:b/>
+          <w:color w:val="1F4E79"/>
+          <w:sz w:val="18"/>
+        </w:rPr>
+        <w:t xml:space="preserve">- </w:t>
+      </w:r>
+      <w:r>
+        <w:rPr>
+          <w:rFonts w:ascii="Aptos" w:hAnsi="Aptos"/>
+          <w:color w:val="222222"/>
+          <w:sz w:val="18"/>
+        </w:rPr>
+        <w:t>Validated deposits, withdrawals, item additions, and removals before changing private values.</w:t>
+      </w:r>
+    </w:p>
+    <w:p>
+      <w:pPr>
+        <w:spacing w:after="24" w:line="240" w:lineRule="auto"/>
+        <w:ind w:left="288" w:hanging="202"/>
+      </w:pPr>
+      <w:r>
+        <w:rPr>
+          <w:rFonts w:ascii="Aptos" w:hAnsi="Aptos"/>
+          <w:b/>
+          <w:color w:val="1F4E79"/>
+          <w:sz w:val="18"/>
+        </w:rPr>
+        <w:t xml:space="preserve">- </w:t>
+      </w:r>
+      <w:r>
+        <w:rPr>
+          <w:rFonts w:ascii="Aptos" w:hAnsi="Aptos"/>
+          <w:color w:val="222222"/>
+          <w:sz w:val="18"/>
+        </w:rPr>
+        <w:t>Exposed controlled access through methods like deposit(), withdraw(), getBalance(), addItem(), removeItem(), and getTotal().</w:t>
+      </w:r>
+    </w:p>
+    <w:p>
+      <w:pPr>
+        <w:spacing w:after="24" w:line="240" w:lineRule="auto"/>
+        <w:ind w:left="288" w:hanging="202"/>
+      </w:pPr>
+      <w:r>
+        <w:rPr>
+          <w:rFonts w:ascii="Aptos" w:hAnsi="Aptos"/>
+          <w:b/>
+          <w:color w:val="1F4E79"/>
+          <w:sz w:val="18"/>
+        </w:rPr>
+        <w:t xml:space="preserve">- </w:t>
+      </w:r>
+      <w:r>
+        <w:rPr>
+          <w:rFonts w:ascii="Aptos" w:hAnsi="Aptos"/>
+          <w:color w:val="222222"/>
+          <w:sz w:val="18"/>
+        </w:rPr>
+        <w:t>Used private methods such as #boilWater(), #grindBeans(), #selectItems(), #makePayment(), and #prepareFood() to hide internal steps.</w:t>
+      </w:r>
+    </w:p>
+    <w:p>
+      <w:pPr>
+        <w:spacing w:after="24" w:line="240" w:lineRule="auto"/>
+        <w:ind w:left="288" w:hanging="202"/>
+      </w:pPr>
+      <w:r>
+        <w:rPr>
+          <w:rFonts w:ascii="Aptos" w:hAnsi="Aptos"/>
+          <w:b/>
+          <w:color w:val="1F4E79"/>
+          <w:sz w:val="18"/>
+        </w:rPr>
+        <w:t xml:space="preserve">- </w:t>
+      </w:r>
+      <w:r>
+        <w:rPr>
+          <w:rFonts w:ascii="Aptos" w:hAnsi="Aptos"/>
+          <w:color w:val="222222"/>
+          <w:sz w:val="18"/>
+        </w:rPr>
+        <w:t>Exposed simple public methods such as brew() and placeOrder() that run hidden private steps.</w:t>
+      </w:r>
+    </w:p>
+    <w:p>
+      <w:pPr>
+        <w:spacing w:after="24" w:line="240" w:lineRule="auto"/>
+        <w:ind w:left="288" w:hanging="202"/>
+      </w:pPr>
+      <w:r>
+        <w:rPr>
+          <w:rFonts w:ascii="Aptos" w:hAnsi="Aptos"/>
+          <w:b/>
+          <w:color w:val="1F4E79"/>
+          <w:sz w:val="18"/>
+        </w:rPr>
+        <w:t xml:space="preserve">- </w:t>
+      </w:r>
+      <w:r>
+        <w:rPr>
+          <w:rFonts w:ascii="Aptos" w:hAnsi="Aptos"/>
+          <w:color w:val="222222"/>
+          <w:sz w:val="18"/>
+        </w:rPr>
+        <w:t>Practiced polymorphism with Animal/Dog/Cat and Shape/Circle/Square examples where each child class implements its own version of the same method.</w:t>
+      </w:r>
+    </w:p>
+    <w:p>
+      <w:pPr>
+        <w:spacing w:after="24" w:line="240" w:lineRule="auto"/>
+        <w:ind w:left="288" w:hanging="202"/>
+      </w:pPr>
+      <w:r>
+        <w:rPr>
+          <w:rFonts w:ascii="Aptos" w:hAnsi="Aptos"/>
+          <w:b/>
+          <w:color w:val="1F4E79"/>
+          <w:sz w:val="18"/>
+        </w:rPr>
+        <w:t xml:space="preserve">- </w:t>
+      </w:r>
+      <w:r>
+        <w:rPr>
+          <w:rFonts w:ascii="Aptos" w:hAnsi="Aptos"/>
+          <w:color w:val="222222"/>
+          <w:sz w:val="18"/>
+        </w:rPr>
+        <w:t>Used arrays of objects with forEach() to call the same method on different object types.</w:t>
+      </w:r>
+    </w:p>
+    <w:tbl>
+      <w:tblPr>
+        <w:tblW w:type="auto" w:w="0"/>
+        <w:jc w:val="center"/>
+        <w:tblLook w:firstColumn="1" w:firstRow="1" w:lastColumn="0" w:lastRow="0" w:noHBand="0" w:noVBand="1" w:val="04A0"/>
+        <w:tblBorders>
+          <w:top w:val="single" w:sz="4" w:space="0" w:color="C9D5E3"/>
+          <w:left w:val="single" w:sz="4" w:space="0" w:color="C9D5E3"/>
+          <w:bottom w:val="single" w:sz="4" w:space="0" w:color="C9D5E3"/>
+          <w:right w:val="single" w:sz="4" w:space="0" w:color="C9D5E3"/>
+          <w:insideH w:val="single" w:sz="4" w:space="0" w:color="C9D5E3"/>
+          <w:insideV w:val="single" w:sz="4" w:space="0" w:color="C9D5E3"/>
+        </w:tblBorders>
+      </w:tblPr>
+      <w:tblGrid>
+        <w:gridCol w:w="10282"/>
+      </w:tblGrid>
+      <w:tr>
+        <w:trPr>
+          <w:tblHeader w:val="true"/>
+        </w:trPr>
+        <w:tc>
+          <w:tcPr>
+            <w:tcW w:type="dxa" w:w="10282"/>
+            <w:shd w:fill="F4F7FB"/>
+          </w:tcPr>
+          <w:p>
+            <w:pPr>
+              <w:spacing w:after="0"/>
+            </w:pPr>
+            <w:r/>
+            <w:r>
+              <w:rPr>
+                <w:rFonts w:ascii="Consolas" w:hAnsi="Consolas"/>
+                <w:color w:val="2D2D2D"/>
+                <w:sz w:val="15"/>
+              </w:rPr>
+              <w:t>class Admin extends User {</w:t>
             </w:r>
           </w:p>
           <w:p>
@@ -2622,9 +3015,9 @@
               <w:rPr>
                 <w:rFonts w:ascii="Consolas" w:hAnsi="Consolas"/>
                 <w:color w:val="2D2D2D"/>
-                <w:sz w:val="16"/>
+                <w:sz w:val="15"/>
               </w:rPr>
-              <w:t xml:space="preserve">    temperatureF: (weather.temperature * 1.8) + 32,</w:t>
+              <w:t xml:space="preserve">    constructor(name, role) { super(name); this.role = role; }</w:t>
             </w:r>
           </w:p>
           <w:p>
@@ -2635,9 +3028,9 @@
               <w:rPr>
                 <w:rFonts w:ascii="Consolas" w:hAnsi="Consolas"/>
                 <w:color w:val="2D2D2D"/>
-                <w:sz w:val="16"/>
+                <w:sz w:val="15"/>
               </w:rPr>
-              <w:t xml:space="preserve">    isHot: weather.temperature &gt; 32 ? "Yes" : "No"</w:t>
+              <w:t xml:space="preserve">    logIn() { super.logIn(); console.log(`${this.name} has admin privileges as a ${this.role}.`); }</w:t>
             </w:r>
           </w:p>
           <w:p>
@@ -2648,9 +3041,35 @@
               <w:rPr>
                 <w:rFonts w:ascii="Consolas" w:hAnsi="Consolas"/>
                 <w:color w:val="2D2D2D"/>
-                <w:sz w:val="16"/>
+                <w:sz w:val="15"/>
               </w:rPr>
-              <w:t>};</w:t>
+              <w:t>}</w:t>
+            </w:r>
+          </w:p>
+          <w:p>
+            <w:pPr>
+              <w:spacing w:after="0"/>
+            </w:pPr>
+            <w:r>
+              <w:rPr>
+                <w:rFonts w:ascii="Consolas" w:hAnsi="Consolas"/>
+                <w:color w:val="2D2D2D"/>
+                <w:sz w:val="15"/>
+              </w:rPr>
+              <w:t>class BankAccount { #balance = 0; deposit(amount) { if (amount &gt; 0) this.#balance += amount; } }</w:t>
+            </w:r>
+          </w:p>
+          <w:p>
+            <w:pPr>
+              <w:spacing w:after="0"/>
+            </w:pPr>
+            <w:r>
+              <w:rPr>
+                <w:rFonts w:ascii="Consolas" w:hAnsi="Consolas"/>
+                <w:color w:val="2D2D2D"/>
+                <w:sz w:val="15"/>
+              </w:rPr>
+              <w:t>class Circle extends Shape { draw() { console.log("Drawing a circle"); } }</w:t>
             </w:r>
           </w:p>
         </w:tc>
@@ -2658,41 +3077,289 @@
     </w:tbl>
     <w:p>
       <w:pPr>
-        <w:spacing w:after="20"/>
+        <w:spacing w:after="0"/>
       </w:pPr>
     </w:p>
     <w:p>
       <w:pPr>
         <w:pStyle w:val="Heading1"/>
-        <w:spacing w:before="220" w:after="80"/>
+        <w:spacing w:before="120" w:after="60"/>
+      </w:pPr>
+      <w:r>
+        <w:rPr>
+          <w:rFonts w:ascii="Calibri" w:hAnsi="Calibri"/>
+          <w:b/>
+          <w:color w:val="1F4E79"/>
+          <w:sz w:val="26"/>
+        </w:rPr>
+        <w:t>Day 6 Data Cleaning and Callback Practice</w:t>
+      </w:r>
+    </w:p>
+    <w:p>
+      <w:pPr>
+        <w:spacing w:after="80" w:line="247" w:lineRule="auto"/>
+      </w:pPr>
+      <w:r>
+        <w:rPr>
+          <w:rFonts w:ascii="Calibri" w:hAnsi="Calibri"/>
+          <w:b w:val="0"/>
+          <w:color w:val="222222"/>
+          <w:sz w:val="20"/>
+        </w:rPr>
+        <w:t>Day 6 now contains four practical JavaScript exercises that turn raw data into structured output and apply callback-based business rules. The questions combine parsing, Number() coercion, validation, filtering, sorting, JSON output, template literals, object transformation, and delayed Promise returns.</w:t>
+      </w:r>
+    </w:p>
+    <w:p>
+      <w:pPr>
+        <w:spacing w:after="40" w:line="240" w:lineRule="auto"/>
+        <w:ind w:left="230" w:hanging="230"/>
+      </w:pPr>
+      <w:r>
+        <w:rPr>
+          <w:rFonts w:ascii="Calibri" w:hAnsi="Calibri"/>
+          <w:b/>
+          <w:color w:val="1F4E79"/>
+          <w:sz w:val="19"/>
+        </w:rPr>
+        <w:t xml:space="preserve">- </w:t>
+      </w:r>
+      <w:r>
+        <w:rPr>
+          <w:rFonts w:ascii="Calibri" w:hAnsi="Calibri"/>
+          <w:b w:val="0"/>
+          <w:color w:val="222222"/>
+          <w:sz w:val="19"/>
+        </w:rPr>
+        <w:t>Question 1 cleans flight strings into from/to/price objects, filters prices from $100 to $500, sorts ascending, and returns JSON.</w:t>
+      </w:r>
+    </w:p>
+    <w:p>
+      <w:pPr>
+        <w:spacing w:after="40" w:line="240" w:lineRule="auto"/>
+        <w:ind w:left="230" w:hanging="230"/>
+      </w:pPr>
+      <w:r>
+        <w:rPr>
+          <w:rFonts w:ascii="Calibri" w:hAnsi="Calibri"/>
+          <w:b/>
+          <w:color w:val="1F4E79"/>
+          <w:sz w:val="19"/>
+        </w:rPr>
+        <w:t xml:space="preserve">- </w:t>
+      </w:r>
+      <w:r>
+        <w:rPr>
+          <w:rFonts w:ascii="Calibri" w:hAnsi="Calibri"/>
+          <w:b w:val="0"/>
+          <w:color w:val="222222"/>
+          <w:sz w:val="19"/>
+        </w:rPr>
+        <w:t>Question 2 applies a 10% electronics promotion with an isEligible callback, isDiscounted flags, savings summary, and a 1000ms delayed result.</w:t>
+      </w:r>
+    </w:p>
+    <w:p>
+      <w:pPr>
+        <w:spacing w:after="40" w:line="240" w:lineRule="auto"/>
+        <w:ind w:left="230" w:hanging="230"/>
+      </w:pPr>
+      <w:r>
+        <w:rPr>
+          <w:rFonts w:ascii="Calibri" w:hAnsi="Calibri"/>
+          <w:b/>
+          <w:color w:val="1F4E79"/>
+          <w:sz w:val="19"/>
+        </w:rPr>
+        <w:t xml:space="preserve">- </w:t>
+      </w:r>
+      <w:r>
+        <w:rPr>
+          <w:rFonts w:ascii="Calibri" w:hAnsi="Calibri"/>
+          <w:b w:val="0"/>
+          <w:color w:val="222222"/>
+          <w:sz w:val="19"/>
+        </w:rPr>
+        <w:t>Question 3 parses movie strings into name/genre/views objects, defaults corrupted views to 0, keeps Action or Sci-Fi movies above 5000 views, sorts descending, and returns JSON.</w:t>
+      </w:r>
+    </w:p>
+    <w:p>
+      <w:pPr>
+        <w:spacing w:after="40" w:line="240" w:lineRule="auto"/>
+        <w:ind w:left="230" w:hanging="230"/>
+      </w:pPr>
+      <w:r>
+        <w:rPr>
+          <w:rFonts w:ascii="Calibri" w:hAnsi="Calibri"/>
+          <w:b/>
+          <w:color w:val="1F4E79"/>
+          <w:sz w:val="19"/>
+        </w:rPr>
+        <w:t xml:space="preserve">- </w:t>
+      </w:r>
+      <w:r>
+        <w:rPr>
+          <w:rFonts w:ascii="Calibri" w:hAnsi="Calibri"/>
+          <w:b w:val="0"/>
+          <w:color w:val="222222"/>
+          <w:sz w:val="19"/>
+        </w:rPr>
+        <w:t>Question 4 calculates payroll with a taxLogic callback, creates netSalary and status fields, logs total net payout, and resolves the processed employees after 2000ms.</w:t>
+      </w:r>
+    </w:p>
+    <w:p>
+      <w:pPr>
+        <w:spacing w:after="40" w:line="240" w:lineRule="auto"/>
+        <w:ind w:left="230" w:hanging="230"/>
+      </w:pPr>
+      <w:r>
+        <w:rPr>
+          <w:rFonts w:ascii="Calibri" w:hAnsi="Calibri"/>
+          <w:b/>
+          <w:color w:val="1F4E79"/>
+          <w:sz w:val="19"/>
+        </w:rPr>
+        <w:t xml:space="preserve">- </w:t>
+      </w:r>
+      <w:r>
+        <w:rPr>
+          <w:rFonts w:ascii="Calibri" w:hAnsi="Calibri"/>
+          <w:b w:val="0"/>
+          <w:color w:val="222222"/>
+          <w:sz w:val="19"/>
+        </w:rPr>
+        <w:t>Both delayed-return questions use Promises because setTimeout runs asynchronously and cannot directly return a later value to the caller.</w:t>
+      </w:r>
+    </w:p>
+    <w:tbl>
+      <w:tblPr>
+        <w:tblW w:type="auto" w:w="0"/>
+        <w:jc w:val="center"/>
+        <w:tblLook w:firstColumn="1" w:firstRow="1" w:lastColumn="0" w:lastRow="0" w:noHBand="0" w:noVBand="1" w:val="04A0"/>
+      </w:tblPr>
+      <w:tblGrid>
+        <w:gridCol w:w="10282"/>
+      </w:tblGrid>
+      <w:tr>
+        <w:tc>
+          <w:tcPr>
+            <w:tcW w:type="dxa" w:w="10282"/>
+            <w:vAlign w:val="center"/>
+            <w:tcBorders>
+              <w:top w:val="single" w:sz="8" w:space="0" w:color="B7C9D6"/>
+              <w:left w:val="single" w:sz="8" w:space="0" w:color="B7C9D6"/>
+              <w:bottom w:val="single" w:sz="8" w:space="0" w:color="B7C9D6"/>
+              <w:right w:val="single" w:sz="8" w:space="0" w:color="B7C9D6"/>
+            </w:tcBorders>
+            <w:tcMar>
+              <w:top w:w="80" w:type="dxa"/>
+              <w:start w:w="100" w:type="dxa"/>
+              <w:bottom w:w="80" w:type="dxa"/>
+              <w:end w:w="100" w:type="dxa"/>
+            </w:tcMar>
+            <w:shd w:fill="F7F9FC"/>
+          </w:tcPr>
+          <w:p>
+            <w:pPr>
+              <w:spacing w:line="240" w:lineRule="auto" w:after="0"/>
+            </w:pPr>
+            <w:r>
+              <w:rPr>
+                <w:rFonts w:ascii="Consolas" w:hAnsi="Consolas"/>
+                <w:b w:val="0"/>
+                <w:color w:val="222222"/>
+                <w:sz w:val="14"/>
+              </w:rPr>
+              <w:t>return JSON.stringify(cleanedFlights); // Question 1</w:t>
+            </w:r>
+            <w:r>
+              <w:br/>
+            </w:r>
+            <w:r>
+              <w:rPr>
+                <w:rFonts w:ascii="Consolas" w:hAnsi="Consolas"/>
+                <w:b w:val="0"/>
+                <w:color w:val="222222"/>
+                <w:sz w:val="14"/>
+              </w:rPr>
+              <w:t>resolve(updatedCart); // Question 2 after 1000ms</w:t>
+            </w:r>
+            <w:r>
+              <w:br/>
+            </w:r>
+            <w:r>
+              <w:rPr>
+                <w:rFonts w:ascii="Consolas" w:hAnsi="Consolas"/>
+                <w:b w:val="0"/>
+                <w:color w:val="222222"/>
+                <w:sz w:val="14"/>
+              </w:rPr>
+              <w:t>.filter((movie) =&gt; ["Action", "Sci-Fi"].includes(movie.genre) &amp;&amp; movie.views &gt; 5000)</w:t>
+            </w:r>
+            <w:r>
+              <w:br/>
+            </w:r>
+            <w:r>
+              <w:rPr>
+                <w:rFonts w:ascii="Consolas" w:hAnsi="Consolas"/>
+                <w:b w:val="0"/>
+                <w:color w:val="222222"/>
+                <w:sz w:val="14"/>
+              </w:rPr>
+              <w:t>const netSalary = Number((validSalary - taxAmount).toFixed(2));</w:t>
+            </w:r>
+            <w:r>
+              <w:br/>
+            </w:r>
+            <w:r>
+              <w:rPr>
+                <w:rFonts w:ascii="Consolas" w:hAnsi="Consolas"/>
+                <w:b w:val="0"/>
+                <w:color w:val="222222"/>
+                <w:sz w:val="14"/>
+              </w:rPr>
+              <w:t>resolve(processedEmployees); // Question 4 after 2000ms</w:t>
+            </w:r>
+          </w:p>
+        </w:tc>
+      </w:tr>
+    </w:tbl>
+    <w:p>
+      <w:pPr>
+        <w:spacing w:after="40"/>
+      </w:pPr>
+    </w:p>
+    <w:p>
+      <w:pPr>
+        <w:pStyle w:val="Heading1"/>
+        <w:spacing w:before="200" w:after="60"/>
       </w:pPr>
       <w:r>
         <w:rPr>
           <w:rFonts w:ascii="Aptos" w:hAnsi="Aptos"/>
           <w:b/>
           <w:color w:val="1F4E79"/>
-          <w:sz w:val="32"/>
+          <w:sz w:val="30"/>
         </w:rPr>
         <w:t>Conclusion</w:t>
       </w:r>
     </w:p>
     <w:p>
       <w:pPr>
-        <w:spacing w:after="0" w:line="254" w:lineRule="auto"/>
+        <w:spacing w:after="80" w:line="247" w:lineRule="auto"/>
       </w:pPr>
       <w:r>
         <w:rPr>
-          <w:rFonts w:ascii="Aptos" w:hAnsi="Aptos"/>
+          <w:rFonts w:ascii="Calibri" w:hAnsi="Calibri"/>
+          <w:b w:val="0"/>
           <w:color w:val="222222"/>
           <w:sz w:val="20"/>
         </w:rPr>
-        <w:t>The updated training journey now covers four stages: JavaScript basics, browser interaction, array-method problem solving, and asynchronous/API programming. The latest Day4 updates are important because they move from local JavaScript examples into real remote-data workflows: fetching API data, converting JSON responses, filtering and transforming returned records, reading nested objects, creating cleaner result objects, and handling errors. These topics are directly useful for future automation and Playwright API or UI testing practice.</w:t>
+        <w:t>The updated synopsis now covers six stages of training: core JavaScript, browser interaction, array problem solving, asynchronous/API programming, object-oriented programming, and applied data transformation. Day 6 now uses four realistic exercises to connect array and async concepts with test data cleanup, front-end display formatting, analytics filtering, payroll calculations, and callback-based business rules.</w:t>
       </w:r>
     </w:p>
     <w:sectPr>
       <w:footerReference w:type="default" r:id="rId9"/>
       <w:pgSz w:w="12240" w:h="15840"/>
-      <w:pgMar w:top="835" w:right="1008" w:bottom="835" w:left="1008" w:header="720" w:footer="720" w:gutter="0"/>
+      <w:pgMar w:top="792" w:right="979" w:bottom="792" w:left="979" w:header="720" w:footer="720" w:gutter="0"/>
       <w:cols w:space="720"/>
       <w:docGrid w:linePitch="360"/>
     </w:sectPr>
@@ -2705,16 +3372,17 @@
   <w:p>
     <w:pPr>
       <w:pStyle w:val="Footer"/>
-      <w:spacing w:before="120"/>
+      <w:spacing w:before="120" w:after="0" w:line="247" w:lineRule="auto"/>
       <w:jc w:val="center"/>
     </w:pPr>
     <w:r>
       <w:rPr>
-        <w:rFonts w:ascii="Aptos" w:hAnsi="Aptos"/>
-        <w:color w:val="787878"/>
-        <w:sz w:val="17"/>
-      </w:rPr>
-      <w:t>Synopsis | Updated Day 1 to Day 4 JavaScript Training</w:t>
+        <w:rFonts w:ascii="Calibri" w:hAnsi="Calibri"/>
+        <w:b w:val="0"/>
+        <w:color w:val="7A7A7A"/>
+        <w:sz w:val="16"/>
+      </w:rPr>
+      <w:t>Synopsis | Updated Day 1 to Day 6 JavaScript Training</w:t>
     </w:r>
   </w:p>
 </w:ftr>
@@ -3085,7 +3753,7 @@
     <w:rsid w:val="00FC693F"/>
     <w:rPr>
       <w:rFonts w:ascii="Aptos" w:hAnsi="Aptos"/>
-      <w:sz w:val="20"/>
+      <w:sz w:val="19"/>
     </w:rPr>
   </w:style>
   <w:style w:type="paragraph" w:styleId="Header">

</xml_diff>